<commit_message>
Phase 4 Complete: Formatted manual testing matrix in TestingEvidence document (05-08-2026)
</commit_message>
<xml_diff>
--- a/VolunteerConnect/Docs/VolunteerConnect_TestingEvidence.docx
+++ b/VolunteerConnect/Docs/VolunteerConnect_TestingEvidence.docx
@@ -24,12 +24,12 @@
         <w:tblLook w:val="04A0" w:firstRow="1" w:lastRow="0" w:firstColumn="1" w:lastColumn="0" w:noHBand="0" w:noVBand="1"/>
       </w:tblPr>
       <w:tblGrid>
-        <w:gridCol w:w="1012"/>
-        <w:gridCol w:w="1226"/>
-        <w:gridCol w:w="2933"/>
-        <w:gridCol w:w="2077"/>
-        <w:gridCol w:w="1331"/>
-        <w:gridCol w:w="1070"/>
+        <w:gridCol w:w="1081"/>
+        <w:gridCol w:w="1207"/>
+        <w:gridCol w:w="2770"/>
+        <w:gridCol w:w="1964"/>
+        <w:gridCol w:w="1444"/>
+        <w:gridCol w:w="1183"/>
         <w:gridCol w:w="807"/>
       </w:tblGrid>
       <w:tr>
@@ -46,12 +46,14 @@
             <w:pPr>
               <w:spacing w:after="160" w:line="278" w:lineRule="auto"/>
               <w:rPr>
-                <w:sz w:val="20"/>
-                <w:szCs w:val="20"/>
-              </w:rPr>
-            </w:pPr>
-            <w:r>
-              <w:rPr>
+                <w:color w:val="auto"/>
+                <w:sz w:val="20"/>
+                <w:szCs w:val="20"/>
+              </w:rPr>
+            </w:pPr>
+            <w:r>
+              <w:rPr>
+                <w:color w:val="auto"/>
                 <w:sz w:val="20"/>
                 <w:szCs w:val="20"/>
               </w:rPr>
@@ -69,12 +71,14 @@
               <w:spacing w:after="160" w:line="278" w:lineRule="auto"/>
               <w:cnfStyle w:val="100000000000" w:firstRow="1" w:lastRow="0" w:firstColumn="0" w:lastColumn="0" w:oddVBand="0" w:evenVBand="0" w:oddHBand="0" w:evenHBand="0" w:firstRowFirstColumn="0" w:firstRowLastColumn="0" w:lastRowFirstColumn="0" w:lastRowLastColumn="0"/>
               <w:rPr>
-                <w:sz w:val="20"/>
-                <w:szCs w:val="20"/>
-              </w:rPr>
-            </w:pPr>
-            <w:r>
-              <w:rPr>
+                <w:color w:val="auto"/>
+                <w:sz w:val="20"/>
+                <w:szCs w:val="20"/>
+              </w:rPr>
+            </w:pPr>
+            <w:r>
+              <w:rPr>
+                <w:color w:val="auto"/>
                 <w:sz w:val="20"/>
                 <w:szCs w:val="20"/>
               </w:rPr>
@@ -92,12 +96,14 @@
               <w:spacing w:after="160" w:line="278" w:lineRule="auto"/>
               <w:cnfStyle w:val="100000000000" w:firstRow="1" w:lastRow="0" w:firstColumn="0" w:lastColumn="0" w:oddVBand="0" w:evenVBand="0" w:oddHBand="0" w:evenHBand="0" w:firstRowFirstColumn="0" w:firstRowLastColumn="0" w:lastRowFirstColumn="0" w:lastRowLastColumn="0"/>
               <w:rPr>
-                <w:sz w:val="20"/>
-                <w:szCs w:val="20"/>
-              </w:rPr>
-            </w:pPr>
-            <w:r>
-              <w:rPr>
+                <w:color w:val="auto"/>
+                <w:sz w:val="20"/>
+                <w:szCs w:val="20"/>
+              </w:rPr>
+            </w:pPr>
+            <w:r>
+              <w:rPr>
+                <w:color w:val="auto"/>
                 <w:sz w:val="20"/>
                 <w:szCs w:val="20"/>
               </w:rPr>
@@ -115,12 +121,14 @@
               <w:spacing w:after="160" w:line="278" w:lineRule="auto"/>
               <w:cnfStyle w:val="100000000000" w:firstRow="1" w:lastRow="0" w:firstColumn="0" w:lastColumn="0" w:oddVBand="0" w:evenVBand="0" w:oddHBand="0" w:evenHBand="0" w:firstRowFirstColumn="0" w:firstRowLastColumn="0" w:lastRowFirstColumn="0" w:lastRowLastColumn="0"/>
               <w:rPr>
-                <w:sz w:val="20"/>
-                <w:szCs w:val="20"/>
-              </w:rPr>
-            </w:pPr>
-            <w:r>
-              <w:rPr>
+                <w:color w:val="auto"/>
+                <w:sz w:val="20"/>
+                <w:szCs w:val="20"/>
+              </w:rPr>
+            </w:pPr>
+            <w:r>
+              <w:rPr>
+                <w:color w:val="auto"/>
                 <w:sz w:val="20"/>
                 <w:szCs w:val="20"/>
               </w:rPr>
@@ -138,12 +146,14 @@
               <w:spacing w:after="160" w:line="278" w:lineRule="auto"/>
               <w:cnfStyle w:val="100000000000" w:firstRow="1" w:lastRow="0" w:firstColumn="0" w:lastColumn="0" w:oddVBand="0" w:evenVBand="0" w:oddHBand="0" w:evenHBand="0" w:firstRowFirstColumn="0" w:firstRowLastColumn="0" w:lastRowFirstColumn="0" w:lastRowLastColumn="0"/>
               <w:rPr>
-                <w:sz w:val="20"/>
-                <w:szCs w:val="20"/>
-              </w:rPr>
-            </w:pPr>
-            <w:r>
-              <w:rPr>
+                <w:color w:val="auto"/>
+                <w:sz w:val="20"/>
+                <w:szCs w:val="20"/>
+              </w:rPr>
+            </w:pPr>
+            <w:r>
+              <w:rPr>
+                <w:color w:val="auto"/>
                 <w:sz w:val="20"/>
                 <w:szCs w:val="20"/>
               </w:rPr>
@@ -161,12 +171,14 @@
               <w:spacing w:after="160" w:line="278" w:lineRule="auto"/>
               <w:cnfStyle w:val="100000000000" w:firstRow="1" w:lastRow="0" w:firstColumn="0" w:lastColumn="0" w:oddVBand="0" w:evenVBand="0" w:oddHBand="0" w:evenHBand="0" w:firstRowFirstColumn="0" w:firstRowLastColumn="0" w:lastRowFirstColumn="0" w:lastRowLastColumn="0"/>
               <w:rPr>
-                <w:sz w:val="20"/>
-                <w:szCs w:val="20"/>
-              </w:rPr>
-            </w:pPr>
-            <w:r>
-              <w:rPr>
+                <w:color w:val="auto"/>
+                <w:sz w:val="20"/>
+                <w:szCs w:val="20"/>
+              </w:rPr>
+            </w:pPr>
+            <w:r>
+              <w:rPr>
+                <w:color w:val="auto"/>
                 <w:sz w:val="20"/>
                 <w:szCs w:val="20"/>
               </w:rPr>
@@ -184,12 +196,14 @@
               <w:spacing w:after="160" w:line="278" w:lineRule="auto"/>
               <w:cnfStyle w:val="100000000000" w:firstRow="1" w:lastRow="0" w:firstColumn="0" w:lastColumn="0" w:oddVBand="0" w:evenVBand="0" w:oddHBand="0" w:evenHBand="0" w:firstRowFirstColumn="0" w:firstRowLastColumn="0" w:lastRowFirstColumn="0" w:lastRowLastColumn="0"/>
               <w:rPr>
-                <w:sz w:val="20"/>
-                <w:szCs w:val="20"/>
-              </w:rPr>
-            </w:pPr>
-            <w:r>
-              <w:rPr>
+                <w:color w:val="auto"/>
+                <w:sz w:val="20"/>
+                <w:szCs w:val="20"/>
+              </w:rPr>
+            </w:pPr>
+            <w:r>
+              <w:rPr>
+                <w:color w:val="auto"/>
                 <w:sz w:val="20"/>
                 <w:szCs w:val="20"/>
               </w:rPr>
@@ -212,12 +226,16 @@
             <w:pPr>
               <w:spacing w:after="160" w:line="278" w:lineRule="auto"/>
               <w:rPr>
-                <w:sz w:val="20"/>
-                <w:szCs w:val="20"/>
-              </w:rPr>
-            </w:pPr>
-            <w:r>
-              <w:rPr>
+                <w:b w:val="0"/>
+                <w:bCs w:val="0"/>
+                <w:sz w:val="20"/>
+                <w:szCs w:val="20"/>
+              </w:rPr>
+            </w:pPr>
+            <w:r>
+              <w:rPr>
+                <w:b w:val="0"/>
+                <w:bCs w:val="0"/>
                 <w:sz w:val="20"/>
                 <w:szCs w:val="20"/>
               </w:rPr>
@@ -235,16 +253,12 @@
               <w:spacing w:after="160" w:line="278" w:lineRule="auto"/>
               <w:cnfStyle w:val="000000100000" w:firstRow="0" w:lastRow="0" w:firstColumn="0" w:lastColumn="0" w:oddVBand="0" w:evenVBand="0" w:oddHBand="1" w:evenHBand="0" w:firstRowFirstColumn="0" w:firstRowLastColumn="0" w:lastRowFirstColumn="0" w:lastRowLastColumn="0"/>
               <w:rPr>
-                <w:b/>
-                <w:bCs/>
-                <w:sz w:val="20"/>
-                <w:szCs w:val="20"/>
-              </w:rPr>
-            </w:pPr>
-            <w:r>
-              <w:rPr>
-                <w:b/>
-                <w:bCs/>
+                <w:sz w:val="20"/>
+                <w:szCs w:val="20"/>
+              </w:rPr>
+            </w:pPr>
+            <w:r>
+              <w:rPr>
                 <w:sz w:val="20"/>
                 <w:szCs w:val="20"/>
               </w:rPr>
@@ -262,8 +276,6 @@
               <w:spacing w:after="160" w:line="278" w:lineRule="auto"/>
               <w:cnfStyle w:val="000000100000" w:firstRow="0" w:lastRow="0" w:firstColumn="0" w:lastColumn="0" w:oddVBand="0" w:evenVBand="0" w:oddHBand="1" w:evenHBand="0" w:firstRowFirstColumn="0" w:firstRowLastColumn="0" w:lastRowFirstColumn="0" w:lastRowLastColumn="0"/>
               <w:rPr>
-                <w:b/>
-                <w:bCs/>
                 <w:sz w:val="20"/>
                 <w:szCs w:val="20"/>
               </w:rPr>
@@ -271,8 +283,6 @@
             <w:proofErr w:type="spellStart"/>
             <w:r>
               <w:rPr>
-                <w:b/>
-                <w:bCs/>
                 <w:sz w:val="20"/>
                 <w:szCs w:val="20"/>
               </w:rPr>
@@ -291,16 +301,12 @@
               <w:spacing w:after="160" w:line="278" w:lineRule="auto"/>
               <w:cnfStyle w:val="000000100000" w:firstRow="0" w:lastRow="0" w:firstColumn="0" w:lastColumn="0" w:oddVBand="0" w:evenVBand="0" w:oddHBand="1" w:evenHBand="0" w:firstRowFirstColumn="0" w:firstRowLastColumn="0" w:lastRowFirstColumn="0" w:lastRowLastColumn="0"/>
               <w:rPr>
-                <w:b/>
-                <w:bCs/>
-                <w:sz w:val="20"/>
-                <w:szCs w:val="20"/>
-              </w:rPr>
-            </w:pPr>
-            <w:r>
-              <w:rPr>
-                <w:b/>
-                <w:bCs/>
+                <w:sz w:val="20"/>
+                <w:szCs w:val="20"/>
+              </w:rPr>
+            </w:pPr>
+            <w:r>
+              <w:rPr>
                 <w:sz w:val="20"/>
                 <w:szCs w:val="20"/>
               </w:rPr>
@@ -318,16 +324,12 @@
               <w:spacing w:after="160" w:line="278" w:lineRule="auto"/>
               <w:cnfStyle w:val="000000100000" w:firstRow="0" w:lastRow="0" w:firstColumn="0" w:lastColumn="0" w:oddVBand="0" w:evenVBand="0" w:oddHBand="1" w:evenHBand="0" w:firstRowFirstColumn="0" w:firstRowLastColumn="0" w:lastRowFirstColumn="0" w:lastRowLastColumn="0"/>
               <w:rPr>
-                <w:b/>
-                <w:bCs/>
-                <w:sz w:val="20"/>
-                <w:szCs w:val="20"/>
-              </w:rPr>
-            </w:pPr>
-            <w:r>
-              <w:rPr>
-                <w:b/>
-                <w:bCs/>
+                <w:sz w:val="20"/>
+                <w:szCs w:val="20"/>
+              </w:rPr>
+            </w:pPr>
+            <w:r>
+              <w:rPr>
                 <w:sz w:val="20"/>
                 <w:szCs w:val="20"/>
               </w:rPr>
@@ -345,16 +347,12 @@
               <w:spacing w:after="160" w:line="278" w:lineRule="auto"/>
               <w:cnfStyle w:val="000000100000" w:firstRow="0" w:lastRow="0" w:firstColumn="0" w:lastColumn="0" w:oddVBand="0" w:evenVBand="0" w:oddHBand="1" w:evenHBand="0" w:firstRowFirstColumn="0" w:firstRowLastColumn="0" w:lastRowFirstColumn="0" w:lastRowLastColumn="0"/>
               <w:rPr>
-                <w:b/>
-                <w:bCs/>
-                <w:sz w:val="20"/>
-                <w:szCs w:val="20"/>
-              </w:rPr>
-            </w:pPr>
-            <w:r>
-              <w:rPr>
-                <w:b/>
-                <w:bCs/>
+                <w:sz w:val="20"/>
+                <w:szCs w:val="20"/>
+              </w:rPr>
+            </w:pPr>
+            <w:r>
+              <w:rPr>
                 <w:sz w:val="20"/>
                 <w:szCs w:val="20"/>
               </w:rPr>
@@ -372,16 +370,12 @@
               <w:spacing w:after="160" w:line="278" w:lineRule="auto"/>
               <w:cnfStyle w:val="000000100000" w:firstRow="0" w:lastRow="0" w:firstColumn="0" w:lastColumn="0" w:oddVBand="0" w:evenVBand="0" w:oddHBand="1" w:evenHBand="0" w:firstRowFirstColumn="0" w:firstRowLastColumn="0" w:lastRowFirstColumn="0" w:lastRowLastColumn="0"/>
               <w:rPr>
-                <w:b/>
-                <w:bCs/>
-                <w:sz w:val="20"/>
-                <w:szCs w:val="20"/>
-              </w:rPr>
-            </w:pPr>
-            <w:r>
-              <w:rPr>
-                <w:b/>
-                <w:bCs/>
+                <w:sz w:val="20"/>
+                <w:szCs w:val="20"/>
+              </w:rPr>
+            </w:pPr>
+            <w:r>
+              <w:rPr>
                 <w:sz w:val="20"/>
                 <w:szCs w:val="20"/>
               </w:rPr>
@@ -401,12 +395,16 @@
             <w:pPr>
               <w:spacing w:after="160" w:line="278" w:lineRule="auto"/>
               <w:rPr>
-                <w:sz w:val="20"/>
-                <w:szCs w:val="20"/>
-              </w:rPr>
-            </w:pPr>
-            <w:r>
-              <w:rPr>
+                <w:b w:val="0"/>
+                <w:bCs w:val="0"/>
+                <w:sz w:val="20"/>
+                <w:szCs w:val="20"/>
+              </w:rPr>
+            </w:pPr>
+            <w:r>
+              <w:rPr>
+                <w:b w:val="0"/>
+                <w:bCs w:val="0"/>
                 <w:sz w:val="20"/>
                 <w:szCs w:val="20"/>
               </w:rPr>
@@ -424,16 +422,12 @@
               <w:spacing w:after="160" w:line="278" w:lineRule="auto"/>
               <w:cnfStyle w:val="000000000000" w:firstRow="0" w:lastRow="0" w:firstColumn="0" w:lastColumn="0" w:oddVBand="0" w:evenVBand="0" w:oddHBand="0" w:evenHBand="0" w:firstRowFirstColumn="0" w:firstRowLastColumn="0" w:lastRowFirstColumn="0" w:lastRowLastColumn="0"/>
               <w:rPr>
-                <w:b/>
-                <w:bCs/>
-                <w:sz w:val="20"/>
-                <w:szCs w:val="20"/>
-              </w:rPr>
-            </w:pPr>
-            <w:r>
-              <w:rPr>
-                <w:b/>
-                <w:bCs/>
+                <w:sz w:val="20"/>
+                <w:szCs w:val="20"/>
+              </w:rPr>
+            </w:pPr>
+            <w:r>
+              <w:rPr>
                 <w:sz w:val="20"/>
                 <w:szCs w:val="20"/>
               </w:rPr>
@@ -451,8 +445,6 @@
               <w:spacing w:after="160" w:line="278" w:lineRule="auto"/>
               <w:cnfStyle w:val="000000000000" w:firstRow="0" w:lastRow="0" w:firstColumn="0" w:lastColumn="0" w:oddVBand="0" w:evenVBand="0" w:oddHBand="0" w:evenHBand="0" w:firstRowFirstColumn="0" w:firstRowLastColumn="0" w:lastRowFirstColumn="0" w:lastRowLastColumn="0"/>
               <w:rPr>
-                <w:b/>
-                <w:bCs/>
                 <w:sz w:val="20"/>
                 <w:szCs w:val="20"/>
               </w:rPr>
@@ -460,8 +452,6 @@
             <w:proofErr w:type="spellStart"/>
             <w:r>
               <w:rPr>
-                <w:b/>
-                <w:bCs/>
                 <w:sz w:val="20"/>
                 <w:szCs w:val="20"/>
               </w:rPr>
@@ -480,16 +470,12 @@
               <w:spacing w:after="160" w:line="278" w:lineRule="auto"/>
               <w:cnfStyle w:val="000000000000" w:firstRow="0" w:lastRow="0" w:firstColumn="0" w:lastColumn="0" w:oddVBand="0" w:evenVBand="0" w:oddHBand="0" w:evenHBand="0" w:firstRowFirstColumn="0" w:firstRowLastColumn="0" w:lastRowFirstColumn="0" w:lastRowLastColumn="0"/>
               <w:rPr>
-                <w:b/>
-                <w:bCs/>
-                <w:sz w:val="20"/>
-                <w:szCs w:val="20"/>
-              </w:rPr>
-            </w:pPr>
-            <w:r>
-              <w:rPr>
-                <w:b/>
-                <w:bCs/>
+                <w:sz w:val="20"/>
+                <w:szCs w:val="20"/>
+              </w:rPr>
+            </w:pPr>
+            <w:r>
+              <w:rPr>
                 <w:sz w:val="20"/>
                 <w:szCs w:val="20"/>
               </w:rPr>
@@ -498,8 +484,6 @@
             <w:proofErr w:type="gramStart"/>
             <w:r>
               <w:rPr>
-                <w:b/>
-                <w:bCs/>
                 <w:sz w:val="20"/>
                 <w:szCs w:val="20"/>
               </w:rPr>
@@ -508,8 +492,6 @@
             <w:proofErr w:type="gramEnd"/>
             <w:r>
               <w:rPr>
-                <w:b/>
-                <w:bCs/>
                 <w:sz w:val="20"/>
                 <w:szCs w:val="20"/>
               </w:rPr>
@@ -527,16 +509,12 @@
               <w:spacing w:after="160" w:line="278" w:lineRule="auto"/>
               <w:cnfStyle w:val="000000000000" w:firstRow="0" w:lastRow="0" w:firstColumn="0" w:lastColumn="0" w:oddVBand="0" w:evenVBand="0" w:oddHBand="0" w:evenHBand="0" w:firstRowFirstColumn="0" w:firstRowLastColumn="0" w:lastRowFirstColumn="0" w:lastRowLastColumn="0"/>
               <w:rPr>
-                <w:b/>
-                <w:bCs/>
-                <w:sz w:val="20"/>
-                <w:szCs w:val="20"/>
-              </w:rPr>
-            </w:pPr>
-            <w:r>
-              <w:rPr>
-                <w:b/>
-                <w:bCs/>
+                <w:sz w:val="20"/>
+                <w:szCs w:val="20"/>
+              </w:rPr>
+            </w:pPr>
+            <w:r>
+              <w:rPr>
                 <w:sz w:val="20"/>
                 <w:szCs w:val="20"/>
               </w:rPr>
@@ -554,16 +532,12 @@
               <w:spacing w:after="160" w:line="278" w:lineRule="auto"/>
               <w:cnfStyle w:val="000000000000" w:firstRow="0" w:lastRow="0" w:firstColumn="0" w:lastColumn="0" w:oddVBand="0" w:evenVBand="0" w:oddHBand="0" w:evenHBand="0" w:firstRowFirstColumn="0" w:firstRowLastColumn="0" w:lastRowFirstColumn="0" w:lastRowLastColumn="0"/>
               <w:rPr>
-                <w:b/>
-                <w:bCs/>
-                <w:sz w:val="20"/>
-                <w:szCs w:val="20"/>
-              </w:rPr>
-            </w:pPr>
-            <w:r>
-              <w:rPr>
-                <w:b/>
-                <w:bCs/>
+                <w:sz w:val="20"/>
+                <w:szCs w:val="20"/>
+              </w:rPr>
+            </w:pPr>
+            <w:r>
+              <w:rPr>
                 <w:sz w:val="20"/>
                 <w:szCs w:val="20"/>
               </w:rPr>
@@ -581,16 +555,12 @@
               <w:spacing w:after="160" w:line="278" w:lineRule="auto"/>
               <w:cnfStyle w:val="000000000000" w:firstRow="0" w:lastRow="0" w:firstColumn="0" w:lastColumn="0" w:oddVBand="0" w:evenVBand="0" w:oddHBand="0" w:evenHBand="0" w:firstRowFirstColumn="0" w:firstRowLastColumn="0" w:lastRowFirstColumn="0" w:lastRowLastColumn="0"/>
               <w:rPr>
-                <w:b/>
-                <w:bCs/>
-                <w:sz w:val="20"/>
-                <w:szCs w:val="20"/>
-              </w:rPr>
-            </w:pPr>
-            <w:r>
-              <w:rPr>
-                <w:b/>
-                <w:bCs/>
+                <w:sz w:val="20"/>
+                <w:szCs w:val="20"/>
+              </w:rPr>
+            </w:pPr>
+            <w:r>
+              <w:rPr>
                 <w:sz w:val="20"/>
                 <w:szCs w:val="20"/>
               </w:rPr>
@@ -613,12 +583,16 @@
             <w:pPr>
               <w:spacing w:after="160" w:line="278" w:lineRule="auto"/>
               <w:rPr>
-                <w:sz w:val="20"/>
-                <w:szCs w:val="20"/>
-              </w:rPr>
-            </w:pPr>
-            <w:r>
-              <w:rPr>
+                <w:b w:val="0"/>
+                <w:bCs w:val="0"/>
+                <w:sz w:val="20"/>
+                <w:szCs w:val="20"/>
+              </w:rPr>
+            </w:pPr>
+            <w:r>
+              <w:rPr>
+                <w:b w:val="0"/>
+                <w:bCs w:val="0"/>
                 <w:sz w:val="20"/>
                 <w:szCs w:val="20"/>
               </w:rPr>
@@ -636,16 +610,12 @@
               <w:spacing w:after="160" w:line="278" w:lineRule="auto"/>
               <w:cnfStyle w:val="000000100000" w:firstRow="0" w:lastRow="0" w:firstColumn="0" w:lastColumn="0" w:oddVBand="0" w:evenVBand="0" w:oddHBand="1" w:evenHBand="0" w:firstRowFirstColumn="0" w:firstRowLastColumn="0" w:lastRowFirstColumn="0" w:lastRowLastColumn="0"/>
               <w:rPr>
-                <w:b/>
-                <w:bCs/>
-                <w:sz w:val="20"/>
-                <w:szCs w:val="20"/>
-              </w:rPr>
-            </w:pPr>
-            <w:r>
-              <w:rPr>
-                <w:b/>
-                <w:bCs/>
+                <w:sz w:val="20"/>
+                <w:szCs w:val="20"/>
+              </w:rPr>
+            </w:pPr>
+            <w:r>
+              <w:rPr>
                 <w:sz w:val="20"/>
                 <w:szCs w:val="20"/>
               </w:rPr>
@@ -663,8 +633,6 @@
               <w:spacing w:after="160" w:line="278" w:lineRule="auto"/>
               <w:cnfStyle w:val="000000100000" w:firstRow="0" w:lastRow="0" w:firstColumn="0" w:lastColumn="0" w:oddVBand="0" w:evenVBand="0" w:oddHBand="1" w:evenHBand="0" w:firstRowFirstColumn="0" w:firstRowLastColumn="0" w:lastRowFirstColumn="0" w:lastRowLastColumn="0"/>
               <w:rPr>
-                <w:b/>
-                <w:bCs/>
                 <w:sz w:val="20"/>
                 <w:szCs w:val="20"/>
               </w:rPr>
@@ -672,8 +640,6 @@
             <w:proofErr w:type="spellStart"/>
             <w:r>
               <w:rPr>
-                <w:b/>
-                <w:bCs/>
                 <w:sz w:val="20"/>
                 <w:szCs w:val="20"/>
               </w:rPr>
@@ -692,16 +658,12 @@
               <w:spacing w:after="160" w:line="278" w:lineRule="auto"/>
               <w:cnfStyle w:val="000000100000" w:firstRow="0" w:lastRow="0" w:firstColumn="0" w:lastColumn="0" w:oddVBand="0" w:evenVBand="0" w:oddHBand="1" w:evenHBand="0" w:firstRowFirstColumn="0" w:firstRowLastColumn="0" w:lastRowFirstColumn="0" w:lastRowLastColumn="0"/>
               <w:rPr>
-                <w:b/>
-                <w:bCs/>
-                <w:sz w:val="20"/>
-                <w:szCs w:val="20"/>
-              </w:rPr>
-            </w:pPr>
-            <w:r>
-              <w:rPr>
-                <w:b/>
-                <w:bCs/>
+                <w:sz w:val="20"/>
+                <w:szCs w:val="20"/>
+              </w:rPr>
+            </w:pPr>
+            <w:r>
+              <w:rPr>
                 <w:sz w:val="20"/>
                 <w:szCs w:val="20"/>
               </w:rPr>
@@ -719,16 +681,12 @@
               <w:spacing w:after="160" w:line="278" w:lineRule="auto"/>
               <w:cnfStyle w:val="000000100000" w:firstRow="0" w:lastRow="0" w:firstColumn="0" w:lastColumn="0" w:oddVBand="0" w:evenVBand="0" w:oddHBand="1" w:evenHBand="0" w:firstRowFirstColumn="0" w:firstRowLastColumn="0" w:lastRowFirstColumn="0" w:lastRowLastColumn="0"/>
               <w:rPr>
-                <w:b/>
-                <w:bCs/>
-                <w:sz w:val="20"/>
-                <w:szCs w:val="20"/>
-              </w:rPr>
-            </w:pPr>
-            <w:r>
-              <w:rPr>
-                <w:b/>
-                <w:bCs/>
+                <w:sz w:val="20"/>
+                <w:szCs w:val="20"/>
+              </w:rPr>
+            </w:pPr>
+            <w:r>
+              <w:rPr>
                 <w:sz w:val="20"/>
                 <w:szCs w:val="20"/>
               </w:rPr>
@@ -746,16 +704,12 @@
               <w:spacing w:after="160" w:line="278" w:lineRule="auto"/>
               <w:cnfStyle w:val="000000100000" w:firstRow="0" w:lastRow="0" w:firstColumn="0" w:lastColumn="0" w:oddVBand="0" w:evenVBand="0" w:oddHBand="1" w:evenHBand="0" w:firstRowFirstColumn="0" w:firstRowLastColumn="0" w:lastRowFirstColumn="0" w:lastRowLastColumn="0"/>
               <w:rPr>
-                <w:b/>
-                <w:bCs/>
-                <w:sz w:val="20"/>
-                <w:szCs w:val="20"/>
-              </w:rPr>
-            </w:pPr>
-            <w:r>
-              <w:rPr>
-                <w:b/>
-                <w:bCs/>
+                <w:sz w:val="20"/>
+                <w:szCs w:val="20"/>
+              </w:rPr>
+            </w:pPr>
+            <w:r>
+              <w:rPr>
                 <w:sz w:val="20"/>
                 <w:szCs w:val="20"/>
               </w:rPr>
@@ -773,16 +727,12 @@
               <w:spacing w:after="160" w:line="278" w:lineRule="auto"/>
               <w:cnfStyle w:val="000000100000" w:firstRow="0" w:lastRow="0" w:firstColumn="0" w:lastColumn="0" w:oddVBand="0" w:evenVBand="0" w:oddHBand="1" w:evenHBand="0" w:firstRowFirstColumn="0" w:firstRowLastColumn="0" w:lastRowFirstColumn="0" w:lastRowLastColumn="0"/>
               <w:rPr>
-                <w:b/>
-                <w:bCs/>
-                <w:sz w:val="20"/>
-                <w:szCs w:val="20"/>
-              </w:rPr>
-            </w:pPr>
-            <w:r>
-              <w:rPr>
-                <w:b/>
-                <w:bCs/>
+                <w:sz w:val="20"/>
+                <w:szCs w:val="20"/>
+              </w:rPr>
+            </w:pPr>
+            <w:r>
+              <w:rPr>
                 <w:sz w:val="20"/>
                 <w:szCs w:val="20"/>
               </w:rPr>
@@ -802,12 +752,16 @@
             <w:pPr>
               <w:spacing w:after="160" w:line="278" w:lineRule="auto"/>
               <w:rPr>
-                <w:sz w:val="20"/>
-                <w:szCs w:val="20"/>
-              </w:rPr>
-            </w:pPr>
-            <w:r>
-              <w:rPr>
+                <w:b w:val="0"/>
+                <w:bCs w:val="0"/>
+                <w:sz w:val="20"/>
+                <w:szCs w:val="20"/>
+              </w:rPr>
+            </w:pPr>
+            <w:r>
+              <w:rPr>
+                <w:b w:val="0"/>
+                <w:bCs w:val="0"/>
                 <w:sz w:val="20"/>
                 <w:szCs w:val="20"/>
               </w:rPr>
@@ -825,16 +779,12 @@
               <w:spacing w:after="160" w:line="278" w:lineRule="auto"/>
               <w:cnfStyle w:val="000000000000" w:firstRow="0" w:lastRow="0" w:firstColumn="0" w:lastColumn="0" w:oddVBand="0" w:evenVBand="0" w:oddHBand="0" w:evenHBand="0" w:firstRowFirstColumn="0" w:firstRowLastColumn="0" w:lastRowFirstColumn="0" w:lastRowLastColumn="0"/>
               <w:rPr>
-                <w:b/>
-                <w:bCs/>
-                <w:sz w:val="20"/>
-                <w:szCs w:val="20"/>
-              </w:rPr>
-            </w:pPr>
-            <w:r>
-              <w:rPr>
-                <w:b/>
-                <w:bCs/>
+                <w:sz w:val="20"/>
+                <w:szCs w:val="20"/>
+              </w:rPr>
+            </w:pPr>
+            <w:r>
+              <w:rPr>
                 <w:sz w:val="20"/>
                 <w:szCs w:val="20"/>
               </w:rPr>
@@ -852,8 +802,6 @@
               <w:spacing w:after="160" w:line="278" w:lineRule="auto"/>
               <w:cnfStyle w:val="000000000000" w:firstRow="0" w:lastRow="0" w:firstColumn="0" w:lastColumn="0" w:oddVBand="0" w:evenVBand="0" w:oddHBand="0" w:evenHBand="0" w:firstRowFirstColumn="0" w:firstRowLastColumn="0" w:lastRowFirstColumn="0" w:lastRowLastColumn="0"/>
               <w:rPr>
-                <w:b/>
-                <w:bCs/>
                 <w:sz w:val="20"/>
                 <w:szCs w:val="20"/>
               </w:rPr>
@@ -861,8 +809,6 @@
             <w:proofErr w:type="spellStart"/>
             <w:r>
               <w:rPr>
-                <w:b/>
-                <w:bCs/>
                 <w:sz w:val="20"/>
                 <w:szCs w:val="20"/>
               </w:rPr>
@@ -881,16 +827,12 @@
               <w:spacing w:after="160" w:line="278" w:lineRule="auto"/>
               <w:cnfStyle w:val="000000000000" w:firstRow="0" w:lastRow="0" w:firstColumn="0" w:lastColumn="0" w:oddVBand="0" w:evenVBand="0" w:oddHBand="0" w:evenHBand="0" w:firstRowFirstColumn="0" w:firstRowLastColumn="0" w:lastRowFirstColumn="0" w:lastRowLastColumn="0"/>
               <w:rPr>
-                <w:b/>
-                <w:bCs/>
-                <w:sz w:val="20"/>
-                <w:szCs w:val="20"/>
-              </w:rPr>
-            </w:pPr>
-            <w:r>
-              <w:rPr>
-                <w:b/>
-                <w:bCs/>
+                <w:sz w:val="20"/>
+                <w:szCs w:val="20"/>
+              </w:rPr>
+            </w:pPr>
+            <w:r>
+              <w:rPr>
                 <w:sz w:val="20"/>
                 <w:szCs w:val="20"/>
               </w:rPr>
@@ -908,16 +850,12 @@
               <w:spacing w:after="160" w:line="278" w:lineRule="auto"/>
               <w:cnfStyle w:val="000000000000" w:firstRow="0" w:lastRow="0" w:firstColumn="0" w:lastColumn="0" w:oddVBand="0" w:evenVBand="0" w:oddHBand="0" w:evenHBand="0" w:firstRowFirstColumn="0" w:firstRowLastColumn="0" w:lastRowFirstColumn="0" w:lastRowLastColumn="0"/>
               <w:rPr>
-                <w:b/>
-                <w:bCs/>
-                <w:sz w:val="20"/>
-                <w:szCs w:val="20"/>
-              </w:rPr>
-            </w:pPr>
-            <w:r>
-              <w:rPr>
-                <w:b/>
-                <w:bCs/>
+                <w:sz w:val="20"/>
+                <w:szCs w:val="20"/>
+              </w:rPr>
+            </w:pPr>
+            <w:r>
+              <w:rPr>
                 <w:sz w:val="20"/>
                 <w:szCs w:val="20"/>
               </w:rPr>
@@ -935,16 +873,12 @@
               <w:spacing w:after="160" w:line="278" w:lineRule="auto"/>
               <w:cnfStyle w:val="000000000000" w:firstRow="0" w:lastRow="0" w:firstColumn="0" w:lastColumn="0" w:oddVBand="0" w:evenVBand="0" w:oddHBand="0" w:evenHBand="0" w:firstRowFirstColumn="0" w:firstRowLastColumn="0" w:lastRowFirstColumn="0" w:lastRowLastColumn="0"/>
               <w:rPr>
-                <w:b/>
-                <w:bCs/>
-                <w:sz w:val="20"/>
-                <w:szCs w:val="20"/>
-              </w:rPr>
-            </w:pPr>
-            <w:r>
-              <w:rPr>
-                <w:b/>
-                <w:bCs/>
+                <w:sz w:val="20"/>
+                <w:szCs w:val="20"/>
+              </w:rPr>
+            </w:pPr>
+            <w:r>
+              <w:rPr>
                 <w:sz w:val="20"/>
                 <w:szCs w:val="20"/>
               </w:rPr>
@@ -962,16 +896,12 @@
               <w:spacing w:after="160" w:line="278" w:lineRule="auto"/>
               <w:cnfStyle w:val="000000000000" w:firstRow="0" w:lastRow="0" w:firstColumn="0" w:lastColumn="0" w:oddVBand="0" w:evenVBand="0" w:oddHBand="0" w:evenHBand="0" w:firstRowFirstColumn="0" w:firstRowLastColumn="0" w:lastRowFirstColumn="0" w:lastRowLastColumn="0"/>
               <w:rPr>
-                <w:b/>
-                <w:bCs/>
-                <w:sz w:val="20"/>
-                <w:szCs w:val="20"/>
-              </w:rPr>
-            </w:pPr>
-            <w:r>
-              <w:rPr>
-                <w:b/>
-                <w:bCs/>
+                <w:sz w:val="20"/>
+                <w:szCs w:val="20"/>
+              </w:rPr>
+            </w:pPr>
+            <w:r>
+              <w:rPr>
                 <w:sz w:val="20"/>
                 <w:szCs w:val="20"/>
               </w:rPr>
@@ -1011,14 +941,14 @@
         <w:tblLook w:val="04A0" w:firstRow="1" w:lastRow="0" w:firstColumn="1" w:lastColumn="0" w:noHBand="0" w:noVBand="1"/>
       </w:tblPr>
       <w:tblGrid>
-        <w:gridCol w:w="740"/>
-        <w:gridCol w:w="1226"/>
-        <w:gridCol w:w="1437"/>
-        <w:gridCol w:w="931"/>
-        <w:gridCol w:w="2597"/>
-        <w:gridCol w:w="1524"/>
-        <w:gridCol w:w="1194"/>
-        <w:gridCol w:w="807"/>
+        <w:gridCol w:w="647"/>
+        <w:gridCol w:w="1058"/>
+        <w:gridCol w:w="1178"/>
+        <w:gridCol w:w="1468"/>
+        <w:gridCol w:w="1996"/>
+        <w:gridCol w:w="1952"/>
+        <w:gridCol w:w="1317"/>
+        <w:gridCol w:w="840"/>
       </w:tblGrid>
       <w:tr>
         <w:trPr>
@@ -1034,12 +964,14 @@
             <w:pPr>
               <w:spacing w:after="160" w:line="278" w:lineRule="auto"/>
               <w:rPr>
-                <w:sz w:val="20"/>
-                <w:szCs w:val="20"/>
-              </w:rPr>
-            </w:pPr>
-            <w:r>
-              <w:rPr>
+                <w:color w:val="auto"/>
+                <w:sz w:val="20"/>
+                <w:szCs w:val="20"/>
+              </w:rPr>
+            </w:pPr>
+            <w:r>
+              <w:rPr>
+                <w:color w:val="auto"/>
                 <w:sz w:val="20"/>
                 <w:szCs w:val="20"/>
               </w:rPr>
@@ -1057,12 +989,14 @@
               <w:spacing w:after="160" w:line="278" w:lineRule="auto"/>
               <w:cnfStyle w:val="100000000000" w:firstRow="1" w:lastRow="0" w:firstColumn="0" w:lastColumn="0" w:oddVBand="0" w:evenVBand="0" w:oddHBand="0" w:evenHBand="0" w:firstRowFirstColumn="0" w:firstRowLastColumn="0" w:lastRowFirstColumn="0" w:lastRowLastColumn="0"/>
               <w:rPr>
-                <w:sz w:val="20"/>
-                <w:szCs w:val="20"/>
-              </w:rPr>
-            </w:pPr>
-            <w:r>
-              <w:rPr>
+                <w:color w:val="auto"/>
+                <w:sz w:val="20"/>
+                <w:szCs w:val="20"/>
+              </w:rPr>
+            </w:pPr>
+            <w:r>
+              <w:rPr>
+                <w:color w:val="auto"/>
                 <w:sz w:val="20"/>
                 <w:szCs w:val="20"/>
               </w:rPr>
@@ -1080,12 +1014,14 @@
               <w:spacing w:after="160" w:line="278" w:lineRule="auto"/>
               <w:cnfStyle w:val="100000000000" w:firstRow="1" w:lastRow="0" w:firstColumn="0" w:lastColumn="0" w:oddVBand="0" w:evenVBand="0" w:oddHBand="0" w:evenHBand="0" w:firstRowFirstColumn="0" w:firstRowLastColumn="0" w:lastRowFirstColumn="0" w:lastRowLastColumn="0"/>
               <w:rPr>
-                <w:sz w:val="20"/>
-                <w:szCs w:val="20"/>
-              </w:rPr>
-            </w:pPr>
-            <w:r>
-              <w:rPr>
+                <w:color w:val="auto"/>
+                <w:sz w:val="20"/>
+                <w:szCs w:val="20"/>
+              </w:rPr>
+            </w:pPr>
+            <w:r>
+              <w:rPr>
+                <w:color w:val="auto"/>
                 <w:sz w:val="20"/>
                 <w:szCs w:val="20"/>
               </w:rPr>
@@ -1103,12 +1039,14 @@
               <w:spacing w:after="160" w:line="278" w:lineRule="auto"/>
               <w:cnfStyle w:val="100000000000" w:firstRow="1" w:lastRow="0" w:firstColumn="0" w:lastColumn="0" w:oddVBand="0" w:evenVBand="0" w:oddHBand="0" w:evenHBand="0" w:firstRowFirstColumn="0" w:firstRowLastColumn="0" w:lastRowFirstColumn="0" w:lastRowLastColumn="0"/>
               <w:rPr>
-                <w:sz w:val="20"/>
-                <w:szCs w:val="20"/>
-              </w:rPr>
-            </w:pPr>
-            <w:r>
-              <w:rPr>
+                <w:color w:val="auto"/>
+                <w:sz w:val="20"/>
+                <w:szCs w:val="20"/>
+              </w:rPr>
+            </w:pPr>
+            <w:r>
+              <w:rPr>
+                <w:color w:val="auto"/>
                 <w:sz w:val="20"/>
                 <w:szCs w:val="20"/>
               </w:rPr>
@@ -1126,12 +1064,14 @@
               <w:spacing w:after="160" w:line="278" w:lineRule="auto"/>
               <w:cnfStyle w:val="100000000000" w:firstRow="1" w:lastRow="0" w:firstColumn="0" w:lastColumn="0" w:oddVBand="0" w:evenVBand="0" w:oddHBand="0" w:evenHBand="0" w:firstRowFirstColumn="0" w:firstRowLastColumn="0" w:lastRowFirstColumn="0" w:lastRowLastColumn="0"/>
               <w:rPr>
-                <w:sz w:val="20"/>
-                <w:szCs w:val="20"/>
-              </w:rPr>
-            </w:pPr>
-            <w:r>
-              <w:rPr>
+                <w:color w:val="auto"/>
+                <w:sz w:val="20"/>
+                <w:szCs w:val="20"/>
+              </w:rPr>
+            </w:pPr>
+            <w:r>
+              <w:rPr>
+                <w:color w:val="auto"/>
                 <w:sz w:val="20"/>
                 <w:szCs w:val="20"/>
               </w:rPr>
@@ -1149,12 +1089,14 @@
               <w:spacing w:after="160" w:line="278" w:lineRule="auto"/>
               <w:cnfStyle w:val="100000000000" w:firstRow="1" w:lastRow="0" w:firstColumn="0" w:lastColumn="0" w:oddVBand="0" w:evenVBand="0" w:oddHBand="0" w:evenHBand="0" w:firstRowFirstColumn="0" w:firstRowLastColumn="0" w:lastRowFirstColumn="0" w:lastRowLastColumn="0"/>
               <w:rPr>
-                <w:sz w:val="20"/>
-                <w:szCs w:val="20"/>
-              </w:rPr>
-            </w:pPr>
-            <w:r>
-              <w:rPr>
+                <w:color w:val="auto"/>
+                <w:sz w:val="20"/>
+                <w:szCs w:val="20"/>
+              </w:rPr>
+            </w:pPr>
+            <w:r>
+              <w:rPr>
+                <w:color w:val="auto"/>
                 <w:sz w:val="20"/>
                 <w:szCs w:val="20"/>
               </w:rPr>
@@ -1172,12 +1114,14 @@
               <w:spacing w:after="160" w:line="278" w:lineRule="auto"/>
               <w:cnfStyle w:val="100000000000" w:firstRow="1" w:lastRow="0" w:firstColumn="0" w:lastColumn="0" w:oddVBand="0" w:evenVBand="0" w:oddHBand="0" w:evenHBand="0" w:firstRowFirstColumn="0" w:firstRowLastColumn="0" w:lastRowFirstColumn="0" w:lastRowLastColumn="0"/>
               <w:rPr>
-                <w:sz w:val="20"/>
-                <w:szCs w:val="20"/>
-              </w:rPr>
-            </w:pPr>
-            <w:r>
-              <w:rPr>
+                <w:color w:val="auto"/>
+                <w:sz w:val="20"/>
+                <w:szCs w:val="20"/>
+              </w:rPr>
+            </w:pPr>
+            <w:r>
+              <w:rPr>
+                <w:color w:val="auto"/>
                 <w:sz w:val="20"/>
                 <w:szCs w:val="20"/>
               </w:rPr>
@@ -1195,12 +1139,14 @@
               <w:spacing w:after="160" w:line="278" w:lineRule="auto"/>
               <w:cnfStyle w:val="100000000000" w:firstRow="1" w:lastRow="0" w:firstColumn="0" w:lastColumn="0" w:oddVBand="0" w:evenVBand="0" w:oddHBand="0" w:evenHBand="0" w:firstRowFirstColumn="0" w:firstRowLastColumn="0" w:lastRowFirstColumn="0" w:lastRowLastColumn="0"/>
               <w:rPr>
-                <w:sz w:val="20"/>
-                <w:szCs w:val="20"/>
-              </w:rPr>
-            </w:pPr>
-            <w:r>
-              <w:rPr>
+                <w:color w:val="auto"/>
+                <w:sz w:val="20"/>
+                <w:szCs w:val="20"/>
+              </w:rPr>
+            </w:pPr>
+            <w:r>
+              <w:rPr>
+                <w:color w:val="auto"/>
                 <w:sz w:val="20"/>
                 <w:szCs w:val="20"/>
               </w:rPr>
@@ -1223,12 +1169,16 @@
             <w:pPr>
               <w:spacing w:after="160" w:line="278" w:lineRule="auto"/>
               <w:rPr>
-                <w:sz w:val="20"/>
-                <w:szCs w:val="20"/>
-              </w:rPr>
-            </w:pPr>
-            <w:r>
-              <w:rPr>
+                <w:b w:val="0"/>
+                <w:bCs w:val="0"/>
+                <w:sz w:val="20"/>
+                <w:szCs w:val="20"/>
+              </w:rPr>
+            </w:pPr>
+            <w:r>
+              <w:rPr>
+                <w:b w:val="0"/>
+                <w:bCs w:val="0"/>
                 <w:sz w:val="20"/>
                 <w:szCs w:val="20"/>
               </w:rPr>
@@ -1246,16 +1196,12 @@
               <w:spacing w:after="160" w:line="278" w:lineRule="auto"/>
               <w:cnfStyle w:val="000000100000" w:firstRow="0" w:lastRow="0" w:firstColumn="0" w:lastColumn="0" w:oddVBand="0" w:evenVBand="0" w:oddHBand="1" w:evenHBand="0" w:firstRowFirstColumn="0" w:firstRowLastColumn="0" w:lastRowFirstColumn="0" w:lastRowLastColumn="0"/>
               <w:rPr>
-                <w:b/>
-                <w:bCs/>
-                <w:sz w:val="20"/>
-                <w:szCs w:val="20"/>
-              </w:rPr>
-            </w:pPr>
-            <w:r>
-              <w:rPr>
-                <w:b/>
-                <w:bCs/>
+                <w:sz w:val="20"/>
+                <w:szCs w:val="20"/>
+              </w:rPr>
+            </w:pPr>
+            <w:r>
+              <w:rPr>
                 <w:sz w:val="20"/>
                 <w:szCs w:val="20"/>
               </w:rPr>
@@ -1273,16 +1219,12 @@
               <w:spacing w:after="160" w:line="278" w:lineRule="auto"/>
               <w:cnfStyle w:val="000000100000" w:firstRow="0" w:lastRow="0" w:firstColumn="0" w:lastColumn="0" w:oddVBand="0" w:evenVBand="0" w:oddHBand="1" w:evenHBand="0" w:firstRowFirstColumn="0" w:firstRowLastColumn="0" w:lastRowFirstColumn="0" w:lastRowLastColumn="0"/>
               <w:rPr>
-                <w:b/>
-                <w:bCs/>
-                <w:sz w:val="20"/>
-                <w:szCs w:val="20"/>
-              </w:rPr>
-            </w:pPr>
-            <w:r>
-              <w:rPr>
-                <w:b/>
-                <w:bCs/>
+                <w:sz w:val="20"/>
+                <w:szCs w:val="20"/>
+              </w:rPr>
+            </w:pPr>
+            <w:r>
+              <w:rPr>
                 <w:sz w:val="20"/>
                 <w:szCs w:val="20"/>
               </w:rPr>
@@ -1300,16 +1242,12 @@
               <w:spacing w:after="160" w:line="278" w:lineRule="auto"/>
               <w:cnfStyle w:val="000000100000" w:firstRow="0" w:lastRow="0" w:firstColumn="0" w:lastColumn="0" w:oddVBand="0" w:evenVBand="0" w:oddHBand="1" w:evenHBand="0" w:firstRowFirstColumn="0" w:firstRowLastColumn="0" w:lastRowFirstColumn="0" w:lastRowLastColumn="0"/>
               <w:rPr>
-                <w:b/>
-                <w:bCs/>
-                <w:sz w:val="20"/>
-                <w:szCs w:val="20"/>
-              </w:rPr>
-            </w:pPr>
-            <w:r>
-              <w:rPr>
-                <w:b/>
-                <w:bCs/>
+                <w:sz w:val="20"/>
+                <w:szCs w:val="20"/>
+              </w:rPr>
+            </w:pPr>
+            <w:r>
+              <w:rPr>
                 <w:sz w:val="20"/>
                 <w:szCs w:val="20"/>
               </w:rPr>
@@ -1327,16 +1265,12 @@
               <w:spacing w:after="160" w:line="278" w:lineRule="auto"/>
               <w:cnfStyle w:val="000000100000" w:firstRow="0" w:lastRow="0" w:firstColumn="0" w:lastColumn="0" w:oddVBand="0" w:evenVBand="0" w:oddHBand="1" w:evenHBand="0" w:firstRowFirstColumn="0" w:firstRowLastColumn="0" w:lastRowFirstColumn="0" w:lastRowLastColumn="0"/>
               <w:rPr>
-                <w:b/>
-                <w:bCs/>
-                <w:sz w:val="20"/>
-                <w:szCs w:val="20"/>
-              </w:rPr>
-            </w:pPr>
-            <w:r>
-              <w:rPr>
-                <w:b/>
-                <w:bCs/>
+                <w:sz w:val="20"/>
+                <w:szCs w:val="20"/>
+              </w:rPr>
+            </w:pPr>
+            <w:r>
+              <w:rPr>
                 <w:sz w:val="20"/>
                 <w:szCs w:val="20"/>
               </w:rPr>
@@ -1354,16 +1288,12 @@
               <w:spacing w:after="160" w:line="278" w:lineRule="auto"/>
               <w:cnfStyle w:val="000000100000" w:firstRow="0" w:lastRow="0" w:firstColumn="0" w:lastColumn="0" w:oddVBand="0" w:evenVBand="0" w:oddHBand="1" w:evenHBand="0" w:firstRowFirstColumn="0" w:firstRowLastColumn="0" w:lastRowFirstColumn="0" w:lastRowLastColumn="0"/>
               <w:rPr>
-                <w:b/>
-                <w:bCs/>
-                <w:sz w:val="20"/>
-                <w:szCs w:val="20"/>
-              </w:rPr>
-            </w:pPr>
-            <w:r>
-              <w:rPr>
-                <w:b/>
-                <w:bCs/>
+                <w:sz w:val="20"/>
+                <w:szCs w:val="20"/>
+              </w:rPr>
+            </w:pPr>
+            <w:r>
+              <w:rPr>
                 <w:sz w:val="20"/>
                 <w:szCs w:val="20"/>
               </w:rPr>
@@ -1381,16 +1311,12 @@
               <w:spacing w:after="160" w:line="278" w:lineRule="auto"/>
               <w:cnfStyle w:val="000000100000" w:firstRow="0" w:lastRow="0" w:firstColumn="0" w:lastColumn="0" w:oddVBand="0" w:evenVBand="0" w:oddHBand="1" w:evenHBand="0" w:firstRowFirstColumn="0" w:firstRowLastColumn="0" w:lastRowFirstColumn="0" w:lastRowLastColumn="0"/>
               <w:rPr>
-                <w:b/>
-                <w:bCs/>
-                <w:sz w:val="20"/>
-                <w:szCs w:val="20"/>
-              </w:rPr>
-            </w:pPr>
-            <w:r>
-              <w:rPr>
-                <w:b/>
-                <w:bCs/>
+                <w:sz w:val="20"/>
+                <w:szCs w:val="20"/>
+              </w:rPr>
+            </w:pPr>
+            <w:r>
+              <w:rPr>
                 <w:sz w:val="20"/>
                 <w:szCs w:val="20"/>
               </w:rPr>
@@ -1408,16 +1334,12 @@
               <w:spacing w:after="160" w:line="278" w:lineRule="auto"/>
               <w:cnfStyle w:val="000000100000" w:firstRow="0" w:lastRow="0" w:firstColumn="0" w:lastColumn="0" w:oddVBand="0" w:evenVBand="0" w:oddHBand="1" w:evenHBand="0" w:firstRowFirstColumn="0" w:firstRowLastColumn="0" w:lastRowFirstColumn="0" w:lastRowLastColumn="0"/>
               <w:rPr>
-                <w:b/>
-                <w:bCs/>
-                <w:sz w:val="20"/>
-                <w:szCs w:val="20"/>
-              </w:rPr>
-            </w:pPr>
-            <w:r>
-              <w:rPr>
-                <w:b/>
-                <w:bCs/>
+                <w:sz w:val="20"/>
+                <w:szCs w:val="20"/>
+              </w:rPr>
+            </w:pPr>
+            <w:r>
+              <w:rPr>
                 <w:sz w:val="20"/>
                 <w:szCs w:val="20"/>
               </w:rPr>
@@ -1437,12 +1359,16 @@
             <w:pPr>
               <w:spacing w:after="160" w:line="278" w:lineRule="auto"/>
               <w:rPr>
-                <w:sz w:val="20"/>
-                <w:szCs w:val="20"/>
-              </w:rPr>
-            </w:pPr>
-            <w:r>
-              <w:rPr>
+                <w:b w:val="0"/>
+                <w:bCs w:val="0"/>
+                <w:sz w:val="20"/>
+                <w:szCs w:val="20"/>
+              </w:rPr>
+            </w:pPr>
+            <w:r>
+              <w:rPr>
+                <w:b w:val="0"/>
+                <w:bCs w:val="0"/>
                 <w:sz w:val="20"/>
                 <w:szCs w:val="20"/>
               </w:rPr>
@@ -1460,16 +1386,12 @@
               <w:spacing w:after="160" w:line="278" w:lineRule="auto"/>
               <w:cnfStyle w:val="000000000000" w:firstRow="0" w:lastRow="0" w:firstColumn="0" w:lastColumn="0" w:oddVBand="0" w:evenVBand="0" w:oddHBand="0" w:evenHBand="0" w:firstRowFirstColumn="0" w:firstRowLastColumn="0" w:lastRowFirstColumn="0" w:lastRowLastColumn="0"/>
               <w:rPr>
-                <w:b/>
-                <w:bCs/>
-                <w:sz w:val="20"/>
-                <w:szCs w:val="20"/>
-              </w:rPr>
-            </w:pPr>
-            <w:r>
-              <w:rPr>
-                <w:b/>
-                <w:bCs/>
+                <w:sz w:val="20"/>
+                <w:szCs w:val="20"/>
+              </w:rPr>
+            </w:pPr>
+            <w:r>
+              <w:rPr>
                 <w:sz w:val="20"/>
                 <w:szCs w:val="20"/>
               </w:rPr>
@@ -1487,16 +1409,12 @@
               <w:spacing w:after="160" w:line="278" w:lineRule="auto"/>
               <w:cnfStyle w:val="000000000000" w:firstRow="0" w:lastRow="0" w:firstColumn="0" w:lastColumn="0" w:oddVBand="0" w:evenVBand="0" w:oddHBand="0" w:evenHBand="0" w:firstRowFirstColumn="0" w:firstRowLastColumn="0" w:lastRowFirstColumn="0" w:lastRowLastColumn="0"/>
               <w:rPr>
-                <w:b/>
-                <w:bCs/>
-                <w:sz w:val="20"/>
-                <w:szCs w:val="20"/>
-              </w:rPr>
-            </w:pPr>
-            <w:r>
-              <w:rPr>
-                <w:b/>
-                <w:bCs/>
+                <w:sz w:val="20"/>
+                <w:szCs w:val="20"/>
+              </w:rPr>
+            </w:pPr>
+            <w:r>
+              <w:rPr>
                 <w:sz w:val="20"/>
                 <w:szCs w:val="20"/>
               </w:rPr>
@@ -1514,16 +1432,12 @@
               <w:spacing w:after="160" w:line="278" w:lineRule="auto"/>
               <w:cnfStyle w:val="000000000000" w:firstRow="0" w:lastRow="0" w:firstColumn="0" w:lastColumn="0" w:oddVBand="0" w:evenVBand="0" w:oddHBand="0" w:evenHBand="0" w:firstRowFirstColumn="0" w:firstRowLastColumn="0" w:lastRowFirstColumn="0" w:lastRowLastColumn="0"/>
               <w:rPr>
-                <w:b/>
-                <w:bCs/>
-                <w:sz w:val="20"/>
-                <w:szCs w:val="20"/>
-              </w:rPr>
-            </w:pPr>
-            <w:r>
-              <w:rPr>
-                <w:b/>
-                <w:bCs/>
+                <w:sz w:val="20"/>
+                <w:szCs w:val="20"/>
+              </w:rPr>
+            </w:pPr>
+            <w:r>
+              <w:rPr>
                 <w:sz w:val="20"/>
                 <w:szCs w:val="20"/>
               </w:rPr>
@@ -1541,16 +1455,12 @@
               <w:spacing w:after="160" w:line="278" w:lineRule="auto"/>
               <w:cnfStyle w:val="000000000000" w:firstRow="0" w:lastRow="0" w:firstColumn="0" w:lastColumn="0" w:oddVBand="0" w:evenVBand="0" w:oddHBand="0" w:evenHBand="0" w:firstRowFirstColumn="0" w:firstRowLastColumn="0" w:lastRowFirstColumn="0" w:lastRowLastColumn="0"/>
               <w:rPr>
-                <w:b/>
-                <w:bCs/>
-                <w:sz w:val="20"/>
-                <w:szCs w:val="20"/>
-              </w:rPr>
-            </w:pPr>
-            <w:r>
-              <w:rPr>
-                <w:b/>
-                <w:bCs/>
+                <w:sz w:val="20"/>
+                <w:szCs w:val="20"/>
+              </w:rPr>
+            </w:pPr>
+            <w:r>
+              <w:rPr>
                 <w:sz w:val="20"/>
                 <w:szCs w:val="20"/>
               </w:rPr>
@@ -1559,8 +1469,6 @@
             <w:proofErr w:type="spellStart"/>
             <w:r>
               <w:rPr>
-                <w:b/>
-                <w:bCs/>
                 <w:sz w:val="20"/>
                 <w:szCs w:val="20"/>
               </w:rPr>
@@ -1569,8 +1477,6 @@
             <w:proofErr w:type="spellEnd"/>
             <w:r>
               <w:rPr>
-                <w:b/>
-                <w:bCs/>
                 <w:sz w:val="20"/>
                 <w:szCs w:val="20"/>
               </w:rPr>
@@ -1588,16 +1494,12 @@
               <w:spacing w:after="160" w:line="278" w:lineRule="auto"/>
               <w:cnfStyle w:val="000000000000" w:firstRow="0" w:lastRow="0" w:firstColumn="0" w:lastColumn="0" w:oddVBand="0" w:evenVBand="0" w:oddHBand="0" w:evenHBand="0" w:firstRowFirstColumn="0" w:firstRowLastColumn="0" w:lastRowFirstColumn="0" w:lastRowLastColumn="0"/>
               <w:rPr>
-                <w:b/>
-                <w:bCs/>
-                <w:sz w:val="20"/>
-                <w:szCs w:val="20"/>
-              </w:rPr>
-            </w:pPr>
-            <w:r>
-              <w:rPr>
-                <w:b/>
-                <w:bCs/>
+                <w:sz w:val="20"/>
+                <w:szCs w:val="20"/>
+              </w:rPr>
+            </w:pPr>
+            <w:r>
+              <w:rPr>
                 <w:sz w:val="20"/>
                 <w:szCs w:val="20"/>
               </w:rPr>
@@ -1615,16 +1517,12 @@
               <w:spacing w:after="160" w:line="278" w:lineRule="auto"/>
               <w:cnfStyle w:val="000000000000" w:firstRow="0" w:lastRow="0" w:firstColumn="0" w:lastColumn="0" w:oddVBand="0" w:evenVBand="0" w:oddHBand="0" w:evenHBand="0" w:firstRowFirstColumn="0" w:firstRowLastColumn="0" w:lastRowFirstColumn="0" w:lastRowLastColumn="0"/>
               <w:rPr>
-                <w:b/>
-                <w:bCs/>
-                <w:sz w:val="20"/>
-                <w:szCs w:val="20"/>
-              </w:rPr>
-            </w:pPr>
-            <w:r>
-              <w:rPr>
-                <w:b/>
-                <w:bCs/>
+                <w:sz w:val="20"/>
+                <w:szCs w:val="20"/>
+              </w:rPr>
+            </w:pPr>
+            <w:r>
+              <w:rPr>
                 <w:sz w:val="20"/>
                 <w:szCs w:val="20"/>
               </w:rPr>
@@ -1642,16 +1540,2471 @@
               <w:spacing w:after="160" w:line="278" w:lineRule="auto"/>
               <w:cnfStyle w:val="000000000000" w:firstRow="0" w:lastRow="0" w:firstColumn="0" w:lastColumn="0" w:oddVBand="0" w:evenVBand="0" w:oddHBand="0" w:evenHBand="0" w:firstRowFirstColumn="0" w:firstRowLastColumn="0" w:lastRowFirstColumn="0" w:lastRowLastColumn="0"/>
               <w:rPr>
-                <w:b/>
-                <w:bCs/>
-                <w:sz w:val="20"/>
-                <w:szCs w:val="20"/>
-              </w:rPr>
-            </w:pPr>
-            <w:r>
-              <w:rPr>
-                <w:b/>
-                <w:bCs/>
+                <w:sz w:val="20"/>
+                <w:szCs w:val="20"/>
+              </w:rPr>
+            </w:pPr>
+            <w:r>
+              <w:rPr>
+                <w:sz w:val="20"/>
+                <w:szCs w:val="20"/>
+              </w:rPr>
+              <w:t>PASS</w:t>
+            </w:r>
+          </w:p>
+        </w:tc>
+      </w:tr>
+      <w:tr>
+        <w:trPr>
+          <w:cnfStyle w:val="000000100000" w:firstRow="0" w:lastRow="0" w:firstColumn="0" w:lastColumn="0" w:oddVBand="0" w:evenVBand="0" w:oddHBand="1" w:evenHBand="0" w:firstRowFirstColumn="0" w:firstRowLastColumn="0" w:lastRowFirstColumn="0" w:lastRowLastColumn="0"/>
+        </w:trPr>
+        <w:tc>
+          <w:tcPr>
+            <w:cnfStyle w:val="001000000000" w:firstRow="0" w:lastRow="0" w:firstColumn="1" w:lastColumn="0" w:oddVBand="0" w:evenVBand="0" w:oddHBand="0" w:evenHBand="0" w:firstRowFirstColumn="0" w:firstRowLastColumn="0" w:lastRowFirstColumn="0" w:lastRowLastColumn="0"/>
+            <w:tcW w:w="0" w:type="auto"/>
+          </w:tcPr>
+          <w:p>
+            <w:pPr>
+              <w:rPr>
+                <w:b w:val="0"/>
+                <w:bCs w:val="0"/>
+                <w:sz w:val="20"/>
+                <w:szCs w:val="20"/>
+              </w:rPr>
+            </w:pPr>
+            <w:r>
+              <w:rPr>
+                <w:b w:val="0"/>
+                <w:bCs w:val="0"/>
+                <w:sz w:val="20"/>
+                <w:szCs w:val="20"/>
+              </w:rPr>
+              <w:t>TC-MAN-0</w:t>
+            </w:r>
+            <w:r>
+              <w:rPr>
+                <w:b w:val="0"/>
+                <w:bCs w:val="0"/>
+                <w:sz w:val="20"/>
+                <w:szCs w:val="20"/>
+              </w:rPr>
+              <w:t>3</w:t>
+            </w:r>
+          </w:p>
+        </w:tc>
+        <w:tc>
+          <w:tcPr>
+            <w:tcW w:w="0" w:type="auto"/>
+          </w:tcPr>
+          <w:p>
+            <w:pPr>
+              <w:cnfStyle w:val="000000100000" w:firstRow="0" w:lastRow="0" w:firstColumn="0" w:lastColumn="0" w:oddVBand="0" w:evenVBand="0" w:oddHBand="1" w:evenHBand="0" w:firstRowFirstColumn="0" w:firstRowLastColumn="0" w:lastRowFirstColumn="0" w:lastRowLastColumn="0"/>
+              <w:rPr>
+                <w:sz w:val="20"/>
+                <w:szCs w:val="20"/>
+              </w:rPr>
+            </w:pPr>
+            <w:r>
+              <w:rPr>
+                <w:sz w:val="20"/>
+                <w:szCs w:val="20"/>
+              </w:rPr>
+              <w:t>05/08/2026</w:t>
+            </w:r>
+          </w:p>
+        </w:tc>
+        <w:tc>
+          <w:tcPr>
+            <w:tcW w:w="0" w:type="auto"/>
+          </w:tcPr>
+          <w:p>
+            <w:pPr>
+              <w:cnfStyle w:val="000000100000" w:firstRow="0" w:lastRow="0" w:firstColumn="0" w:lastColumn="0" w:oddVBand="0" w:evenVBand="0" w:oddHBand="1" w:evenHBand="0" w:firstRowFirstColumn="0" w:firstRowLastColumn="0" w:lastRowFirstColumn="0" w:lastRowLastColumn="0"/>
+              <w:rPr>
+                <w:sz w:val="20"/>
+                <w:szCs w:val="20"/>
+              </w:rPr>
+            </w:pPr>
+            <w:r>
+              <w:rPr>
+                <w:sz w:val="20"/>
+                <w:szCs w:val="20"/>
+              </w:rPr>
+              <w:t>Shell Navigation</w:t>
+            </w:r>
+          </w:p>
+          <w:p>
+            <w:pPr>
+              <w:jc w:val="center"/>
+              <w:cnfStyle w:val="000000100000" w:firstRow="0" w:lastRow="0" w:firstColumn="0" w:lastColumn="0" w:oddVBand="0" w:evenVBand="0" w:oddHBand="1" w:evenHBand="0" w:firstRowFirstColumn="0" w:firstRowLastColumn="0" w:lastRowFirstColumn="0" w:lastRowLastColumn="0"/>
+              <w:rPr>
+                <w:sz w:val="20"/>
+                <w:szCs w:val="20"/>
+              </w:rPr>
+            </w:pPr>
+          </w:p>
+        </w:tc>
+        <w:tc>
+          <w:tcPr>
+            <w:tcW w:w="0" w:type="auto"/>
+          </w:tcPr>
+          <w:p>
+            <w:pPr>
+              <w:cnfStyle w:val="000000100000" w:firstRow="0" w:lastRow="0" w:firstColumn="0" w:lastColumn="0" w:oddVBand="0" w:evenVBand="0" w:oddHBand="1" w:evenHBand="0" w:firstRowFirstColumn="0" w:firstRowLastColumn="0" w:lastRowFirstColumn="0" w:lastRowLastColumn="0"/>
+              <w:rPr>
+                <w:sz w:val="20"/>
+                <w:szCs w:val="20"/>
+              </w:rPr>
+            </w:pPr>
+            <w:r>
+              <w:rPr>
+                <w:sz w:val="20"/>
+                <w:szCs w:val="20"/>
+              </w:rPr>
+              <w:t>Tab Selection</w:t>
+            </w:r>
+          </w:p>
+        </w:tc>
+        <w:tc>
+          <w:tcPr>
+            <w:tcW w:w="0" w:type="auto"/>
+          </w:tcPr>
+          <w:p>
+            <w:pPr>
+              <w:cnfStyle w:val="000000100000" w:firstRow="0" w:lastRow="0" w:firstColumn="0" w:lastColumn="0" w:oddVBand="0" w:evenVBand="0" w:oddHBand="1" w:evenHBand="0" w:firstRowFirstColumn="0" w:firstRowLastColumn="0" w:lastRowFirstColumn="0" w:lastRowLastColumn="0"/>
+              <w:rPr>
+                <w:sz w:val="20"/>
+                <w:szCs w:val="20"/>
+              </w:rPr>
+            </w:pPr>
+            <w:r>
+              <w:rPr>
+                <w:sz w:val="20"/>
+                <w:szCs w:val="20"/>
+              </w:rPr>
+              <w:t>Tap 'Opportunities', 'My Registrations', and 'Privacy' tabs</w:t>
+            </w:r>
+          </w:p>
+        </w:tc>
+        <w:tc>
+          <w:tcPr>
+            <w:tcW w:w="0" w:type="auto"/>
+          </w:tcPr>
+          <w:p>
+            <w:pPr>
+              <w:cnfStyle w:val="000000100000" w:firstRow="0" w:lastRow="0" w:firstColumn="0" w:lastColumn="0" w:oddVBand="0" w:evenVBand="0" w:oddHBand="1" w:evenHBand="0" w:firstRowFirstColumn="0" w:firstRowLastColumn="0" w:lastRowFirstColumn="0" w:lastRowLastColumn="0"/>
+              <w:rPr>
+                <w:sz w:val="20"/>
+                <w:szCs w:val="20"/>
+              </w:rPr>
+            </w:pPr>
+            <w:r>
+              <w:rPr>
+                <w:sz w:val="20"/>
+                <w:szCs w:val="20"/>
+              </w:rPr>
+              <w:t>Smooth navigation across all 4 primary Shell tabs</w:t>
+            </w:r>
+          </w:p>
+        </w:tc>
+        <w:tc>
+          <w:tcPr>
+            <w:tcW w:w="0" w:type="auto"/>
+          </w:tcPr>
+          <w:p>
+            <w:pPr>
+              <w:cnfStyle w:val="000000100000" w:firstRow="0" w:lastRow="0" w:firstColumn="0" w:lastColumn="0" w:oddVBand="0" w:evenVBand="0" w:oddHBand="1" w:evenHBand="0" w:firstRowFirstColumn="0" w:firstRowLastColumn="0" w:lastRowFirstColumn="0" w:lastRowLastColumn="0"/>
+              <w:rPr>
+                <w:sz w:val="20"/>
+                <w:szCs w:val="20"/>
+              </w:rPr>
+            </w:pPr>
+            <w:r>
+              <w:rPr>
+                <w:sz w:val="20"/>
+                <w:szCs w:val="20"/>
+              </w:rPr>
+              <w:t>App navigated smoothly between all bottom bar tabs</w:t>
+            </w:r>
+          </w:p>
+        </w:tc>
+        <w:tc>
+          <w:tcPr>
+            <w:tcW w:w="0" w:type="auto"/>
+          </w:tcPr>
+          <w:p>
+            <w:pPr>
+              <w:cnfStyle w:val="000000100000" w:firstRow="0" w:lastRow="0" w:firstColumn="0" w:lastColumn="0" w:oddVBand="0" w:evenVBand="0" w:oddHBand="1" w:evenHBand="0" w:firstRowFirstColumn="0" w:firstRowLastColumn="0" w:lastRowFirstColumn="0" w:lastRowLastColumn="0"/>
+              <w:rPr>
+                <w:sz w:val="20"/>
+                <w:szCs w:val="20"/>
+              </w:rPr>
+            </w:pPr>
+            <w:r>
+              <w:rPr>
+                <w:sz w:val="20"/>
+                <w:szCs w:val="20"/>
+              </w:rPr>
+              <w:t>PASS</w:t>
+            </w:r>
+          </w:p>
+        </w:tc>
+      </w:tr>
+      <w:tr>
+        <w:tc>
+          <w:tcPr>
+            <w:cnfStyle w:val="001000000000" w:firstRow="0" w:lastRow="0" w:firstColumn="1" w:lastColumn="0" w:oddVBand="0" w:evenVBand="0" w:oddHBand="0" w:evenHBand="0" w:firstRowFirstColumn="0" w:firstRowLastColumn="0" w:lastRowFirstColumn="0" w:lastRowLastColumn="0"/>
+            <w:tcW w:w="0" w:type="auto"/>
+          </w:tcPr>
+          <w:p>
+            <w:pPr>
+              <w:rPr>
+                <w:b w:val="0"/>
+                <w:bCs w:val="0"/>
+                <w:sz w:val="20"/>
+                <w:szCs w:val="20"/>
+              </w:rPr>
+            </w:pPr>
+            <w:r>
+              <w:rPr>
+                <w:b w:val="0"/>
+                <w:bCs w:val="0"/>
+                <w:sz w:val="20"/>
+                <w:szCs w:val="20"/>
+              </w:rPr>
+              <w:t>TC-MAN-04</w:t>
+            </w:r>
+          </w:p>
+        </w:tc>
+        <w:tc>
+          <w:tcPr>
+            <w:tcW w:w="0" w:type="auto"/>
+          </w:tcPr>
+          <w:p>
+            <w:pPr>
+              <w:cnfStyle w:val="000000000000" w:firstRow="0" w:lastRow="0" w:firstColumn="0" w:lastColumn="0" w:oddVBand="0" w:evenVBand="0" w:oddHBand="0" w:evenHBand="0" w:firstRowFirstColumn="0" w:firstRowLastColumn="0" w:lastRowFirstColumn="0" w:lastRowLastColumn="0"/>
+              <w:rPr>
+                <w:sz w:val="20"/>
+                <w:szCs w:val="20"/>
+              </w:rPr>
+            </w:pPr>
+            <w:r>
+              <w:rPr>
+                <w:sz w:val="20"/>
+                <w:szCs w:val="20"/>
+              </w:rPr>
+              <w:t>0</w:t>
+            </w:r>
+            <w:r>
+              <w:rPr>
+                <w:sz w:val="20"/>
+                <w:szCs w:val="20"/>
+              </w:rPr>
+              <w:t>5</w:t>
+            </w:r>
+            <w:r>
+              <w:rPr>
+                <w:sz w:val="20"/>
+                <w:szCs w:val="20"/>
+              </w:rPr>
+              <w:t>/08/2026</w:t>
+            </w:r>
+          </w:p>
+        </w:tc>
+        <w:tc>
+          <w:tcPr>
+            <w:tcW w:w="0" w:type="auto"/>
+          </w:tcPr>
+          <w:p>
+            <w:pPr>
+              <w:cnfStyle w:val="000000000000" w:firstRow="0" w:lastRow="0" w:firstColumn="0" w:lastColumn="0" w:oddVBand="0" w:evenVBand="0" w:oddHBand="0" w:evenHBand="0" w:firstRowFirstColumn="0" w:firstRowLastColumn="0" w:lastRowFirstColumn="0" w:lastRowLastColumn="0"/>
+              <w:rPr>
+                <w:sz w:val="20"/>
+                <w:szCs w:val="20"/>
+              </w:rPr>
+            </w:pPr>
+            <w:r>
+              <w:rPr>
+                <w:sz w:val="20"/>
+                <w:szCs w:val="20"/>
+              </w:rPr>
+              <w:t>Search Filter</w:t>
+            </w:r>
+          </w:p>
+        </w:tc>
+        <w:tc>
+          <w:tcPr>
+            <w:tcW w:w="0" w:type="auto"/>
+          </w:tcPr>
+          <w:p>
+            <w:pPr>
+              <w:cnfStyle w:val="000000000000" w:firstRow="0" w:lastRow="0" w:firstColumn="0" w:lastColumn="0" w:oddVBand="0" w:evenVBand="0" w:oddHBand="0" w:evenHBand="0" w:firstRowFirstColumn="0" w:firstRowLastColumn="0" w:lastRowFirstColumn="0" w:lastRowLastColumn="0"/>
+              <w:rPr>
+                <w:sz w:val="20"/>
+                <w:szCs w:val="20"/>
+              </w:rPr>
+            </w:pPr>
+            <w:r>
+              <w:rPr>
+                <w:sz w:val="20"/>
+                <w:szCs w:val="20"/>
+              </w:rPr>
+              <w:t>Query: "Garden"</w:t>
+            </w:r>
+          </w:p>
+        </w:tc>
+        <w:tc>
+          <w:tcPr>
+            <w:tcW w:w="0" w:type="auto"/>
+          </w:tcPr>
+          <w:p>
+            <w:pPr>
+              <w:cnfStyle w:val="000000000000" w:firstRow="0" w:lastRow="0" w:firstColumn="0" w:lastColumn="0" w:oddVBand="0" w:evenVBand="0" w:oddHBand="0" w:evenHBand="0" w:firstRowFirstColumn="0" w:firstRowLastColumn="0" w:lastRowFirstColumn="0" w:lastRowLastColumn="0"/>
+              <w:rPr>
+                <w:sz w:val="20"/>
+                <w:szCs w:val="20"/>
+              </w:rPr>
+            </w:pPr>
+            <w:r>
+              <w:rPr>
+                <w:sz w:val="20"/>
+                <w:szCs w:val="20"/>
+              </w:rPr>
+              <w:t xml:space="preserve">Type "Garden" into </w:t>
+            </w:r>
+            <w:proofErr w:type="spellStart"/>
+            <w:r>
+              <w:rPr>
+                <w:sz w:val="20"/>
+                <w:szCs w:val="20"/>
+              </w:rPr>
+              <w:t>SearchBar</w:t>
+            </w:r>
+            <w:proofErr w:type="spellEnd"/>
+            <w:r>
+              <w:rPr>
+                <w:sz w:val="20"/>
+                <w:szCs w:val="20"/>
+              </w:rPr>
+              <w:t xml:space="preserve"> on </w:t>
+            </w:r>
+            <w:proofErr w:type="spellStart"/>
+            <w:r>
+              <w:rPr>
+                <w:sz w:val="20"/>
+                <w:szCs w:val="20"/>
+              </w:rPr>
+              <w:t>OpportunitiesPage</w:t>
+            </w:r>
+            <w:proofErr w:type="spellEnd"/>
+          </w:p>
+        </w:tc>
+        <w:tc>
+          <w:tcPr>
+            <w:tcW w:w="0" w:type="auto"/>
+          </w:tcPr>
+          <w:p>
+            <w:pPr>
+              <w:cnfStyle w:val="000000000000" w:firstRow="0" w:lastRow="0" w:firstColumn="0" w:lastColumn="0" w:oddVBand="0" w:evenVBand="0" w:oddHBand="0" w:evenHBand="0" w:firstRowFirstColumn="0" w:firstRowLastColumn="0" w:lastRowFirstColumn="0" w:lastRowLastColumn="0"/>
+              <w:rPr>
+                <w:sz w:val="20"/>
+                <w:szCs w:val="20"/>
+              </w:rPr>
+            </w:pPr>
+            <w:r>
+              <w:rPr>
+                <w:sz w:val="20"/>
+                <w:szCs w:val="20"/>
+              </w:rPr>
+              <w:t>List dynamically filters to 'Community Garden Helper'</w:t>
+            </w:r>
+          </w:p>
+        </w:tc>
+        <w:tc>
+          <w:tcPr>
+            <w:tcW w:w="0" w:type="auto"/>
+          </w:tcPr>
+          <w:p>
+            <w:pPr>
+              <w:cnfStyle w:val="000000000000" w:firstRow="0" w:lastRow="0" w:firstColumn="0" w:lastColumn="0" w:oddVBand="0" w:evenVBand="0" w:oddHBand="0" w:evenHBand="0" w:firstRowFirstColumn="0" w:firstRowLastColumn="0" w:lastRowFirstColumn="0" w:lastRowLastColumn="0"/>
+              <w:rPr>
+                <w:sz w:val="20"/>
+                <w:szCs w:val="20"/>
+              </w:rPr>
+            </w:pPr>
+            <w:r>
+              <w:rPr>
+                <w:sz w:val="20"/>
+                <w:szCs w:val="20"/>
+              </w:rPr>
+              <w:t>List filtered instantly to matching item</w:t>
+            </w:r>
+          </w:p>
+        </w:tc>
+        <w:tc>
+          <w:tcPr>
+            <w:tcW w:w="0" w:type="auto"/>
+          </w:tcPr>
+          <w:p>
+            <w:pPr>
+              <w:cnfStyle w:val="000000000000" w:firstRow="0" w:lastRow="0" w:firstColumn="0" w:lastColumn="0" w:oddVBand="0" w:evenVBand="0" w:oddHBand="0" w:evenHBand="0" w:firstRowFirstColumn="0" w:firstRowLastColumn="0" w:lastRowFirstColumn="0" w:lastRowLastColumn="0"/>
+              <w:rPr>
+                <w:sz w:val="20"/>
+                <w:szCs w:val="20"/>
+              </w:rPr>
+            </w:pPr>
+            <w:r>
+              <w:rPr>
+                <w:sz w:val="20"/>
+                <w:szCs w:val="20"/>
+              </w:rPr>
+              <w:t>PASS</w:t>
+            </w:r>
+          </w:p>
+        </w:tc>
+      </w:tr>
+      <w:tr>
+        <w:trPr>
+          <w:cnfStyle w:val="000000100000" w:firstRow="0" w:lastRow="0" w:firstColumn="0" w:lastColumn="0" w:oddVBand="0" w:evenVBand="0" w:oddHBand="1" w:evenHBand="0" w:firstRowFirstColumn="0" w:firstRowLastColumn="0" w:lastRowFirstColumn="0" w:lastRowLastColumn="0"/>
+        </w:trPr>
+        <w:tc>
+          <w:tcPr>
+            <w:cnfStyle w:val="001000000000" w:firstRow="0" w:lastRow="0" w:firstColumn="1" w:lastColumn="0" w:oddVBand="0" w:evenVBand="0" w:oddHBand="0" w:evenHBand="0" w:firstRowFirstColumn="0" w:firstRowLastColumn="0" w:lastRowFirstColumn="0" w:lastRowLastColumn="0"/>
+            <w:tcW w:w="0" w:type="auto"/>
+          </w:tcPr>
+          <w:p>
+            <w:pPr>
+              <w:rPr>
+                <w:b w:val="0"/>
+                <w:bCs w:val="0"/>
+                <w:sz w:val="20"/>
+                <w:szCs w:val="20"/>
+              </w:rPr>
+            </w:pPr>
+            <w:r>
+              <w:rPr>
+                <w:b w:val="0"/>
+                <w:bCs w:val="0"/>
+                <w:sz w:val="20"/>
+                <w:szCs w:val="20"/>
+              </w:rPr>
+              <w:t>TC-MAN-05</w:t>
+            </w:r>
+          </w:p>
+        </w:tc>
+        <w:tc>
+          <w:tcPr>
+            <w:tcW w:w="0" w:type="auto"/>
+          </w:tcPr>
+          <w:p>
+            <w:pPr>
+              <w:cnfStyle w:val="000000100000" w:firstRow="0" w:lastRow="0" w:firstColumn="0" w:lastColumn="0" w:oddVBand="0" w:evenVBand="0" w:oddHBand="1" w:evenHBand="0" w:firstRowFirstColumn="0" w:firstRowLastColumn="0" w:lastRowFirstColumn="0" w:lastRowLastColumn="0"/>
+              <w:rPr>
+                <w:sz w:val="20"/>
+                <w:szCs w:val="20"/>
+              </w:rPr>
+            </w:pPr>
+            <w:r>
+              <w:rPr>
+                <w:sz w:val="20"/>
+                <w:szCs w:val="20"/>
+              </w:rPr>
+              <w:t>0</w:t>
+            </w:r>
+            <w:r>
+              <w:rPr>
+                <w:sz w:val="20"/>
+                <w:szCs w:val="20"/>
+              </w:rPr>
+              <w:t>5</w:t>
+            </w:r>
+            <w:r>
+              <w:rPr>
+                <w:sz w:val="20"/>
+                <w:szCs w:val="20"/>
+              </w:rPr>
+              <w:t>/08/2026</w:t>
+            </w:r>
+          </w:p>
+        </w:tc>
+        <w:tc>
+          <w:tcPr>
+            <w:tcW w:w="0" w:type="auto"/>
+          </w:tcPr>
+          <w:p>
+            <w:pPr>
+              <w:cnfStyle w:val="000000100000" w:firstRow="0" w:lastRow="0" w:firstColumn="0" w:lastColumn="0" w:oddVBand="0" w:evenVBand="0" w:oddHBand="1" w:evenHBand="0" w:firstRowFirstColumn="0" w:firstRowLastColumn="0" w:lastRowFirstColumn="0" w:lastRowLastColumn="0"/>
+              <w:rPr>
+                <w:sz w:val="20"/>
+                <w:szCs w:val="20"/>
+              </w:rPr>
+            </w:pPr>
+            <w:r>
+              <w:rPr>
+                <w:sz w:val="20"/>
+                <w:szCs w:val="20"/>
+              </w:rPr>
+              <w:t>Category Filter</w:t>
+            </w:r>
+          </w:p>
+        </w:tc>
+        <w:tc>
+          <w:tcPr>
+            <w:tcW w:w="0" w:type="auto"/>
+          </w:tcPr>
+          <w:p>
+            <w:pPr>
+              <w:cnfStyle w:val="000000100000" w:firstRow="0" w:lastRow="0" w:firstColumn="0" w:lastColumn="0" w:oddVBand="0" w:evenVBand="0" w:oddHBand="1" w:evenHBand="0" w:firstRowFirstColumn="0" w:firstRowLastColumn="0" w:lastRowFirstColumn="0" w:lastRowLastColumn="0"/>
+              <w:rPr>
+                <w:sz w:val="20"/>
+                <w:szCs w:val="20"/>
+              </w:rPr>
+            </w:pPr>
+            <w:r>
+              <w:rPr>
+                <w:sz w:val="20"/>
+                <w:szCs w:val="20"/>
+              </w:rPr>
+              <w:t>Picker: "Environment"</w:t>
+            </w:r>
+          </w:p>
+        </w:tc>
+        <w:tc>
+          <w:tcPr>
+            <w:tcW w:w="0" w:type="auto"/>
+          </w:tcPr>
+          <w:p>
+            <w:pPr>
+              <w:cnfStyle w:val="000000100000" w:firstRow="0" w:lastRow="0" w:firstColumn="0" w:lastColumn="0" w:oddVBand="0" w:evenVBand="0" w:oddHBand="1" w:evenHBand="0" w:firstRowFirstColumn="0" w:firstRowLastColumn="0" w:lastRowFirstColumn="0" w:lastRowLastColumn="0"/>
+              <w:rPr>
+                <w:sz w:val="20"/>
+                <w:szCs w:val="20"/>
+              </w:rPr>
+            </w:pPr>
+            <w:r>
+              <w:rPr>
+                <w:sz w:val="20"/>
+                <w:szCs w:val="20"/>
+              </w:rPr>
+              <w:t>Select "Environment" from Category Picker dropdown</w:t>
+            </w:r>
+          </w:p>
+        </w:tc>
+        <w:tc>
+          <w:tcPr>
+            <w:tcW w:w="0" w:type="auto"/>
+          </w:tcPr>
+          <w:p>
+            <w:pPr>
+              <w:cnfStyle w:val="000000100000" w:firstRow="0" w:lastRow="0" w:firstColumn="0" w:lastColumn="0" w:oddVBand="0" w:evenVBand="0" w:oddHBand="1" w:evenHBand="0" w:firstRowFirstColumn="0" w:firstRowLastColumn="0" w:lastRowFirstColumn="0" w:lastRowLastColumn="0"/>
+              <w:rPr>
+                <w:sz w:val="20"/>
+                <w:szCs w:val="20"/>
+              </w:rPr>
+            </w:pPr>
+            <w:r>
+              <w:rPr>
+                <w:sz w:val="20"/>
+                <w:szCs w:val="20"/>
+              </w:rPr>
+              <w:t>Displays only environmental volunteer opportunities</w:t>
+            </w:r>
+          </w:p>
+        </w:tc>
+        <w:tc>
+          <w:tcPr>
+            <w:tcW w:w="0" w:type="auto"/>
+          </w:tcPr>
+          <w:p>
+            <w:pPr>
+              <w:cnfStyle w:val="000000100000" w:firstRow="0" w:lastRow="0" w:firstColumn="0" w:lastColumn="0" w:oddVBand="0" w:evenVBand="0" w:oddHBand="1" w:evenHBand="0" w:firstRowFirstColumn="0" w:firstRowLastColumn="0" w:lastRowFirstColumn="0" w:lastRowLastColumn="0"/>
+              <w:rPr>
+                <w:sz w:val="20"/>
+                <w:szCs w:val="20"/>
+              </w:rPr>
+            </w:pPr>
+            <w:r>
+              <w:rPr>
+                <w:sz w:val="20"/>
+                <w:szCs w:val="20"/>
+              </w:rPr>
+              <w:t>List updated to display only Environment opportunities</w:t>
+            </w:r>
+          </w:p>
+        </w:tc>
+        <w:tc>
+          <w:tcPr>
+            <w:tcW w:w="0" w:type="auto"/>
+          </w:tcPr>
+          <w:p>
+            <w:pPr>
+              <w:cnfStyle w:val="000000100000" w:firstRow="0" w:lastRow="0" w:firstColumn="0" w:lastColumn="0" w:oddVBand="0" w:evenVBand="0" w:oddHBand="1" w:evenHBand="0" w:firstRowFirstColumn="0" w:firstRowLastColumn="0" w:lastRowFirstColumn="0" w:lastRowLastColumn="0"/>
+              <w:rPr>
+                <w:sz w:val="20"/>
+                <w:szCs w:val="20"/>
+              </w:rPr>
+            </w:pPr>
+            <w:r>
+              <w:rPr>
+                <w:sz w:val="20"/>
+                <w:szCs w:val="20"/>
+              </w:rPr>
+              <w:t>PASS</w:t>
+            </w:r>
+          </w:p>
+        </w:tc>
+      </w:tr>
+      <w:tr>
+        <w:tc>
+          <w:tcPr>
+            <w:cnfStyle w:val="001000000000" w:firstRow="0" w:lastRow="0" w:firstColumn="1" w:lastColumn="0" w:oddVBand="0" w:evenVBand="0" w:oddHBand="0" w:evenHBand="0" w:firstRowFirstColumn="0" w:firstRowLastColumn="0" w:lastRowFirstColumn="0" w:lastRowLastColumn="0"/>
+            <w:tcW w:w="0" w:type="auto"/>
+          </w:tcPr>
+          <w:p>
+            <w:pPr>
+              <w:rPr>
+                <w:b w:val="0"/>
+                <w:bCs w:val="0"/>
+                <w:sz w:val="20"/>
+                <w:szCs w:val="20"/>
+              </w:rPr>
+            </w:pPr>
+            <w:r>
+              <w:rPr>
+                <w:b w:val="0"/>
+                <w:bCs w:val="0"/>
+                <w:sz w:val="20"/>
+                <w:szCs w:val="20"/>
+              </w:rPr>
+              <w:t>TC-MAN-06</w:t>
+            </w:r>
+          </w:p>
+        </w:tc>
+        <w:tc>
+          <w:tcPr>
+            <w:tcW w:w="0" w:type="auto"/>
+          </w:tcPr>
+          <w:p>
+            <w:pPr>
+              <w:cnfStyle w:val="000000000000" w:firstRow="0" w:lastRow="0" w:firstColumn="0" w:lastColumn="0" w:oddVBand="0" w:evenVBand="0" w:oddHBand="0" w:evenHBand="0" w:firstRowFirstColumn="0" w:firstRowLastColumn="0" w:lastRowFirstColumn="0" w:lastRowLastColumn="0"/>
+              <w:rPr>
+                <w:sz w:val="20"/>
+                <w:szCs w:val="20"/>
+              </w:rPr>
+            </w:pPr>
+            <w:r>
+              <w:rPr>
+                <w:sz w:val="20"/>
+                <w:szCs w:val="20"/>
+              </w:rPr>
+              <w:t>05/08/2026</w:t>
+            </w:r>
+          </w:p>
+        </w:tc>
+        <w:tc>
+          <w:tcPr>
+            <w:tcW w:w="0" w:type="auto"/>
+          </w:tcPr>
+          <w:p>
+            <w:pPr>
+              <w:cnfStyle w:val="000000000000" w:firstRow="0" w:lastRow="0" w:firstColumn="0" w:lastColumn="0" w:oddVBand="0" w:evenVBand="0" w:oddHBand="0" w:evenHBand="0" w:firstRowFirstColumn="0" w:firstRowLastColumn="0" w:lastRowFirstColumn="0" w:lastRowLastColumn="0"/>
+              <w:rPr>
+                <w:sz w:val="20"/>
+                <w:szCs w:val="20"/>
+              </w:rPr>
+            </w:pPr>
+            <w:r>
+              <w:rPr>
+                <w:sz w:val="20"/>
+                <w:szCs w:val="20"/>
+              </w:rPr>
+              <w:t>Opportunity Details</w:t>
+            </w:r>
+          </w:p>
+        </w:tc>
+        <w:tc>
+          <w:tcPr>
+            <w:tcW w:w="0" w:type="auto"/>
+          </w:tcPr>
+          <w:p>
+            <w:pPr>
+              <w:cnfStyle w:val="000000000000" w:firstRow="0" w:lastRow="0" w:firstColumn="0" w:lastColumn="0" w:oddVBand="0" w:evenVBand="0" w:oddHBand="0" w:evenHBand="0" w:firstRowFirstColumn="0" w:firstRowLastColumn="0" w:lastRowFirstColumn="0" w:lastRowLastColumn="0"/>
+              <w:rPr>
+                <w:sz w:val="20"/>
+                <w:szCs w:val="20"/>
+              </w:rPr>
+            </w:pPr>
+            <w:proofErr w:type="spellStart"/>
+            <w:r>
+              <w:rPr>
+                <w:sz w:val="20"/>
+                <w:szCs w:val="20"/>
+              </w:rPr>
+              <w:t>CollectionView</w:t>
+            </w:r>
+            <w:proofErr w:type="spellEnd"/>
+            <w:r>
+              <w:rPr>
+                <w:sz w:val="20"/>
+                <w:szCs w:val="20"/>
+              </w:rPr>
+              <w:t xml:space="preserve"> Selection</w:t>
+            </w:r>
+          </w:p>
+        </w:tc>
+        <w:tc>
+          <w:tcPr>
+            <w:tcW w:w="0" w:type="auto"/>
+          </w:tcPr>
+          <w:p>
+            <w:pPr>
+              <w:cnfStyle w:val="000000000000" w:firstRow="0" w:lastRow="0" w:firstColumn="0" w:lastColumn="0" w:oddVBand="0" w:evenVBand="0" w:oddHBand="0" w:evenHBand="0" w:firstRowFirstColumn="0" w:firstRowLastColumn="0" w:lastRowFirstColumn="0" w:lastRowLastColumn="0"/>
+              <w:rPr>
+                <w:sz w:val="20"/>
+                <w:szCs w:val="20"/>
+              </w:rPr>
+            </w:pPr>
+            <w:r>
+              <w:rPr>
+                <w:sz w:val="20"/>
+                <w:szCs w:val="20"/>
+              </w:rPr>
+              <w:t>Tap on 'Community Garden Helper' card</w:t>
+            </w:r>
+          </w:p>
+        </w:tc>
+        <w:tc>
+          <w:tcPr>
+            <w:tcW w:w="0" w:type="auto"/>
+          </w:tcPr>
+          <w:p>
+            <w:pPr>
+              <w:cnfStyle w:val="000000000000" w:firstRow="0" w:lastRow="0" w:firstColumn="0" w:lastColumn="0" w:oddVBand="0" w:evenVBand="0" w:oddHBand="0" w:evenHBand="0" w:firstRowFirstColumn="0" w:firstRowLastColumn="0" w:lastRowFirstColumn="0" w:lastRowLastColumn="0"/>
+              <w:rPr>
+                <w:sz w:val="20"/>
+                <w:szCs w:val="20"/>
+              </w:rPr>
+            </w:pPr>
+            <w:r>
+              <w:rPr>
+                <w:sz w:val="20"/>
+                <w:szCs w:val="20"/>
+              </w:rPr>
+              <w:t xml:space="preserve">Page transitions to </w:t>
+            </w:r>
+            <w:proofErr w:type="spellStart"/>
+            <w:r>
+              <w:rPr>
+                <w:sz w:val="20"/>
+                <w:szCs w:val="20"/>
+              </w:rPr>
+              <w:t>OpportunityDetailsPage</w:t>
+            </w:r>
+            <w:proofErr w:type="spellEnd"/>
+            <w:r>
+              <w:rPr>
+                <w:sz w:val="20"/>
+                <w:szCs w:val="20"/>
+              </w:rPr>
+              <w:t xml:space="preserve"> passing id=1 parameter</w:t>
+            </w:r>
+          </w:p>
+        </w:tc>
+        <w:tc>
+          <w:tcPr>
+            <w:tcW w:w="0" w:type="auto"/>
+          </w:tcPr>
+          <w:p>
+            <w:pPr>
+              <w:cnfStyle w:val="000000000000" w:firstRow="0" w:lastRow="0" w:firstColumn="0" w:lastColumn="0" w:oddVBand="0" w:evenVBand="0" w:oddHBand="0" w:evenHBand="0" w:firstRowFirstColumn="0" w:firstRowLastColumn="0" w:lastRowFirstColumn="0" w:lastRowLastColumn="0"/>
+              <w:rPr>
+                <w:sz w:val="20"/>
+                <w:szCs w:val="20"/>
+              </w:rPr>
+            </w:pPr>
+            <w:r>
+              <w:rPr>
+                <w:sz w:val="20"/>
+                <w:szCs w:val="20"/>
+              </w:rPr>
+              <w:t>Full description, location, time, and places displayed correctly</w:t>
+            </w:r>
+          </w:p>
+        </w:tc>
+        <w:tc>
+          <w:tcPr>
+            <w:tcW w:w="0" w:type="auto"/>
+          </w:tcPr>
+          <w:p>
+            <w:pPr>
+              <w:cnfStyle w:val="000000000000" w:firstRow="0" w:lastRow="0" w:firstColumn="0" w:lastColumn="0" w:oddVBand="0" w:evenVBand="0" w:oddHBand="0" w:evenHBand="0" w:firstRowFirstColumn="0" w:firstRowLastColumn="0" w:lastRowFirstColumn="0" w:lastRowLastColumn="0"/>
+              <w:rPr>
+                <w:sz w:val="20"/>
+                <w:szCs w:val="20"/>
+              </w:rPr>
+            </w:pPr>
+            <w:r>
+              <w:rPr>
+                <w:sz w:val="20"/>
+                <w:szCs w:val="20"/>
+              </w:rPr>
+              <w:t>PASS</w:t>
+            </w:r>
+          </w:p>
+        </w:tc>
+      </w:tr>
+      <w:tr>
+        <w:trPr>
+          <w:cnfStyle w:val="000000100000" w:firstRow="0" w:lastRow="0" w:firstColumn="0" w:lastColumn="0" w:oddVBand="0" w:evenVBand="0" w:oddHBand="1" w:evenHBand="0" w:firstRowFirstColumn="0" w:firstRowLastColumn="0" w:lastRowFirstColumn="0" w:lastRowLastColumn="0"/>
+        </w:trPr>
+        <w:tc>
+          <w:tcPr>
+            <w:cnfStyle w:val="001000000000" w:firstRow="0" w:lastRow="0" w:firstColumn="1" w:lastColumn="0" w:oddVBand="0" w:evenVBand="0" w:oddHBand="0" w:evenHBand="0" w:firstRowFirstColumn="0" w:firstRowLastColumn="0" w:lastRowFirstColumn="0" w:lastRowLastColumn="0"/>
+            <w:tcW w:w="0" w:type="auto"/>
+          </w:tcPr>
+          <w:p>
+            <w:pPr>
+              <w:rPr>
+                <w:b w:val="0"/>
+                <w:bCs w:val="0"/>
+                <w:sz w:val="20"/>
+                <w:szCs w:val="20"/>
+              </w:rPr>
+            </w:pPr>
+            <w:r>
+              <w:rPr>
+                <w:b w:val="0"/>
+                <w:bCs w:val="0"/>
+                <w:sz w:val="20"/>
+                <w:szCs w:val="20"/>
+              </w:rPr>
+              <w:t>TC-MAN-07</w:t>
+            </w:r>
+          </w:p>
+        </w:tc>
+        <w:tc>
+          <w:tcPr>
+            <w:tcW w:w="0" w:type="auto"/>
+          </w:tcPr>
+          <w:p>
+            <w:pPr>
+              <w:cnfStyle w:val="000000100000" w:firstRow="0" w:lastRow="0" w:firstColumn="0" w:lastColumn="0" w:oddVBand="0" w:evenVBand="0" w:oddHBand="1" w:evenHBand="0" w:firstRowFirstColumn="0" w:firstRowLastColumn="0" w:lastRowFirstColumn="0" w:lastRowLastColumn="0"/>
+              <w:rPr>
+                <w:sz w:val="20"/>
+                <w:szCs w:val="20"/>
+              </w:rPr>
+            </w:pPr>
+            <w:r>
+              <w:rPr>
+                <w:sz w:val="20"/>
+                <w:szCs w:val="20"/>
+              </w:rPr>
+              <w:t>0</w:t>
+            </w:r>
+            <w:r>
+              <w:rPr>
+                <w:sz w:val="20"/>
+                <w:szCs w:val="20"/>
+              </w:rPr>
+              <w:t>5</w:t>
+            </w:r>
+            <w:r>
+              <w:rPr>
+                <w:sz w:val="20"/>
+                <w:szCs w:val="20"/>
+              </w:rPr>
+              <w:t>/08/2026</w:t>
+            </w:r>
+          </w:p>
+        </w:tc>
+        <w:tc>
+          <w:tcPr>
+            <w:tcW w:w="0" w:type="auto"/>
+          </w:tcPr>
+          <w:p>
+            <w:pPr>
+              <w:cnfStyle w:val="000000100000" w:firstRow="0" w:lastRow="0" w:firstColumn="0" w:lastColumn="0" w:oddVBand="0" w:evenVBand="0" w:oddHBand="1" w:evenHBand="0" w:firstRowFirstColumn="0" w:firstRowLastColumn="0" w:lastRowFirstColumn="0" w:lastRowLastColumn="0"/>
+              <w:rPr>
+                <w:sz w:val="20"/>
+                <w:szCs w:val="20"/>
+              </w:rPr>
+            </w:pPr>
+            <w:r>
+              <w:rPr>
+                <w:sz w:val="20"/>
+                <w:szCs w:val="20"/>
+              </w:rPr>
+              <w:t>Privacy Consent Enforcement</w:t>
+            </w:r>
+          </w:p>
+        </w:tc>
+        <w:tc>
+          <w:tcPr>
+            <w:tcW w:w="0" w:type="auto"/>
+          </w:tcPr>
+          <w:p>
+            <w:pPr>
+              <w:cnfStyle w:val="000000100000" w:firstRow="0" w:lastRow="0" w:firstColumn="0" w:lastColumn="0" w:oddVBand="0" w:evenVBand="0" w:oddHBand="1" w:evenHBand="0" w:firstRowFirstColumn="0" w:firstRowLastColumn="0" w:lastRowFirstColumn="0" w:lastRowLastColumn="0"/>
+              <w:rPr>
+                <w:sz w:val="20"/>
+                <w:szCs w:val="20"/>
+              </w:rPr>
+            </w:pPr>
+            <w:proofErr w:type="spellStart"/>
+            <w:r>
+              <w:rPr>
+                <w:sz w:val="20"/>
+                <w:szCs w:val="20"/>
+              </w:rPr>
+              <w:t>CheckBox</w:t>
+            </w:r>
+            <w:proofErr w:type="spellEnd"/>
+            <w:r>
+              <w:rPr>
+                <w:sz w:val="20"/>
+                <w:szCs w:val="20"/>
+              </w:rPr>
+              <w:t>: Unchecked</w:t>
+            </w:r>
+          </w:p>
+        </w:tc>
+        <w:tc>
+          <w:tcPr>
+            <w:tcW w:w="0" w:type="auto"/>
+          </w:tcPr>
+          <w:p>
+            <w:pPr>
+              <w:cnfStyle w:val="000000100000" w:firstRow="0" w:lastRow="0" w:firstColumn="0" w:lastColumn="0" w:oddVBand="0" w:evenVBand="0" w:oddHBand="1" w:evenHBand="0" w:firstRowFirstColumn="0" w:firstRowLastColumn="0" w:lastRowFirstColumn="0" w:lastRowLastColumn="0"/>
+              <w:rPr>
+                <w:sz w:val="20"/>
+                <w:szCs w:val="20"/>
+              </w:rPr>
+            </w:pPr>
+            <w:r>
+              <w:rPr>
+                <w:sz w:val="20"/>
+                <w:szCs w:val="20"/>
+              </w:rPr>
+              <w:t>Fill form, leave consent unchecked, tap 'Submit Registration'</w:t>
+            </w:r>
+          </w:p>
+        </w:tc>
+        <w:tc>
+          <w:tcPr>
+            <w:tcW w:w="0" w:type="auto"/>
+          </w:tcPr>
+          <w:p>
+            <w:pPr>
+              <w:cnfStyle w:val="000000100000" w:firstRow="0" w:lastRow="0" w:firstColumn="0" w:lastColumn="0" w:oddVBand="0" w:evenVBand="0" w:oddHBand="1" w:evenHBand="0" w:firstRowFirstColumn="0" w:firstRowLastColumn="0" w:lastRowFirstColumn="0" w:lastRowLastColumn="0"/>
+              <w:rPr>
+                <w:sz w:val="20"/>
+                <w:szCs w:val="20"/>
+              </w:rPr>
+            </w:pPr>
+            <w:r>
+              <w:rPr>
+                <w:sz w:val="20"/>
+                <w:szCs w:val="20"/>
+              </w:rPr>
+              <w:t xml:space="preserve">Registration blocked with message: </w:t>
+            </w:r>
+            <w:r>
+              <w:rPr>
+                <w:i/>
+                <w:iCs/>
+                <w:sz w:val="20"/>
+                <w:szCs w:val="20"/>
+              </w:rPr>
+              <w:t xml:space="preserve">"You must agree to the </w:t>
+            </w:r>
+            <w:r>
+              <w:rPr>
+                <w:i/>
+                <w:iCs/>
+                <w:sz w:val="20"/>
+                <w:szCs w:val="20"/>
+              </w:rPr>
+              <w:lastRenderedPageBreak/>
+              <w:t>privacy consent to register."</w:t>
+            </w:r>
+          </w:p>
+        </w:tc>
+        <w:tc>
+          <w:tcPr>
+            <w:tcW w:w="0" w:type="auto"/>
+          </w:tcPr>
+          <w:p>
+            <w:pPr>
+              <w:cnfStyle w:val="000000100000" w:firstRow="0" w:lastRow="0" w:firstColumn="0" w:lastColumn="0" w:oddVBand="0" w:evenVBand="0" w:oddHBand="1" w:evenHBand="0" w:firstRowFirstColumn="0" w:firstRowLastColumn="0" w:lastRowFirstColumn="0" w:lastRowLastColumn="0"/>
+              <w:rPr>
+                <w:sz w:val="20"/>
+                <w:szCs w:val="20"/>
+              </w:rPr>
+            </w:pPr>
+            <w:r>
+              <w:rPr>
+                <w:sz w:val="20"/>
+                <w:szCs w:val="20"/>
+              </w:rPr>
+              <w:lastRenderedPageBreak/>
+              <w:t xml:space="preserve">Submission blocked, error message </w:t>
+            </w:r>
+            <w:r>
+              <w:rPr>
+                <w:sz w:val="20"/>
+                <w:szCs w:val="20"/>
+              </w:rPr>
+              <w:lastRenderedPageBreak/>
+              <w:t>displayed in red</w:t>
+            </w:r>
+          </w:p>
+        </w:tc>
+        <w:tc>
+          <w:tcPr>
+            <w:tcW w:w="0" w:type="auto"/>
+          </w:tcPr>
+          <w:p>
+            <w:pPr>
+              <w:cnfStyle w:val="000000100000" w:firstRow="0" w:lastRow="0" w:firstColumn="0" w:lastColumn="0" w:oddVBand="0" w:evenVBand="0" w:oddHBand="1" w:evenHBand="0" w:firstRowFirstColumn="0" w:firstRowLastColumn="0" w:lastRowFirstColumn="0" w:lastRowLastColumn="0"/>
+              <w:rPr>
+                <w:sz w:val="20"/>
+                <w:szCs w:val="20"/>
+              </w:rPr>
+            </w:pPr>
+            <w:r>
+              <w:rPr>
+                <w:sz w:val="20"/>
+                <w:szCs w:val="20"/>
+              </w:rPr>
+              <w:lastRenderedPageBreak/>
+              <w:t>PASS</w:t>
+            </w:r>
+          </w:p>
+        </w:tc>
+      </w:tr>
+      <w:tr>
+        <w:tc>
+          <w:tcPr>
+            <w:cnfStyle w:val="001000000000" w:firstRow="0" w:lastRow="0" w:firstColumn="1" w:lastColumn="0" w:oddVBand="0" w:evenVBand="0" w:oddHBand="0" w:evenHBand="0" w:firstRowFirstColumn="0" w:firstRowLastColumn="0" w:lastRowFirstColumn="0" w:lastRowLastColumn="0"/>
+            <w:tcW w:w="0" w:type="auto"/>
+          </w:tcPr>
+          <w:p>
+            <w:pPr>
+              <w:jc w:val="center"/>
+              <w:rPr>
+                <w:b w:val="0"/>
+                <w:bCs w:val="0"/>
+                <w:sz w:val="20"/>
+                <w:szCs w:val="20"/>
+              </w:rPr>
+            </w:pPr>
+            <w:r>
+              <w:rPr>
+                <w:b w:val="0"/>
+                <w:bCs w:val="0"/>
+                <w:sz w:val="20"/>
+                <w:szCs w:val="20"/>
+              </w:rPr>
+              <w:t>TC-MAN-08</w:t>
+            </w:r>
+          </w:p>
+        </w:tc>
+        <w:tc>
+          <w:tcPr>
+            <w:tcW w:w="0" w:type="auto"/>
+          </w:tcPr>
+          <w:p>
+            <w:pPr>
+              <w:cnfStyle w:val="000000000000" w:firstRow="0" w:lastRow="0" w:firstColumn="0" w:lastColumn="0" w:oddVBand="0" w:evenVBand="0" w:oddHBand="0" w:evenHBand="0" w:firstRowFirstColumn="0" w:firstRowLastColumn="0" w:lastRowFirstColumn="0" w:lastRowLastColumn="0"/>
+              <w:rPr>
+                <w:sz w:val="20"/>
+                <w:szCs w:val="20"/>
+              </w:rPr>
+            </w:pPr>
+            <w:r>
+              <w:rPr>
+                <w:sz w:val="20"/>
+                <w:szCs w:val="20"/>
+              </w:rPr>
+              <w:t>0</w:t>
+            </w:r>
+            <w:r>
+              <w:rPr>
+                <w:sz w:val="20"/>
+                <w:szCs w:val="20"/>
+              </w:rPr>
+              <w:t>5</w:t>
+            </w:r>
+            <w:r>
+              <w:rPr>
+                <w:sz w:val="20"/>
+                <w:szCs w:val="20"/>
+              </w:rPr>
+              <w:t>/08/2026</w:t>
+            </w:r>
+          </w:p>
+        </w:tc>
+        <w:tc>
+          <w:tcPr>
+            <w:tcW w:w="0" w:type="auto"/>
+          </w:tcPr>
+          <w:p>
+            <w:pPr>
+              <w:cnfStyle w:val="000000000000" w:firstRow="0" w:lastRow="0" w:firstColumn="0" w:lastColumn="0" w:oddVBand="0" w:evenVBand="0" w:oddHBand="0" w:evenHBand="0" w:firstRowFirstColumn="0" w:firstRowLastColumn="0" w:lastRowFirstColumn="0" w:lastRowLastColumn="0"/>
+              <w:rPr>
+                <w:sz w:val="20"/>
+                <w:szCs w:val="20"/>
+              </w:rPr>
+            </w:pPr>
+            <w:r>
+              <w:rPr>
+                <w:sz w:val="20"/>
+                <w:szCs w:val="20"/>
+              </w:rPr>
+              <w:t>Contact Input Validation</w:t>
+            </w:r>
+          </w:p>
+        </w:tc>
+        <w:tc>
+          <w:tcPr>
+            <w:tcW w:w="0" w:type="auto"/>
+          </w:tcPr>
+          <w:p>
+            <w:pPr>
+              <w:cnfStyle w:val="000000000000" w:firstRow="0" w:lastRow="0" w:firstColumn="0" w:lastColumn="0" w:oddVBand="0" w:evenVBand="0" w:oddHBand="0" w:evenHBand="0" w:firstRowFirstColumn="0" w:firstRowLastColumn="0" w:lastRowFirstColumn="0" w:lastRowLastColumn="0"/>
+              <w:rPr>
+                <w:sz w:val="20"/>
+                <w:szCs w:val="20"/>
+              </w:rPr>
+            </w:pPr>
+            <w:r>
+              <w:rPr>
+                <w:sz w:val="20"/>
+                <w:szCs w:val="20"/>
+              </w:rPr>
+              <w:t>Contact: "</w:t>
+            </w:r>
+            <w:proofErr w:type="gramStart"/>
+            <w:r>
+              <w:rPr>
+                <w:sz w:val="20"/>
+                <w:szCs w:val="20"/>
+              </w:rPr>
+              <w:t>invalid-email</w:t>
+            </w:r>
+            <w:proofErr w:type="gramEnd"/>
+            <w:r>
+              <w:rPr>
+                <w:sz w:val="20"/>
+                <w:szCs w:val="20"/>
+              </w:rPr>
+              <w:t>"</w:t>
+            </w:r>
+          </w:p>
+        </w:tc>
+        <w:tc>
+          <w:tcPr>
+            <w:tcW w:w="0" w:type="auto"/>
+          </w:tcPr>
+          <w:p>
+            <w:pPr>
+              <w:cnfStyle w:val="000000000000" w:firstRow="0" w:lastRow="0" w:firstColumn="0" w:lastColumn="0" w:oddVBand="0" w:evenVBand="0" w:oddHBand="0" w:evenHBand="0" w:firstRowFirstColumn="0" w:firstRowLastColumn="0" w:lastRowFirstColumn="0" w:lastRowLastColumn="0"/>
+              <w:rPr>
+                <w:sz w:val="20"/>
+                <w:szCs w:val="20"/>
+              </w:rPr>
+            </w:pPr>
+            <w:r>
+              <w:rPr>
+                <w:sz w:val="20"/>
+                <w:szCs w:val="20"/>
+              </w:rPr>
+              <w:t>Enter "Alex", "</w:t>
+            </w:r>
+            <w:proofErr w:type="gramStart"/>
+            <w:r>
+              <w:rPr>
+                <w:sz w:val="20"/>
+                <w:szCs w:val="20"/>
+              </w:rPr>
+              <w:t>invalid-email</w:t>
+            </w:r>
+            <w:proofErr w:type="gramEnd"/>
+            <w:r>
+              <w:rPr>
+                <w:sz w:val="20"/>
+                <w:szCs w:val="20"/>
+              </w:rPr>
+              <w:t>", "Weekends", tap 'Submit Registration'</w:t>
+            </w:r>
+          </w:p>
+        </w:tc>
+        <w:tc>
+          <w:tcPr>
+            <w:tcW w:w="0" w:type="auto"/>
+          </w:tcPr>
+          <w:p>
+            <w:pPr>
+              <w:cnfStyle w:val="000000000000" w:firstRow="0" w:lastRow="0" w:firstColumn="0" w:lastColumn="0" w:oddVBand="0" w:evenVBand="0" w:oddHBand="0" w:evenHBand="0" w:firstRowFirstColumn="0" w:firstRowLastColumn="0" w:lastRowFirstColumn="0" w:lastRowLastColumn="0"/>
+              <w:rPr>
+                <w:sz w:val="20"/>
+                <w:szCs w:val="20"/>
+              </w:rPr>
+            </w:pPr>
+            <w:r>
+              <w:rPr>
+                <w:sz w:val="20"/>
+                <w:szCs w:val="20"/>
+              </w:rPr>
+              <w:t xml:space="preserve">Validation fails; message displayed: </w:t>
+            </w:r>
+            <w:r>
+              <w:rPr>
+                <w:i/>
+                <w:iCs/>
+                <w:sz w:val="20"/>
+                <w:szCs w:val="20"/>
+              </w:rPr>
+              <w:t>"Please enter a valid email address or phone number."</w:t>
+            </w:r>
+          </w:p>
+        </w:tc>
+        <w:tc>
+          <w:tcPr>
+            <w:tcW w:w="0" w:type="auto"/>
+          </w:tcPr>
+          <w:p>
+            <w:pPr>
+              <w:cnfStyle w:val="000000000000" w:firstRow="0" w:lastRow="0" w:firstColumn="0" w:lastColumn="0" w:oddVBand="0" w:evenVBand="0" w:oddHBand="0" w:evenHBand="0" w:firstRowFirstColumn="0" w:firstRowLastColumn="0" w:lastRowFirstColumn="0" w:lastRowLastColumn="0"/>
+              <w:rPr>
+                <w:sz w:val="20"/>
+                <w:szCs w:val="20"/>
+              </w:rPr>
+            </w:pPr>
+            <w:r>
+              <w:rPr>
+                <w:sz w:val="20"/>
+                <w:szCs w:val="20"/>
+              </w:rPr>
+              <w:t>Submission blocked until valid format entered</w:t>
+            </w:r>
+          </w:p>
+        </w:tc>
+        <w:tc>
+          <w:tcPr>
+            <w:tcW w:w="0" w:type="auto"/>
+          </w:tcPr>
+          <w:p>
+            <w:pPr>
+              <w:cnfStyle w:val="000000000000" w:firstRow="0" w:lastRow="0" w:firstColumn="0" w:lastColumn="0" w:oddVBand="0" w:evenVBand="0" w:oddHBand="0" w:evenHBand="0" w:firstRowFirstColumn="0" w:firstRowLastColumn="0" w:lastRowFirstColumn="0" w:lastRowLastColumn="0"/>
+              <w:rPr>
+                <w:sz w:val="20"/>
+                <w:szCs w:val="20"/>
+              </w:rPr>
+            </w:pPr>
+          </w:p>
+        </w:tc>
+      </w:tr>
+      <w:tr>
+        <w:trPr>
+          <w:cnfStyle w:val="000000100000" w:firstRow="0" w:lastRow="0" w:firstColumn="0" w:lastColumn="0" w:oddVBand="0" w:evenVBand="0" w:oddHBand="1" w:evenHBand="0" w:firstRowFirstColumn="0" w:firstRowLastColumn="0" w:lastRowFirstColumn="0" w:lastRowLastColumn="0"/>
+        </w:trPr>
+        <w:tc>
+          <w:tcPr>
+            <w:cnfStyle w:val="001000000000" w:firstRow="0" w:lastRow="0" w:firstColumn="1" w:lastColumn="0" w:oddVBand="0" w:evenVBand="0" w:oddHBand="0" w:evenHBand="0" w:firstRowFirstColumn="0" w:firstRowLastColumn="0" w:lastRowFirstColumn="0" w:lastRowLastColumn="0"/>
+            <w:tcW w:w="0" w:type="auto"/>
+          </w:tcPr>
+          <w:p>
+            <w:pPr>
+              <w:rPr>
+                <w:b w:val="0"/>
+                <w:bCs w:val="0"/>
+                <w:sz w:val="20"/>
+                <w:szCs w:val="20"/>
+              </w:rPr>
+            </w:pPr>
+            <w:r>
+              <w:rPr>
+                <w:b w:val="0"/>
+                <w:bCs w:val="0"/>
+                <w:sz w:val="20"/>
+                <w:szCs w:val="20"/>
+              </w:rPr>
+              <w:t>TC-MAN-09</w:t>
+            </w:r>
+          </w:p>
+        </w:tc>
+        <w:tc>
+          <w:tcPr>
+            <w:tcW w:w="0" w:type="auto"/>
+          </w:tcPr>
+          <w:p>
+            <w:pPr>
+              <w:cnfStyle w:val="000000100000" w:firstRow="0" w:lastRow="0" w:firstColumn="0" w:lastColumn="0" w:oddVBand="0" w:evenVBand="0" w:oddHBand="1" w:evenHBand="0" w:firstRowFirstColumn="0" w:firstRowLastColumn="0" w:lastRowFirstColumn="0" w:lastRowLastColumn="0"/>
+              <w:rPr>
+                <w:sz w:val="20"/>
+                <w:szCs w:val="20"/>
+              </w:rPr>
+            </w:pPr>
+            <w:r>
+              <w:rPr>
+                <w:sz w:val="20"/>
+                <w:szCs w:val="20"/>
+              </w:rPr>
+              <w:t>05/08/2026</w:t>
+            </w:r>
+          </w:p>
+        </w:tc>
+        <w:tc>
+          <w:tcPr>
+            <w:tcW w:w="0" w:type="auto"/>
+          </w:tcPr>
+          <w:p>
+            <w:pPr>
+              <w:cnfStyle w:val="000000100000" w:firstRow="0" w:lastRow="0" w:firstColumn="0" w:lastColumn="0" w:oddVBand="0" w:evenVBand="0" w:oddHBand="1" w:evenHBand="0" w:firstRowFirstColumn="0" w:firstRowLastColumn="0" w:lastRowFirstColumn="0" w:lastRowLastColumn="0"/>
+              <w:rPr>
+                <w:sz w:val="20"/>
+                <w:szCs w:val="20"/>
+              </w:rPr>
+            </w:pPr>
+            <w:r>
+              <w:rPr>
+                <w:sz w:val="20"/>
+                <w:szCs w:val="20"/>
+              </w:rPr>
+              <w:t>CRUD: Create Record</w:t>
+            </w:r>
+          </w:p>
+        </w:tc>
+        <w:tc>
+          <w:tcPr>
+            <w:tcW w:w="0" w:type="auto"/>
+          </w:tcPr>
+          <w:p>
+            <w:pPr>
+              <w:cnfStyle w:val="000000100000" w:firstRow="0" w:lastRow="0" w:firstColumn="0" w:lastColumn="0" w:oddVBand="0" w:evenVBand="0" w:oddHBand="1" w:evenHBand="0" w:firstRowFirstColumn="0" w:firstRowLastColumn="0" w:lastRowFirstColumn="0" w:lastRowLastColumn="0"/>
+              <w:rPr>
+                <w:sz w:val="20"/>
+                <w:szCs w:val="20"/>
+              </w:rPr>
+            </w:pPr>
+            <w:r>
+              <w:rPr>
+                <w:sz w:val="20"/>
+                <w:szCs w:val="20"/>
+              </w:rPr>
+              <w:t>Name: "Alex Morgan", Contact: "alex.m@test.nz"</w:t>
+            </w:r>
+          </w:p>
+        </w:tc>
+        <w:tc>
+          <w:tcPr>
+            <w:tcW w:w="0" w:type="auto"/>
+          </w:tcPr>
+          <w:p>
+            <w:pPr>
+              <w:cnfStyle w:val="000000100000" w:firstRow="0" w:lastRow="0" w:firstColumn="0" w:lastColumn="0" w:oddVBand="0" w:evenVBand="0" w:oddHBand="1" w:evenHBand="0" w:firstRowFirstColumn="0" w:firstRowLastColumn="0" w:lastRowFirstColumn="0" w:lastRowLastColumn="0"/>
+              <w:rPr>
+                <w:sz w:val="20"/>
+                <w:szCs w:val="20"/>
+              </w:rPr>
+            </w:pPr>
+            <w:r>
+              <w:rPr>
+                <w:sz w:val="20"/>
+                <w:szCs w:val="20"/>
+              </w:rPr>
+              <w:t>Fill form, check consent, tap 'Submit Registration'</w:t>
+            </w:r>
+          </w:p>
+        </w:tc>
+        <w:tc>
+          <w:tcPr>
+            <w:tcW w:w="0" w:type="auto"/>
+          </w:tcPr>
+          <w:p>
+            <w:pPr>
+              <w:cnfStyle w:val="000000100000" w:firstRow="0" w:lastRow="0" w:firstColumn="0" w:lastColumn="0" w:oddVBand="0" w:evenVBand="0" w:oddHBand="1" w:evenHBand="0" w:firstRowFirstColumn="0" w:firstRowLastColumn="0" w:lastRowFirstColumn="0" w:lastRowLastColumn="0"/>
+              <w:rPr>
+                <w:sz w:val="20"/>
+                <w:szCs w:val="20"/>
+              </w:rPr>
+            </w:pPr>
+            <w:r>
+              <w:rPr>
+                <w:sz w:val="20"/>
+                <w:szCs w:val="20"/>
+              </w:rPr>
+              <w:t xml:space="preserve">Record inserted into SQLite; app redirects to </w:t>
+            </w:r>
+            <w:proofErr w:type="spellStart"/>
+            <w:r>
+              <w:rPr>
+                <w:sz w:val="20"/>
+                <w:szCs w:val="20"/>
+              </w:rPr>
+              <w:t>MyRegistrationsPage</w:t>
+            </w:r>
+            <w:proofErr w:type="spellEnd"/>
+          </w:p>
+        </w:tc>
+        <w:tc>
+          <w:tcPr>
+            <w:tcW w:w="0" w:type="auto"/>
+          </w:tcPr>
+          <w:p>
+            <w:pPr>
+              <w:cnfStyle w:val="000000100000" w:firstRow="0" w:lastRow="0" w:firstColumn="0" w:lastColumn="0" w:oddVBand="0" w:evenVBand="0" w:oddHBand="1" w:evenHBand="0" w:firstRowFirstColumn="0" w:firstRowLastColumn="0" w:lastRowFirstColumn="0" w:lastRowLastColumn="0"/>
+              <w:rPr>
+                <w:sz w:val="20"/>
+                <w:szCs w:val="20"/>
+              </w:rPr>
+            </w:pPr>
+            <w:r>
+              <w:rPr>
+                <w:sz w:val="20"/>
+                <w:szCs w:val="20"/>
+              </w:rPr>
+              <w:t xml:space="preserve">Record saved successfully and visible in </w:t>
+            </w:r>
+            <w:proofErr w:type="spellStart"/>
+            <w:r>
+              <w:rPr>
+                <w:sz w:val="20"/>
+                <w:szCs w:val="20"/>
+              </w:rPr>
+              <w:t>CollectionView</w:t>
+            </w:r>
+            <w:proofErr w:type="spellEnd"/>
+          </w:p>
+        </w:tc>
+        <w:tc>
+          <w:tcPr>
+            <w:tcW w:w="0" w:type="auto"/>
+          </w:tcPr>
+          <w:p>
+            <w:pPr>
+              <w:cnfStyle w:val="000000100000" w:firstRow="0" w:lastRow="0" w:firstColumn="0" w:lastColumn="0" w:oddVBand="0" w:evenVBand="0" w:oddHBand="1" w:evenHBand="0" w:firstRowFirstColumn="0" w:firstRowLastColumn="0" w:lastRowFirstColumn="0" w:lastRowLastColumn="0"/>
+              <w:rPr>
+                <w:sz w:val="20"/>
+                <w:szCs w:val="20"/>
+              </w:rPr>
+            </w:pPr>
+            <w:r>
+              <w:rPr>
+                <w:sz w:val="20"/>
+                <w:szCs w:val="20"/>
+              </w:rPr>
+              <w:t>PASS</w:t>
+            </w:r>
+          </w:p>
+        </w:tc>
+      </w:tr>
+      <w:tr>
+        <w:tc>
+          <w:tcPr>
+            <w:cnfStyle w:val="001000000000" w:firstRow="0" w:lastRow="0" w:firstColumn="1" w:lastColumn="0" w:oddVBand="0" w:evenVBand="0" w:oddHBand="0" w:evenHBand="0" w:firstRowFirstColumn="0" w:firstRowLastColumn="0" w:lastRowFirstColumn="0" w:lastRowLastColumn="0"/>
+            <w:tcW w:w="0" w:type="auto"/>
+          </w:tcPr>
+          <w:p>
+            <w:pPr>
+              <w:rPr>
+                <w:b w:val="0"/>
+                <w:bCs w:val="0"/>
+                <w:sz w:val="20"/>
+                <w:szCs w:val="20"/>
+              </w:rPr>
+            </w:pPr>
+            <w:r>
+              <w:rPr>
+                <w:b w:val="0"/>
+                <w:bCs w:val="0"/>
+                <w:sz w:val="20"/>
+                <w:szCs w:val="20"/>
+              </w:rPr>
+              <w:t>TC-MAN-10</w:t>
+            </w:r>
+          </w:p>
+        </w:tc>
+        <w:tc>
+          <w:tcPr>
+            <w:tcW w:w="0" w:type="auto"/>
+          </w:tcPr>
+          <w:p>
+            <w:pPr>
+              <w:cnfStyle w:val="000000000000" w:firstRow="0" w:lastRow="0" w:firstColumn="0" w:lastColumn="0" w:oddVBand="0" w:evenVBand="0" w:oddHBand="0" w:evenHBand="0" w:firstRowFirstColumn="0" w:firstRowLastColumn="0" w:lastRowFirstColumn="0" w:lastRowLastColumn="0"/>
+              <w:rPr>
+                <w:sz w:val="20"/>
+                <w:szCs w:val="20"/>
+              </w:rPr>
+            </w:pPr>
+            <w:r>
+              <w:rPr>
+                <w:rFonts w:ascii="Arial" w:hAnsi="Arial" w:cs="Arial"/>
+                <w:sz w:val="20"/>
+                <w:szCs w:val="20"/>
+              </w:rPr>
+              <w:t>05/08/2026</w:t>
+            </w:r>
+          </w:p>
+        </w:tc>
+        <w:tc>
+          <w:tcPr>
+            <w:tcW w:w="0" w:type="auto"/>
+          </w:tcPr>
+          <w:p>
+            <w:pPr>
+              <w:cnfStyle w:val="000000000000" w:firstRow="0" w:lastRow="0" w:firstColumn="0" w:lastColumn="0" w:oddVBand="0" w:evenVBand="0" w:oddHBand="0" w:evenHBand="0" w:firstRowFirstColumn="0" w:firstRowLastColumn="0" w:lastRowFirstColumn="0" w:lastRowLastColumn="0"/>
+              <w:rPr>
+                <w:sz w:val="20"/>
+                <w:szCs w:val="20"/>
+              </w:rPr>
+            </w:pPr>
+            <w:r>
+              <w:rPr>
+                <w:rFonts w:ascii="Arial" w:hAnsi="Arial" w:cs="Arial"/>
+                <w:sz w:val="20"/>
+                <w:szCs w:val="20"/>
+              </w:rPr>
+              <w:t>CRUD: Read Record</w:t>
+            </w:r>
+          </w:p>
+        </w:tc>
+        <w:tc>
+          <w:tcPr>
+            <w:tcW w:w="0" w:type="auto"/>
+          </w:tcPr>
+          <w:p>
+            <w:pPr>
+              <w:cnfStyle w:val="000000000000" w:firstRow="0" w:lastRow="0" w:firstColumn="0" w:lastColumn="0" w:oddVBand="0" w:evenVBand="0" w:oddHBand="0" w:evenHBand="0" w:firstRowFirstColumn="0" w:firstRowLastColumn="0" w:lastRowFirstColumn="0" w:lastRowLastColumn="0"/>
+              <w:rPr>
+                <w:sz w:val="20"/>
+                <w:szCs w:val="20"/>
+              </w:rPr>
+            </w:pPr>
+            <w:proofErr w:type="spellStart"/>
+            <w:r>
+              <w:rPr>
+                <w:rFonts w:ascii="Arial" w:hAnsi="Arial" w:cs="Arial"/>
+                <w:sz w:val="20"/>
+                <w:szCs w:val="20"/>
+              </w:rPr>
+              <w:t>CollectionView</w:t>
+            </w:r>
+            <w:proofErr w:type="spellEnd"/>
+            <w:r>
+              <w:rPr>
+                <w:rFonts w:ascii="Arial" w:hAnsi="Arial" w:cs="Arial"/>
+                <w:sz w:val="20"/>
+                <w:szCs w:val="20"/>
+              </w:rPr>
+              <w:t xml:space="preserve"> Display</w:t>
+            </w:r>
+          </w:p>
+        </w:tc>
+        <w:tc>
+          <w:tcPr>
+            <w:tcW w:w="0" w:type="auto"/>
+          </w:tcPr>
+          <w:p>
+            <w:pPr>
+              <w:cnfStyle w:val="000000000000" w:firstRow="0" w:lastRow="0" w:firstColumn="0" w:lastColumn="0" w:oddVBand="0" w:evenVBand="0" w:oddHBand="0" w:evenHBand="0" w:firstRowFirstColumn="0" w:firstRowLastColumn="0" w:lastRowFirstColumn="0" w:lastRowLastColumn="0"/>
+              <w:rPr>
+                <w:sz w:val="20"/>
+                <w:szCs w:val="20"/>
+              </w:rPr>
+            </w:pPr>
+            <w:r>
+              <w:rPr>
+                <w:rFonts w:ascii="Arial" w:hAnsi="Arial" w:cs="Arial"/>
+                <w:sz w:val="20"/>
+                <w:szCs w:val="20"/>
+              </w:rPr>
+              <w:t xml:space="preserve">Navigate to </w:t>
+            </w:r>
+            <w:proofErr w:type="spellStart"/>
+            <w:r>
+              <w:rPr>
+                <w:rFonts w:ascii="Arial" w:hAnsi="Arial" w:cs="Arial"/>
+                <w:sz w:val="20"/>
+                <w:szCs w:val="20"/>
+              </w:rPr>
+              <w:t>MyRegistrationsPage</w:t>
+            </w:r>
+            <w:proofErr w:type="spellEnd"/>
+          </w:p>
+        </w:tc>
+        <w:tc>
+          <w:tcPr>
+            <w:tcW w:w="0" w:type="auto"/>
+          </w:tcPr>
+          <w:p>
+            <w:pPr>
+              <w:cnfStyle w:val="000000000000" w:firstRow="0" w:lastRow="0" w:firstColumn="0" w:lastColumn="0" w:oddVBand="0" w:evenVBand="0" w:oddHBand="0" w:evenHBand="0" w:firstRowFirstColumn="0" w:firstRowLastColumn="0" w:lastRowFirstColumn="0" w:lastRowLastColumn="0"/>
+              <w:rPr>
+                <w:sz w:val="20"/>
+                <w:szCs w:val="20"/>
+              </w:rPr>
+            </w:pPr>
+            <w:r>
+              <w:rPr>
+                <w:rFonts w:ascii="Arial" w:hAnsi="Arial" w:cs="Arial"/>
+                <w:sz w:val="20"/>
+                <w:szCs w:val="20"/>
+              </w:rPr>
+              <w:t>Displays all user expressions of interest stored in SQLite</w:t>
+            </w:r>
+          </w:p>
+        </w:tc>
+        <w:tc>
+          <w:tcPr>
+            <w:tcW w:w="0" w:type="auto"/>
+          </w:tcPr>
+          <w:p>
+            <w:pPr>
+              <w:cnfStyle w:val="000000000000" w:firstRow="0" w:lastRow="0" w:firstColumn="0" w:lastColumn="0" w:oddVBand="0" w:evenVBand="0" w:oddHBand="0" w:evenHBand="0" w:firstRowFirstColumn="0" w:firstRowLastColumn="0" w:lastRowFirstColumn="0" w:lastRowLastColumn="0"/>
+              <w:rPr>
+                <w:sz w:val="20"/>
+                <w:szCs w:val="20"/>
+              </w:rPr>
+            </w:pPr>
+            <w:r>
+              <w:rPr>
+                <w:rFonts w:ascii="Arial" w:hAnsi="Arial" w:cs="Arial"/>
+                <w:sz w:val="20"/>
+                <w:szCs w:val="20"/>
+              </w:rPr>
+              <w:t>Card shows applicant name, opportunity title, and availability</w:t>
+            </w:r>
+          </w:p>
+        </w:tc>
+        <w:tc>
+          <w:tcPr>
+            <w:tcW w:w="0" w:type="auto"/>
+          </w:tcPr>
+          <w:p>
+            <w:pPr>
+              <w:cnfStyle w:val="000000000000" w:firstRow="0" w:lastRow="0" w:firstColumn="0" w:lastColumn="0" w:oddVBand="0" w:evenVBand="0" w:oddHBand="0" w:evenHBand="0" w:firstRowFirstColumn="0" w:firstRowLastColumn="0" w:lastRowFirstColumn="0" w:lastRowLastColumn="0"/>
+              <w:rPr>
+                <w:sz w:val="20"/>
+                <w:szCs w:val="20"/>
+              </w:rPr>
+            </w:pPr>
+            <w:r>
+              <w:rPr>
+                <w:rFonts w:ascii="Arial" w:hAnsi="Arial" w:cs="Arial"/>
+                <w:sz w:val="20"/>
+                <w:szCs w:val="20"/>
+              </w:rPr>
+              <w:t>PASS</w:t>
+            </w:r>
+          </w:p>
+        </w:tc>
+      </w:tr>
+      <w:tr>
+        <w:trPr>
+          <w:cnfStyle w:val="000000100000" w:firstRow="0" w:lastRow="0" w:firstColumn="0" w:lastColumn="0" w:oddVBand="0" w:evenVBand="0" w:oddHBand="1" w:evenHBand="0" w:firstRowFirstColumn="0" w:firstRowLastColumn="0" w:lastRowFirstColumn="0" w:lastRowLastColumn="0"/>
+        </w:trPr>
+        <w:tc>
+          <w:tcPr>
+            <w:cnfStyle w:val="001000000000" w:firstRow="0" w:lastRow="0" w:firstColumn="1" w:lastColumn="0" w:oddVBand="0" w:evenVBand="0" w:oddHBand="0" w:evenHBand="0" w:firstRowFirstColumn="0" w:firstRowLastColumn="0" w:lastRowFirstColumn="0" w:lastRowLastColumn="0"/>
+            <w:tcW w:w="0" w:type="auto"/>
+          </w:tcPr>
+          <w:p>
+            <w:pPr>
+              <w:rPr>
+                <w:b w:val="0"/>
+                <w:bCs w:val="0"/>
+                <w:sz w:val="20"/>
+                <w:szCs w:val="20"/>
+              </w:rPr>
+            </w:pPr>
+            <w:r>
+              <w:rPr>
+                <w:rFonts w:ascii="Arial" w:hAnsi="Arial" w:cs="Arial"/>
+                <w:b w:val="0"/>
+                <w:bCs w:val="0"/>
+                <w:sz w:val="20"/>
+                <w:szCs w:val="20"/>
+              </w:rPr>
+              <w:t>TC-MAN-11</w:t>
+            </w:r>
+          </w:p>
+        </w:tc>
+        <w:tc>
+          <w:tcPr>
+            <w:tcW w:w="0" w:type="auto"/>
+          </w:tcPr>
+          <w:p>
+            <w:pPr>
+              <w:cnfStyle w:val="000000100000" w:firstRow="0" w:lastRow="0" w:firstColumn="0" w:lastColumn="0" w:oddVBand="0" w:evenVBand="0" w:oddHBand="1" w:evenHBand="0" w:firstRowFirstColumn="0" w:firstRowLastColumn="0" w:lastRowFirstColumn="0" w:lastRowLastColumn="0"/>
+              <w:rPr>
+                <w:sz w:val="20"/>
+                <w:szCs w:val="20"/>
+              </w:rPr>
+            </w:pPr>
+            <w:r>
+              <w:rPr>
+                <w:sz w:val="20"/>
+                <w:szCs w:val="20"/>
+              </w:rPr>
+              <w:t>05/08/2026</w:t>
+            </w:r>
+          </w:p>
+        </w:tc>
+        <w:tc>
+          <w:tcPr>
+            <w:tcW w:w="0" w:type="auto"/>
+          </w:tcPr>
+          <w:p>
+            <w:pPr>
+              <w:cnfStyle w:val="000000100000" w:firstRow="0" w:lastRow="0" w:firstColumn="0" w:lastColumn="0" w:oddVBand="0" w:evenVBand="0" w:oddHBand="1" w:evenHBand="0" w:firstRowFirstColumn="0" w:firstRowLastColumn="0" w:lastRowFirstColumn="0" w:lastRowLastColumn="0"/>
+              <w:rPr>
+                <w:sz w:val="20"/>
+                <w:szCs w:val="20"/>
+              </w:rPr>
+            </w:pPr>
+            <w:r>
+              <w:rPr>
+                <w:sz w:val="20"/>
+                <w:szCs w:val="20"/>
+              </w:rPr>
+              <w:t>CRUD: Update Record</w:t>
+            </w:r>
+          </w:p>
+        </w:tc>
+        <w:tc>
+          <w:tcPr>
+            <w:tcW w:w="0" w:type="auto"/>
+          </w:tcPr>
+          <w:p>
+            <w:pPr>
+              <w:cnfStyle w:val="000000100000" w:firstRow="0" w:lastRow="0" w:firstColumn="0" w:lastColumn="0" w:oddVBand="0" w:evenVBand="0" w:oddHBand="1" w:evenHBand="0" w:firstRowFirstColumn="0" w:firstRowLastColumn="0" w:lastRowFirstColumn="0" w:lastRowLastColumn="0"/>
+              <w:rPr>
+                <w:sz w:val="20"/>
+                <w:szCs w:val="20"/>
+              </w:rPr>
+            </w:pPr>
+            <w:r>
+              <w:rPr>
+                <w:rFonts w:ascii="Arial" w:hAnsi="Arial" w:cs="Arial"/>
+                <w:sz w:val="20"/>
+                <w:szCs w:val="20"/>
+              </w:rPr>
+              <w:t>   </w:t>
+            </w:r>
+            <w:r>
+              <w:rPr>
+                <w:rFonts w:ascii="Arial" w:hAnsi="Arial" w:cs="Arial"/>
+                <w:sz w:val="20"/>
+                <w:szCs w:val="20"/>
+              </w:rPr>
+              <w:t>Availability: "Weekends Only"</w:t>
+            </w:r>
+          </w:p>
+        </w:tc>
+        <w:tc>
+          <w:tcPr>
+            <w:tcW w:w="0" w:type="auto"/>
+          </w:tcPr>
+          <w:p>
+            <w:pPr>
+              <w:cnfStyle w:val="000000100000" w:firstRow="0" w:lastRow="0" w:firstColumn="0" w:lastColumn="0" w:oddVBand="0" w:evenVBand="0" w:oddHBand="1" w:evenHBand="0" w:firstRowFirstColumn="0" w:firstRowLastColumn="0" w:lastRowFirstColumn="0" w:lastRowLastColumn="0"/>
+              <w:rPr>
+                <w:rFonts w:ascii="Arial" w:hAnsi="Arial" w:cs="Arial"/>
+                <w:sz w:val="20"/>
+                <w:szCs w:val="20"/>
+              </w:rPr>
+            </w:pPr>
+            <w:r>
+              <w:rPr>
+                <w:rFonts w:ascii="Arial" w:hAnsi="Arial" w:cs="Arial"/>
+                <w:sz w:val="20"/>
+                <w:szCs w:val="20"/>
+              </w:rPr>
+              <w:t>   </w:t>
+            </w:r>
+            <w:r>
+              <w:rPr>
+                <w:rFonts w:ascii="Arial" w:hAnsi="Arial" w:cs="Arial"/>
+                <w:sz w:val="20"/>
+                <w:szCs w:val="20"/>
+              </w:rPr>
+              <w:t xml:space="preserve">Select registration </w:t>
+            </w:r>
+            <m:oMath>
+              <m:r>
+                <w:rPr>
+                  <w:rFonts w:ascii="Cambria Math" w:hAnsi="Cambria Math" w:cs="Arial"/>
+                  <w:sz w:val="20"/>
+                  <w:szCs w:val="20"/>
+                </w:rPr>
+                <m:t>→</m:t>
+              </m:r>
+            </m:oMath>
+            <w:r>
+              <w:rPr>
+                <w:rFonts w:ascii="Arial" w:hAnsi="Arial" w:cs="Arial"/>
+                <w:sz w:val="20"/>
+                <w:szCs w:val="20"/>
+              </w:rPr>
+              <w:t xml:space="preserve"> Edit fields </w:t>
+            </w:r>
+            <m:oMath>
+              <m:r>
+                <w:rPr>
+                  <w:rFonts w:ascii="Cambria Math" w:hAnsi="Cambria Math" w:cs="Arial"/>
+                  <w:sz w:val="20"/>
+                  <w:szCs w:val="20"/>
+                </w:rPr>
+                <m:t>→</m:t>
+              </m:r>
+            </m:oMath>
+            <w:r>
+              <w:rPr>
+                <w:rFonts w:ascii="Arial" w:hAnsi="Arial" w:cs="Arial"/>
+                <w:sz w:val="20"/>
+                <w:szCs w:val="20"/>
+              </w:rPr>
+              <w:t xml:space="preserve"> Tap 'Update Details'</w:t>
+            </w:r>
+          </w:p>
+          <w:p>
+            <w:pPr>
+              <w:cnfStyle w:val="000000100000" w:firstRow="0" w:lastRow="0" w:firstColumn="0" w:lastColumn="0" w:oddVBand="0" w:evenVBand="0" w:oddHBand="1" w:evenHBand="0" w:firstRowFirstColumn="0" w:firstRowLastColumn="0" w:lastRowFirstColumn="0" w:lastRowLastColumn="0"/>
+              <w:rPr>
+                <w:sz w:val="20"/>
+                <w:szCs w:val="20"/>
+              </w:rPr>
+            </w:pPr>
+          </w:p>
+        </w:tc>
+        <w:tc>
+          <w:tcPr>
+            <w:tcW w:w="0" w:type="auto"/>
+          </w:tcPr>
+          <w:p>
+            <w:pPr>
+              <w:cnfStyle w:val="000000100000" w:firstRow="0" w:lastRow="0" w:firstColumn="0" w:lastColumn="0" w:oddVBand="0" w:evenVBand="0" w:oddHBand="1" w:evenHBand="0" w:firstRowFirstColumn="0" w:firstRowLastColumn="0" w:lastRowFirstColumn="0" w:lastRowLastColumn="0"/>
+              <w:rPr>
+                <w:sz w:val="20"/>
+                <w:szCs w:val="20"/>
+              </w:rPr>
+            </w:pPr>
+            <w:r>
+              <w:rPr>
+                <w:rFonts w:ascii="Arial" w:hAnsi="Arial" w:cs="Arial"/>
+                <w:sz w:val="20"/>
+                <w:szCs w:val="20"/>
+              </w:rPr>
+              <w:t>   </w:t>
+            </w:r>
+            <w:r>
+              <w:rPr>
+                <w:rFonts w:ascii="Arial" w:hAnsi="Arial" w:cs="Arial"/>
+                <w:sz w:val="20"/>
+                <w:szCs w:val="20"/>
+              </w:rPr>
+              <w:t>Record updated in SQLite database; user returned to list</w:t>
+            </w:r>
+          </w:p>
+        </w:tc>
+        <w:tc>
+          <w:tcPr>
+            <w:tcW w:w="0" w:type="auto"/>
+          </w:tcPr>
+          <w:p>
+            <w:pPr>
+              <w:cnfStyle w:val="000000100000" w:firstRow="0" w:lastRow="0" w:firstColumn="0" w:lastColumn="0" w:oddVBand="0" w:evenVBand="0" w:oddHBand="1" w:evenHBand="0" w:firstRowFirstColumn="0" w:firstRowLastColumn="0" w:lastRowFirstColumn="0" w:lastRowLastColumn="0"/>
+              <w:rPr>
+                <w:sz w:val="20"/>
+                <w:szCs w:val="20"/>
+              </w:rPr>
+            </w:pPr>
+            <w:r>
+              <w:rPr>
+                <w:rFonts w:ascii="Arial" w:hAnsi="Arial" w:cs="Arial"/>
+                <w:sz w:val="20"/>
+                <w:szCs w:val="20"/>
+              </w:rPr>
+              <w:t>   </w:t>
+            </w:r>
+            <w:r>
+              <w:rPr>
+                <w:rFonts w:ascii="Arial" w:hAnsi="Arial" w:cs="Arial"/>
+                <w:sz w:val="20"/>
+                <w:szCs w:val="20"/>
+              </w:rPr>
+              <w:t>Updated availability string displayed in UI immediately</w:t>
+            </w:r>
+          </w:p>
+        </w:tc>
+        <w:tc>
+          <w:tcPr>
+            <w:tcW w:w="0" w:type="auto"/>
+          </w:tcPr>
+          <w:p>
+            <w:pPr>
+              <w:cnfStyle w:val="000000100000" w:firstRow="0" w:lastRow="0" w:firstColumn="0" w:lastColumn="0" w:oddVBand="0" w:evenVBand="0" w:oddHBand="1" w:evenHBand="0" w:firstRowFirstColumn="0" w:firstRowLastColumn="0" w:lastRowFirstColumn="0" w:lastRowLastColumn="0"/>
+              <w:rPr>
+                <w:sz w:val="20"/>
+                <w:szCs w:val="20"/>
+              </w:rPr>
+            </w:pPr>
+            <w:r>
+              <w:rPr>
+                <w:rFonts w:ascii="Arial" w:hAnsi="Arial" w:cs="Arial"/>
+                <w:sz w:val="20"/>
+                <w:szCs w:val="20"/>
+              </w:rPr>
+              <w:t xml:space="preserve">    </w:t>
+            </w:r>
+            <w:r>
+              <w:rPr>
+                <w:rFonts w:ascii="Arial" w:hAnsi="Arial" w:cs="Arial"/>
+                <w:sz w:val="20"/>
+                <w:szCs w:val="20"/>
+              </w:rPr>
+              <w:t>PASS</w:t>
+            </w:r>
+          </w:p>
+        </w:tc>
+      </w:tr>
+      <w:tr>
+        <w:tc>
+          <w:tcPr>
+            <w:cnfStyle w:val="001000000000" w:firstRow="0" w:lastRow="0" w:firstColumn="1" w:lastColumn="0" w:oddVBand="0" w:evenVBand="0" w:oddHBand="0" w:evenHBand="0" w:firstRowFirstColumn="0" w:firstRowLastColumn="0" w:lastRowFirstColumn="0" w:lastRowLastColumn="0"/>
+            <w:tcW w:w="0" w:type="auto"/>
+          </w:tcPr>
+          <w:p>
+            <w:pPr>
+              <w:rPr>
+                <w:b w:val="0"/>
+                <w:bCs w:val="0"/>
+                <w:sz w:val="20"/>
+                <w:szCs w:val="20"/>
+              </w:rPr>
+            </w:pPr>
+            <w:r>
+              <w:rPr>
+                <w:b w:val="0"/>
+                <w:bCs w:val="0"/>
+                <w:sz w:val="20"/>
+                <w:szCs w:val="20"/>
+              </w:rPr>
+              <w:t>TC-MAN-12</w:t>
+            </w:r>
+          </w:p>
+        </w:tc>
+        <w:tc>
+          <w:tcPr>
+            <w:tcW w:w="0" w:type="auto"/>
+          </w:tcPr>
+          <w:p>
+            <w:pPr>
+              <w:cnfStyle w:val="000000000000" w:firstRow="0" w:lastRow="0" w:firstColumn="0" w:lastColumn="0" w:oddVBand="0" w:evenVBand="0" w:oddHBand="0" w:evenHBand="0" w:firstRowFirstColumn="0" w:firstRowLastColumn="0" w:lastRowFirstColumn="0" w:lastRowLastColumn="0"/>
+              <w:rPr>
+                <w:sz w:val="20"/>
+                <w:szCs w:val="20"/>
+              </w:rPr>
+            </w:pPr>
+            <w:r>
+              <w:rPr>
+                <w:sz w:val="20"/>
+                <w:szCs w:val="20"/>
+              </w:rPr>
+              <w:t>05/08/2026</w:t>
+            </w:r>
+          </w:p>
+        </w:tc>
+        <w:tc>
+          <w:tcPr>
+            <w:tcW w:w="0" w:type="auto"/>
+          </w:tcPr>
+          <w:p>
+            <w:pPr>
+              <w:cnfStyle w:val="000000000000" w:firstRow="0" w:lastRow="0" w:firstColumn="0" w:lastColumn="0" w:oddVBand="0" w:evenVBand="0" w:oddHBand="0" w:evenHBand="0" w:firstRowFirstColumn="0" w:firstRowLastColumn="0" w:lastRowFirstColumn="0" w:lastRowLastColumn="0"/>
+              <w:rPr>
+                <w:sz w:val="20"/>
+                <w:szCs w:val="20"/>
+              </w:rPr>
+            </w:pPr>
+            <w:r>
+              <w:rPr>
+                <w:sz w:val="20"/>
+                <w:szCs w:val="20"/>
+              </w:rPr>
+              <w:t>CRUD: Delete Confirmation</w:t>
+            </w:r>
+          </w:p>
+        </w:tc>
+        <w:tc>
+          <w:tcPr>
+            <w:tcW w:w="0" w:type="auto"/>
+          </w:tcPr>
+          <w:p>
+            <w:pPr>
+              <w:cnfStyle w:val="000000000000" w:firstRow="0" w:lastRow="0" w:firstColumn="0" w:lastColumn="0" w:oddVBand="0" w:evenVBand="0" w:oddHBand="0" w:evenHBand="0" w:firstRowFirstColumn="0" w:firstRowLastColumn="0" w:lastRowFirstColumn="0" w:lastRowLastColumn="0"/>
+              <w:rPr>
+                <w:sz w:val="20"/>
+                <w:szCs w:val="20"/>
+              </w:rPr>
+            </w:pPr>
+            <w:r>
+              <w:rPr>
+                <w:sz w:val="20"/>
+                <w:szCs w:val="20"/>
+              </w:rPr>
+              <w:t>Action: Cancel Registration</w:t>
+            </w:r>
+          </w:p>
+        </w:tc>
+        <w:tc>
+          <w:tcPr>
+            <w:tcW w:w="0" w:type="auto"/>
+          </w:tcPr>
+          <w:p>
+            <w:pPr>
+              <w:cnfStyle w:val="000000000000" w:firstRow="0" w:lastRow="0" w:firstColumn="0" w:lastColumn="0" w:oddVBand="0" w:evenVBand="0" w:oddHBand="0" w:evenHBand="0" w:firstRowFirstColumn="0" w:firstRowLastColumn="0" w:lastRowFirstColumn="0" w:lastRowLastColumn="0"/>
+              <w:rPr>
+                <w:sz w:val="20"/>
+                <w:szCs w:val="20"/>
+              </w:rPr>
+            </w:pPr>
+            <w:r>
+              <w:rPr>
+                <w:sz w:val="20"/>
+                <w:szCs w:val="20"/>
+              </w:rPr>
+              <w:t xml:space="preserve">Tap 'Cancel Registration' button on </w:t>
+            </w:r>
+            <w:proofErr w:type="spellStart"/>
+            <w:r>
+              <w:rPr>
+                <w:sz w:val="20"/>
+                <w:szCs w:val="20"/>
+              </w:rPr>
+              <w:t>EditRegistrationPage</w:t>
+            </w:r>
+            <w:proofErr w:type="spellEnd"/>
+          </w:p>
+        </w:tc>
+        <w:tc>
+          <w:tcPr>
+            <w:tcW w:w="0" w:type="auto"/>
+          </w:tcPr>
+          <w:p>
+            <w:pPr>
+              <w:cnfStyle w:val="000000000000" w:firstRow="0" w:lastRow="0" w:firstColumn="0" w:lastColumn="0" w:oddVBand="0" w:evenVBand="0" w:oddHBand="0" w:evenHBand="0" w:firstRowFirstColumn="0" w:firstRowLastColumn="0" w:lastRowFirstColumn="0" w:lastRowLastColumn="0"/>
+              <w:rPr>
+                <w:sz w:val="20"/>
+                <w:szCs w:val="20"/>
+              </w:rPr>
+            </w:pPr>
+            <w:r>
+              <w:rPr>
+                <w:sz w:val="20"/>
+                <w:szCs w:val="20"/>
+              </w:rPr>
+              <w:t xml:space="preserve">Confirmation dialog displayed: </w:t>
+            </w:r>
+            <w:r>
+              <w:rPr>
+                <w:i/>
+                <w:iCs/>
+                <w:sz w:val="20"/>
+                <w:szCs w:val="20"/>
+              </w:rPr>
+              <w:t>"Are you sure you want to cancel...?"</w:t>
+            </w:r>
+          </w:p>
+        </w:tc>
+        <w:tc>
+          <w:tcPr>
+            <w:tcW w:w="0" w:type="auto"/>
+          </w:tcPr>
+          <w:p>
+            <w:pPr>
+              <w:cnfStyle w:val="000000000000" w:firstRow="0" w:lastRow="0" w:firstColumn="0" w:lastColumn="0" w:oddVBand="0" w:evenVBand="0" w:oddHBand="0" w:evenHBand="0" w:firstRowFirstColumn="0" w:firstRowLastColumn="0" w:lastRowFirstColumn="0" w:lastRowLastColumn="0"/>
+              <w:rPr>
+                <w:sz w:val="20"/>
+                <w:szCs w:val="20"/>
+              </w:rPr>
+            </w:pPr>
+            <w:r>
+              <w:rPr>
+                <w:sz w:val="20"/>
+                <w:szCs w:val="20"/>
+              </w:rPr>
+              <w:t>Dialog prompt appeared asking for user confirmation</w:t>
+            </w:r>
+          </w:p>
+        </w:tc>
+        <w:tc>
+          <w:tcPr>
+            <w:tcW w:w="0" w:type="auto"/>
+          </w:tcPr>
+          <w:p>
+            <w:pPr>
+              <w:cnfStyle w:val="000000000000" w:firstRow="0" w:lastRow="0" w:firstColumn="0" w:lastColumn="0" w:oddVBand="0" w:evenVBand="0" w:oddHBand="0" w:evenHBand="0" w:firstRowFirstColumn="0" w:firstRowLastColumn="0" w:lastRowFirstColumn="0" w:lastRowLastColumn="0"/>
+              <w:rPr>
+                <w:sz w:val="20"/>
+                <w:szCs w:val="20"/>
+              </w:rPr>
+            </w:pPr>
+            <w:r>
+              <w:rPr>
+                <w:sz w:val="20"/>
+                <w:szCs w:val="20"/>
+              </w:rPr>
+              <w:t>PASS</w:t>
+            </w:r>
+          </w:p>
+        </w:tc>
+      </w:tr>
+      <w:tr>
+        <w:trPr>
+          <w:cnfStyle w:val="000000100000" w:firstRow="0" w:lastRow="0" w:firstColumn="0" w:lastColumn="0" w:oddVBand="0" w:evenVBand="0" w:oddHBand="1" w:evenHBand="0" w:firstRowFirstColumn="0" w:firstRowLastColumn="0" w:lastRowFirstColumn="0" w:lastRowLastColumn="0"/>
+        </w:trPr>
+        <w:tc>
+          <w:tcPr>
+            <w:cnfStyle w:val="001000000000" w:firstRow="0" w:lastRow="0" w:firstColumn="1" w:lastColumn="0" w:oddVBand="0" w:evenVBand="0" w:oddHBand="0" w:evenHBand="0" w:firstRowFirstColumn="0" w:firstRowLastColumn="0" w:lastRowFirstColumn="0" w:lastRowLastColumn="0"/>
+            <w:tcW w:w="0" w:type="auto"/>
+          </w:tcPr>
+          <w:p>
+            <w:pPr>
+              <w:rPr>
+                <w:b w:val="0"/>
+                <w:bCs w:val="0"/>
+                <w:sz w:val="20"/>
+                <w:szCs w:val="20"/>
+              </w:rPr>
+            </w:pPr>
+            <w:r>
+              <w:rPr>
+                <w:b w:val="0"/>
+                <w:bCs w:val="0"/>
+                <w:sz w:val="20"/>
+                <w:szCs w:val="20"/>
+              </w:rPr>
+              <w:t>TC-MAN-13</w:t>
+            </w:r>
+          </w:p>
+        </w:tc>
+        <w:tc>
+          <w:tcPr>
+            <w:tcW w:w="0" w:type="auto"/>
+          </w:tcPr>
+          <w:p>
+            <w:pPr>
+              <w:cnfStyle w:val="000000100000" w:firstRow="0" w:lastRow="0" w:firstColumn="0" w:lastColumn="0" w:oddVBand="0" w:evenVBand="0" w:oddHBand="1" w:evenHBand="0" w:firstRowFirstColumn="0" w:firstRowLastColumn="0" w:lastRowFirstColumn="0" w:lastRowLastColumn="0"/>
+              <w:rPr>
+                <w:sz w:val="20"/>
+                <w:szCs w:val="20"/>
+              </w:rPr>
+            </w:pPr>
+            <w:r>
+              <w:rPr>
+                <w:sz w:val="20"/>
+                <w:szCs w:val="20"/>
+              </w:rPr>
+              <w:t>05/08/2026</w:t>
+            </w:r>
+          </w:p>
+        </w:tc>
+        <w:tc>
+          <w:tcPr>
+            <w:tcW w:w="0" w:type="auto"/>
+          </w:tcPr>
+          <w:p>
+            <w:pPr>
+              <w:cnfStyle w:val="000000100000" w:firstRow="0" w:lastRow="0" w:firstColumn="0" w:lastColumn="0" w:oddVBand="0" w:evenVBand="0" w:oddHBand="1" w:evenHBand="0" w:firstRowFirstColumn="0" w:firstRowLastColumn="0" w:lastRowFirstColumn="0" w:lastRowLastColumn="0"/>
+              <w:rPr>
+                <w:sz w:val="20"/>
+                <w:szCs w:val="20"/>
+              </w:rPr>
+            </w:pPr>
+            <w:r>
+              <w:rPr>
+                <w:sz w:val="20"/>
+                <w:szCs w:val="20"/>
+              </w:rPr>
+              <w:t>CRUD: Delete Execution</w:t>
+            </w:r>
+          </w:p>
+        </w:tc>
+        <w:tc>
+          <w:tcPr>
+            <w:tcW w:w="0" w:type="auto"/>
+          </w:tcPr>
+          <w:p>
+            <w:pPr>
+              <w:cnfStyle w:val="000000100000" w:firstRow="0" w:lastRow="0" w:firstColumn="0" w:lastColumn="0" w:oddVBand="0" w:evenVBand="0" w:oddHBand="1" w:evenHBand="0" w:firstRowFirstColumn="0" w:firstRowLastColumn="0" w:lastRowFirstColumn="0" w:lastRowLastColumn="0"/>
+              <w:rPr>
+                <w:sz w:val="20"/>
+                <w:szCs w:val="20"/>
+              </w:rPr>
+            </w:pPr>
+            <w:r>
+              <w:rPr>
+                <w:sz w:val="20"/>
+                <w:szCs w:val="20"/>
+              </w:rPr>
+              <w:t>Confirmation: 'Yes'</w:t>
+            </w:r>
+          </w:p>
+        </w:tc>
+        <w:tc>
+          <w:tcPr>
+            <w:tcW w:w="0" w:type="auto"/>
+          </w:tcPr>
+          <w:p>
+            <w:pPr>
+              <w:cnfStyle w:val="000000100000" w:firstRow="0" w:lastRow="0" w:firstColumn="0" w:lastColumn="0" w:oddVBand="0" w:evenVBand="0" w:oddHBand="1" w:evenHBand="0" w:firstRowFirstColumn="0" w:firstRowLastColumn="0" w:lastRowFirstColumn="0" w:lastRowLastColumn="0"/>
+              <w:rPr>
+                <w:sz w:val="20"/>
+                <w:szCs w:val="20"/>
+              </w:rPr>
+            </w:pPr>
+            <w:r>
+              <w:rPr>
+                <w:sz w:val="20"/>
+                <w:szCs w:val="20"/>
+              </w:rPr>
+              <w:t>Tap 'Yes' on deletion confirmation alert</w:t>
+            </w:r>
+          </w:p>
+        </w:tc>
+        <w:tc>
+          <w:tcPr>
+            <w:tcW w:w="0" w:type="auto"/>
+          </w:tcPr>
+          <w:p>
+            <w:pPr>
+              <w:cnfStyle w:val="000000100000" w:firstRow="0" w:lastRow="0" w:firstColumn="0" w:lastColumn="0" w:oddVBand="0" w:evenVBand="0" w:oddHBand="1" w:evenHBand="0" w:firstRowFirstColumn="0" w:firstRowLastColumn="0" w:lastRowFirstColumn="0" w:lastRowLastColumn="0"/>
+              <w:rPr>
+                <w:sz w:val="20"/>
+                <w:szCs w:val="20"/>
+              </w:rPr>
+            </w:pPr>
+            <w:r>
+              <w:rPr>
+                <w:sz w:val="20"/>
+                <w:szCs w:val="20"/>
+              </w:rPr>
+              <w:t>Registration row purged from SQLite database</w:t>
+            </w:r>
+          </w:p>
+        </w:tc>
+        <w:tc>
+          <w:tcPr>
+            <w:tcW w:w="0" w:type="auto"/>
+          </w:tcPr>
+          <w:p>
+            <w:pPr>
+              <w:cnfStyle w:val="000000100000" w:firstRow="0" w:lastRow="0" w:firstColumn="0" w:lastColumn="0" w:oddVBand="0" w:evenVBand="0" w:oddHBand="1" w:evenHBand="0" w:firstRowFirstColumn="0" w:firstRowLastColumn="0" w:lastRowFirstColumn="0" w:lastRowLastColumn="0"/>
+              <w:rPr>
+                <w:sz w:val="20"/>
+                <w:szCs w:val="20"/>
+              </w:rPr>
+            </w:pPr>
+            <w:r>
+              <w:rPr>
+                <w:sz w:val="20"/>
+                <w:szCs w:val="20"/>
+              </w:rPr>
+              <w:t>Record removed from list and count decremented</w:t>
+            </w:r>
+          </w:p>
+        </w:tc>
+        <w:tc>
+          <w:tcPr>
+            <w:tcW w:w="0" w:type="auto"/>
+          </w:tcPr>
+          <w:p>
+            <w:pPr>
+              <w:cnfStyle w:val="000000100000" w:firstRow="0" w:lastRow="0" w:firstColumn="0" w:lastColumn="0" w:oddVBand="0" w:evenVBand="0" w:oddHBand="1" w:evenHBand="0" w:firstRowFirstColumn="0" w:firstRowLastColumn="0" w:lastRowFirstColumn="0" w:lastRowLastColumn="0"/>
+              <w:rPr>
+                <w:sz w:val="20"/>
+                <w:szCs w:val="20"/>
+              </w:rPr>
+            </w:pPr>
+            <w:r>
+              <w:rPr>
+                <w:sz w:val="20"/>
+                <w:szCs w:val="20"/>
+              </w:rPr>
+              <w:t>PASS</w:t>
+            </w:r>
+          </w:p>
+        </w:tc>
+      </w:tr>
+      <w:tr>
+        <w:tc>
+          <w:tcPr>
+            <w:cnfStyle w:val="001000000000" w:firstRow="0" w:lastRow="0" w:firstColumn="1" w:lastColumn="0" w:oddVBand="0" w:evenVBand="0" w:oddHBand="0" w:evenHBand="0" w:firstRowFirstColumn="0" w:firstRowLastColumn="0" w:lastRowFirstColumn="0" w:lastRowLastColumn="0"/>
+            <w:tcW w:w="0" w:type="auto"/>
+          </w:tcPr>
+          <w:p>
+            <w:pPr>
+              <w:rPr>
+                <w:b w:val="0"/>
+                <w:bCs w:val="0"/>
+                <w:sz w:val="20"/>
+                <w:szCs w:val="20"/>
+              </w:rPr>
+            </w:pPr>
+            <w:r>
+              <w:rPr>
+                <w:b w:val="0"/>
+                <w:bCs w:val="0"/>
+                <w:sz w:val="20"/>
+                <w:szCs w:val="20"/>
+              </w:rPr>
+              <w:t>TC-MAN-14</w:t>
+            </w:r>
+          </w:p>
+        </w:tc>
+        <w:tc>
+          <w:tcPr>
+            <w:tcW w:w="0" w:type="auto"/>
+          </w:tcPr>
+          <w:p>
+            <w:pPr>
+              <w:cnfStyle w:val="000000000000" w:firstRow="0" w:lastRow="0" w:firstColumn="0" w:lastColumn="0" w:oddVBand="0" w:evenVBand="0" w:oddHBand="0" w:evenHBand="0" w:firstRowFirstColumn="0" w:firstRowLastColumn="0" w:lastRowFirstColumn="0" w:lastRowLastColumn="0"/>
+              <w:rPr>
+                <w:sz w:val="20"/>
+                <w:szCs w:val="20"/>
+              </w:rPr>
+            </w:pPr>
+            <w:r>
+              <w:rPr>
+                <w:sz w:val="20"/>
+                <w:szCs w:val="20"/>
+              </w:rPr>
+              <w:t>05/08/2026</w:t>
+            </w:r>
+          </w:p>
+        </w:tc>
+        <w:tc>
+          <w:tcPr>
+            <w:tcW w:w="0" w:type="auto"/>
+          </w:tcPr>
+          <w:p>
+            <w:pPr>
+              <w:cnfStyle w:val="000000000000" w:firstRow="0" w:lastRow="0" w:firstColumn="0" w:lastColumn="0" w:oddVBand="0" w:evenVBand="0" w:oddHBand="0" w:evenHBand="0" w:firstRowFirstColumn="0" w:firstRowLastColumn="0" w:lastRowFirstColumn="0" w:lastRowLastColumn="0"/>
+              <w:rPr>
+                <w:sz w:val="20"/>
+                <w:szCs w:val="20"/>
+              </w:rPr>
+            </w:pPr>
+            <w:r>
+              <w:rPr>
+                <w:sz w:val="20"/>
+                <w:szCs w:val="20"/>
+              </w:rPr>
+              <w:t>Privacy Information Page</w:t>
+            </w:r>
+          </w:p>
+        </w:tc>
+        <w:tc>
+          <w:tcPr>
+            <w:tcW w:w="0" w:type="auto"/>
+          </w:tcPr>
+          <w:p>
+            <w:pPr>
+              <w:cnfStyle w:val="000000000000" w:firstRow="0" w:lastRow="0" w:firstColumn="0" w:lastColumn="0" w:oddVBand="0" w:evenVBand="0" w:oddHBand="0" w:evenHBand="0" w:firstRowFirstColumn="0" w:firstRowLastColumn="0" w:lastRowFirstColumn="0" w:lastRowLastColumn="0"/>
+              <w:rPr>
+                <w:sz w:val="20"/>
+                <w:szCs w:val="20"/>
+              </w:rPr>
+            </w:pPr>
+            <w:r>
+              <w:rPr>
+                <w:sz w:val="20"/>
+                <w:szCs w:val="20"/>
+              </w:rPr>
+              <w:t>Static Review</w:t>
+            </w:r>
+          </w:p>
+        </w:tc>
+        <w:tc>
+          <w:tcPr>
+            <w:tcW w:w="0" w:type="auto"/>
+          </w:tcPr>
+          <w:p>
+            <w:pPr>
+              <w:cnfStyle w:val="000000000000" w:firstRow="0" w:lastRow="0" w:firstColumn="0" w:lastColumn="0" w:oddVBand="0" w:evenVBand="0" w:oddHBand="0" w:evenHBand="0" w:firstRowFirstColumn="0" w:firstRowLastColumn="0" w:lastRowFirstColumn="0" w:lastRowLastColumn="0"/>
+              <w:rPr>
+                <w:sz w:val="20"/>
+                <w:szCs w:val="20"/>
+              </w:rPr>
+            </w:pPr>
+            <w:r>
+              <w:rPr>
+                <w:sz w:val="20"/>
+                <w:szCs w:val="20"/>
+              </w:rPr>
+              <w:t>Open 'Privacy' tab</w:t>
+            </w:r>
+          </w:p>
+        </w:tc>
+        <w:tc>
+          <w:tcPr>
+            <w:tcW w:w="0" w:type="auto"/>
+          </w:tcPr>
+          <w:p>
+            <w:pPr>
+              <w:cnfStyle w:val="000000000000" w:firstRow="0" w:lastRow="0" w:firstColumn="0" w:lastColumn="0" w:oddVBand="0" w:evenVBand="0" w:oddHBand="0" w:evenHBand="0" w:firstRowFirstColumn="0" w:firstRowLastColumn="0" w:lastRowFirstColumn="0" w:lastRowLastColumn="0"/>
+              <w:rPr>
+                <w:sz w:val="20"/>
+                <w:szCs w:val="20"/>
+              </w:rPr>
+            </w:pPr>
+            <w:r>
+              <w:rPr>
+                <w:sz w:val="20"/>
+                <w:szCs w:val="20"/>
+              </w:rPr>
+              <w:t>Displays clear policies on minimisation, purpose limitation, and local device storage</w:t>
+            </w:r>
+          </w:p>
+        </w:tc>
+        <w:tc>
+          <w:tcPr>
+            <w:tcW w:w="0" w:type="auto"/>
+          </w:tcPr>
+          <w:p>
+            <w:pPr>
+              <w:cnfStyle w:val="000000000000" w:firstRow="0" w:lastRow="0" w:firstColumn="0" w:lastColumn="0" w:oddVBand="0" w:evenVBand="0" w:oddHBand="0" w:evenHBand="0" w:firstRowFirstColumn="0" w:firstRowLastColumn="0" w:lastRowFirstColumn="0" w:lastRowLastColumn="0"/>
+              <w:rPr>
+                <w:sz w:val="20"/>
+                <w:szCs w:val="20"/>
+              </w:rPr>
+            </w:pPr>
+            <w:r>
+              <w:rPr>
+                <w:sz w:val="20"/>
+                <w:szCs w:val="20"/>
+              </w:rPr>
+              <w:t>Privacy policy presented cleanly without clutter</w:t>
+            </w:r>
+          </w:p>
+        </w:tc>
+        <w:tc>
+          <w:tcPr>
+            <w:tcW w:w="0" w:type="auto"/>
+          </w:tcPr>
+          <w:p>
+            <w:pPr>
+              <w:cnfStyle w:val="000000000000" w:firstRow="0" w:lastRow="0" w:firstColumn="0" w:lastColumn="0" w:oddVBand="0" w:evenVBand="0" w:oddHBand="0" w:evenHBand="0" w:firstRowFirstColumn="0" w:firstRowLastColumn="0" w:lastRowFirstColumn="0" w:lastRowLastColumn="0"/>
+              <w:rPr>
+                <w:sz w:val="20"/>
+                <w:szCs w:val="20"/>
+              </w:rPr>
+            </w:pPr>
+            <w:r>
+              <w:rPr>
                 <w:sz w:val="20"/>
                 <w:szCs w:val="20"/>
               </w:rPr>
@@ -2664,6 +5017,19 @@
       </w:tcPr>
     </w:tblStylePr>
   </w:style>
+  <w:style w:type="character" w:styleId="HTMLCode">
+    <w:name w:val="HTML Code"/>
+    <w:basedOn w:val="DefaultParagraphFont"/>
+    <w:uiPriority w:val="99"/>
+    <w:semiHidden/>
+    <w:unhideWhenUsed/>
+    <w:rsid w:val="00584DF5"/>
+    <w:rPr>
+      <w:rFonts w:ascii="Courier New" w:eastAsia="Times New Roman" w:hAnsi="Courier New" w:cs="Courier New"/>
+      <w:sz w:val="20"/>
+      <w:szCs w:val="20"/>
+    </w:rPr>
+  </w:style>
 </w:styles>
 </file>
 
@@ -2980,4 +5346,16 @@
     </a:ext>
   </a:extLst>
 </a:theme>
+</file>
+
+<file path=customXml/item1.xml><?xml version="1.0" encoding="utf-8"?>
+<b:Sources xmlns:b="http://schemas.openxmlformats.org/officeDocument/2006/bibliography" xmlns="http://schemas.openxmlformats.org/officeDocument/2006/bibliography" SelectedStyle="\APASixthEditionOfficeOnline.xsl" StyleName="APA" Version="6"/>
+</file>
+
+<file path=customXml/itemProps1.xml><?xml version="1.0" encoding="utf-8"?>
+<ds:datastoreItem xmlns:ds="http://schemas.openxmlformats.org/officeDocument/2006/customXml" ds:itemID="{FEBFC562-4D1F-4A0A-841A-E409CCCF56A3}">
+  <ds:schemaRefs>
+    <ds:schemaRef ds:uri="http://schemas.openxmlformats.org/officeDocument/2006/bibliography"/>
+  </ds:schemaRefs>
+</ds:datastoreItem>
 </file>
</xml_diff>

<commit_message>
Phase 5 Complete: Integrated xUnit test project VolunteerConnect.Tests, updated issue log (ISS-001 to ISS-013) and testing evidence (07-08-2026)
</commit_message>
<xml_diff>
--- a/VolunteerConnect/Docs/VolunteerConnect_TestingEvidence.docx
+++ b/VolunteerConnect/Docs/VolunteerConnect_TestingEvidence.docx
@@ -24,12 +24,12 @@
         <w:tblLook w:val="04A0" w:firstRow="1" w:lastRow="0" w:firstColumn="1" w:lastColumn="0" w:noHBand="0" w:noVBand="1"/>
       </w:tblPr>
       <w:tblGrid>
-        <w:gridCol w:w="1081"/>
+        <w:gridCol w:w="1038"/>
         <w:gridCol w:w="1207"/>
-        <w:gridCol w:w="2770"/>
-        <w:gridCol w:w="1964"/>
-        <w:gridCol w:w="1444"/>
-        <w:gridCol w:w="1183"/>
+        <w:gridCol w:w="2920"/>
+        <w:gridCol w:w="2021"/>
+        <w:gridCol w:w="1362"/>
+        <w:gridCol w:w="1101"/>
         <w:gridCol w:w="807"/>
       </w:tblGrid>
       <w:tr>
@@ -280,7 +280,6 @@
                 <w:szCs w:val="20"/>
               </w:rPr>
             </w:pPr>
-            <w:proofErr w:type="spellStart"/>
             <w:r>
               <w:rPr>
                 <w:sz w:val="20"/>
@@ -288,7 +287,6 @@
               </w:rPr>
               <w:t>PrivacyValidator.IsValidEmail</w:t>
             </w:r>
-            <w:proofErr w:type="spellEnd"/>
           </w:p>
         </w:tc>
         <w:tc>
@@ -449,7 +447,6 @@
                 <w:szCs w:val="20"/>
               </w:rPr>
             </w:pPr>
-            <w:proofErr w:type="spellStart"/>
             <w:r>
               <w:rPr>
                 <w:sz w:val="20"/>
@@ -457,7 +454,6 @@
               </w:rPr>
               <w:t>PrivacyValidator.IsValidEmail</w:t>
             </w:r>
-            <w:proofErr w:type="spellEnd"/>
           </w:p>
         </w:tc>
         <w:tc>
@@ -637,7 +633,6 @@
                 <w:szCs w:val="20"/>
               </w:rPr>
             </w:pPr>
-            <w:proofErr w:type="spellStart"/>
             <w:r>
               <w:rPr>
                 <w:sz w:val="20"/>
@@ -645,7 +640,6 @@
               </w:rPr>
               <w:t>PrivacyValidator.IsValidPhone</w:t>
             </w:r>
-            <w:proofErr w:type="spellEnd"/>
           </w:p>
         </w:tc>
         <w:tc>
@@ -806,7 +800,6 @@
                 <w:szCs w:val="20"/>
               </w:rPr>
             </w:pPr>
-            <w:proofErr w:type="spellStart"/>
             <w:r>
               <w:rPr>
                 <w:sz w:val="20"/>
@@ -814,7 +807,6 @@
               </w:rPr>
               <w:t>PrivacyValidator.IsValidPhone</w:t>
             </w:r>
-            <w:proofErr w:type="spellEnd"/>
           </w:p>
         </w:tc>
         <w:tc>
@@ -907,6 +899,2034 @@
               </w:rPr>
               <w:t>PASS</w:t>
             </w:r>
+          </w:p>
+        </w:tc>
+      </w:tr>
+      <w:tr>
+        <w:trPr>
+          <w:cnfStyle w:val="000000100000" w:firstRow="0" w:lastRow="0" w:firstColumn="0" w:lastColumn="0" w:oddVBand="0" w:evenVBand="0" w:oddHBand="1" w:evenHBand="0" w:firstRowFirstColumn="0" w:firstRowLastColumn="0" w:lastRowFirstColumn="0" w:lastRowLastColumn="0"/>
+        </w:trPr>
+        <w:tc>
+          <w:tcPr>
+            <w:cnfStyle w:val="001000000000" w:firstRow="0" w:lastRow="0" w:firstColumn="1" w:lastColumn="0" w:oddVBand="0" w:evenVBand="0" w:oddHBand="0" w:evenHBand="0" w:firstRowFirstColumn="0" w:firstRowLastColumn="0" w:lastRowFirstColumn="0" w:lastRowLastColumn="0"/>
+            <w:tcW w:w="0" w:type="auto"/>
+          </w:tcPr>
+          <w:p>
+            <w:pPr>
+              <w:rPr>
+                <w:sz w:val="20"/>
+                <w:szCs w:val="20"/>
+              </w:rPr>
+            </w:pPr>
+            <w:r>
+              <w:rPr>
+                <w:sz w:val="20"/>
+                <w:szCs w:val="20"/>
+              </w:rPr>
+              <w:t>TC-AUTO-05</w:t>
+            </w:r>
+          </w:p>
+        </w:tc>
+        <w:tc>
+          <w:tcPr>
+            <w:tcW w:w="0" w:type="auto"/>
+          </w:tcPr>
+          <w:p>
+            <w:pPr>
+              <w:cnfStyle w:val="000000100000" w:firstRow="0" w:lastRow="0" w:firstColumn="0" w:lastColumn="0" w:oddVBand="0" w:evenVBand="0" w:oddHBand="1" w:evenHBand="0" w:firstRowFirstColumn="0" w:firstRowLastColumn="0" w:lastRowFirstColumn="0" w:lastRowLastColumn="0"/>
+              <w:rPr>
+                <w:sz w:val="20"/>
+                <w:szCs w:val="20"/>
+              </w:rPr>
+            </w:pPr>
+            <w:r>
+              <w:rPr>
+                <w:sz w:val="20"/>
+                <w:szCs w:val="20"/>
+              </w:rPr>
+              <w:t>07/08/2026</w:t>
+            </w:r>
+          </w:p>
+        </w:tc>
+        <w:tc>
+          <w:tcPr>
+            <w:tcW w:w="0" w:type="auto"/>
+          </w:tcPr>
+          <w:p>
+            <w:pPr>
+              <w:cnfStyle w:val="000000100000" w:firstRow="0" w:lastRow="0" w:firstColumn="0" w:lastColumn="0" w:oddVBand="0" w:evenVBand="0" w:oddHBand="1" w:evenHBand="0" w:firstRowFirstColumn="0" w:firstRowLastColumn="0" w:lastRowFirstColumn="0" w:lastRowLastColumn="0"/>
+              <w:rPr>
+                <w:sz w:val="20"/>
+                <w:szCs w:val="20"/>
+              </w:rPr>
+            </w:pPr>
+            <w:r>
+              <w:rPr>
+                <w:sz w:val="20"/>
+                <w:szCs w:val="20"/>
+              </w:rPr>
+              <w:t>PrivacyValidator.IsValidEmail</w:t>
+            </w:r>
+          </w:p>
+        </w:tc>
+        <w:tc>
+          <w:tcPr>
+            <w:tcW w:w="0" w:type="auto"/>
+          </w:tcPr>
+          <w:p>
+            <w:pPr>
+              <w:cnfStyle w:val="000000100000" w:firstRow="0" w:lastRow="0" w:firstColumn="0" w:lastColumn="0" w:oddVBand="0" w:evenVBand="0" w:oddHBand="1" w:evenHBand="0" w:firstRowFirstColumn="0" w:firstRowLastColumn="0" w:lastRowFirstColumn="0" w:lastRowLastColumn="0"/>
+              <w:rPr>
+                <w:sz w:val="20"/>
+                <w:szCs w:val="20"/>
+              </w:rPr>
+            </w:pPr>
+            <w:r>
+              <w:rPr>
+                <w:sz w:val="20"/>
+                <w:szCs w:val="20"/>
+              </w:rPr>
+              <w:t>"@missinguser.com"</w:t>
+            </w:r>
+          </w:p>
+        </w:tc>
+        <w:tc>
+          <w:tcPr>
+            <w:tcW w:w="0" w:type="auto"/>
+          </w:tcPr>
+          <w:p>
+            <w:pPr>
+              <w:cnfStyle w:val="000000100000" w:firstRow="0" w:lastRow="0" w:firstColumn="0" w:lastColumn="0" w:oddVBand="0" w:evenVBand="0" w:oddHBand="1" w:evenHBand="0" w:firstRowFirstColumn="0" w:firstRowLastColumn="0" w:lastRowFirstColumn="0" w:lastRowLastColumn="0"/>
+              <w:rPr>
+                <w:sz w:val="20"/>
+                <w:szCs w:val="20"/>
+              </w:rPr>
+            </w:pPr>
+            <w:r>
+              <w:rPr>
+                <w:sz w:val="20"/>
+                <w:szCs w:val="20"/>
+              </w:rPr>
+              <w:t>False</w:t>
+            </w:r>
+          </w:p>
+        </w:tc>
+        <w:tc>
+          <w:tcPr>
+            <w:tcW w:w="0" w:type="auto"/>
+          </w:tcPr>
+          <w:p>
+            <w:pPr>
+              <w:cnfStyle w:val="000000100000" w:firstRow="0" w:lastRow="0" w:firstColumn="0" w:lastColumn="0" w:oddVBand="0" w:evenVBand="0" w:oddHBand="1" w:evenHBand="0" w:firstRowFirstColumn="0" w:firstRowLastColumn="0" w:lastRowFirstColumn="0" w:lastRowLastColumn="0"/>
+              <w:rPr>
+                <w:sz w:val="20"/>
+                <w:szCs w:val="20"/>
+              </w:rPr>
+            </w:pPr>
+            <w:r>
+              <w:rPr>
+                <w:sz w:val="20"/>
+                <w:szCs w:val="20"/>
+              </w:rPr>
+              <w:t>False</w:t>
+            </w:r>
+          </w:p>
+        </w:tc>
+        <w:tc>
+          <w:tcPr>
+            <w:tcW w:w="0" w:type="auto"/>
+          </w:tcPr>
+          <w:p>
+            <w:pPr>
+              <w:cnfStyle w:val="000000100000" w:firstRow="0" w:lastRow="0" w:firstColumn="0" w:lastColumn="0" w:oddVBand="0" w:evenVBand="0" w:oddHBand="1" w:evenHBand="0" w:firstRowFirstColumn="0" w:firstRowLastColumn="0" w:lastRowFirstColumn="0" w:lastRowLastColumn="0"/>
+              <w:rPr>
+                <w:sz w:val="20"/>
+                <w:szCs w:val="20"/>
+              </w:rPr>
+            </w:pPr>
+            <w:r>
+              <w:rPr>
+                <w:sz w:val="20"/>
+                <w:szCs w:val="20"/>
+              </w:rPr>
+              <w:t>PASS</w:t>
+            </w:r>
+          </w:p>
+        </w:tc>
+      </w:tr>
+      <w:tr>
+        <w:tc>
+          <w:tcPr>
+            <w:cnfStyle w:val="001000000000" w:firstRow="0" w:lastRow="0" w:firstColumn="1" w:lastColumn="0" w:oddVBand="0" w:evenVBand="0" w:oddHBand="0" w:evenHBand="0" w:firstRowFirstColumn="0" w:firstRowLastColumn="0" w:lastRowFirstColumn="0" w:lastRowLastColumn="0"/>
+            <w:tcW w:w="0" w:type="auto"/>
+          </w:tcPr>
+          <w:p>
+            <w:pPr>
+              <w:rPr>
+                <w:sz w:val="20"/>
+                <w:szCs w:val="20"/>
+              </w:rPr>
+            </w:pPr>
+            <w:r>
+              <w:rPr>
+                <w:sz w:val="20"/>
+                <w:szCs w:val="20"/>
+              </w:rPr>
+              <w:t>TC-AUTO-0</w:t>
+            </w:r>
+            <w:r>
+              <w:rPr>
+                <w:sz w:val="20"/>
+                <w:szCs w:val="20"/>
+              </w:rPr>
+              <w:t>6</w:t>
+            </w:r>
+          </w:p>
+        </w:tc>
+        <w:tc>
+          <w:tcPr>
+            <w:tcW w:w="0" w:type="auto"/>
+          </w:tcPr>
+          <w:p>
+            <w:pPr>
+              <w:cnfStyle w:val="000000000000" w:firstRow="0" w:lastRow="0" w:firstColumn="0" w:lastColumn="0" w:oddVBand="0" w:evenVBand="0" w:oddHBand="0" w:evenHBand="0" w:firstRowFirstColumn="0" w:firstRowLastColumn="0" w:lastRowFirstColumn="0" w:lastRowLastColumn="0"/>
+              <w:rPr>
+                <w:sz w:val="20"/>
+                <w:szCs w:val="20"/>
+              </w:rPr>
+            </w:pPr>
+            <w:r>
+              <w:rPr>
+                <w:sz w:val="20"/>
+                <w:szCs w:val="20"/>
+              </w:rPr>
+              <w:t>07/08/2026</w:t>
+            </w:r>
+          </w:p>
+        </w:tc>
+        <w:tc>
+          <w:tcPr>
+            <w:tcW w:w="0" w:type="auto"/>
+          </w:tcPr>
+          <w:p>
+            <w:pPr>
+              <w:cnfStyle w:val="000000000000" w:firstRow="0" w:lastRow="0" w:firstColumn="0" w:lastColumn="0" w:oddVBand="0" w:evenVBand="0" w:oddHBand="0" w:evenHBand="0" w:firstRowFirstColumn="0" w:firstRowLastColumn="0" w:lastRowFirstColumn="0" w:lastRowLastColumn="0"/>
+              <w:rPr>
+                <w:sz w:val="20"/>
+                <w:szCs w:val="20"/>
+              </w:rPr>
+            </w:pPr>
+            <w:r>
+              <w:rPr>
+                <w:sz w:val="20"/>
+                <w:szCs w:val="20"/>
+              </w:rPr>
+              <w:t>PrivacyValidator.IsValidEmail</w:t>
+            </w:r>
+          </w:p>
+        </w:tc>
+        <w:tc>
+          <w:tcPr>
+            <w:tcW w:w="0" w:type="auto"/>
+          </w:tcPr>
+          <w:p>
+            <w:pPr>
+              <w:cnfStyle w:val="000000000000" w:firstRow="0" w:lastRow="0" w:firstColumn="0" w:lastColumn="0" w:oddVBand="0" w:evenVBand="0" w:oddHBand="0" w:evenHBand="0" w:firstRowFirstColumn="0" w:firstRowLastColumn="0" w:lastRowFirstColumn="0" w:lastRowLastColumn="0"/>
+              <w:rPr>
+                <w:sz w:val="20"/>
+                <w:szCs w:val="20"/>
+              </w:rPr>
+            </w:pPr>
+            <w:r>
+              <w:rPr>
+                <w:sz w:val="20"/>
+                <w:szCs w:val="20"/>
+              </w:rPr>
+              <w:t>"" (Empty string)</w:t>
+            </w:r>
+          </w:p>
+        </w:tc>
+        <w:tc>
+          <w:tcPr>
+            <w:tcW w:w="0" w:type="auto"/>
+          </w:tcPr>
+          <w:p>
+            <w:pPr>
+              <w:cnfStyle w:val="000000000000" w:firstRow="0" w:lastRow="0" w:firstColumn="0" w:lastColumn="0" w:oddVBand="0" w:evenVBand="0" w:oddHBand="0" w:evenHBand="0" w:firstRowFirstColumn="0" w:firstRowLastColumn="0" w:lastRowFirstColumn="0" w:lastRowLastColumn="0"/>
+              <w:rPr>
+                <w:sz w:val="20"/>
+                <w:szCs w:val="20"/>
+              </w:rPr>
+            </w:pPr>
+            <w:r>
+              <w:rPr>
+                <w:sz w:val="20"/>
+                <w:szCs w:val="20"/>
+              </w:rPr>
+              <w:t>False</w:t>
+            </w:r>
+          </w:p>
+        </w:tc>
+        <w:tc>
+          <w:tcPr>
+            <w:tcW w:w="0" w:type="auto"/>
+          </w:tcPr>
+          <w:p>
+            <w:pPr>
+              <w:cnfStyle w:val="000000000000" w:firstRow="0" w:lastRow="0" w:firstColumn="0" w:lastColumn="0" w:oddVBand="0" w:evenVBand="0" w:oddHBand="0" w:evenHBand="0" w:firstRowFirstColumn="0" w:firstRowLastColumn="0" w:lastRowFirstColumn="0" w:lastRowLastColumn="0"/>
+              <w:rPr>
+                <w:sz w:val="20"/>
+                <w:szCs w:val="20"/>
+              </w:rPr>
+            </w:pPr>
+            <w:r>
+              <w:rPr>
+                <w:sz w:val="20"/>
+                <w:szCs w:val="20"/>
+              </w:rPr>
+              <w:t>False</w:t>
+            </w:r>
+          </w:p>
+        </w:tc>
+        <w:tc>
+          <w:tcPr>
+            <w:tcW w:w="0" w:type="auto"/>
+          </w:tcPr>
+          <w:p>
+            <w:pPr>
+              <w:cnfStyle w:val="000000000000" w:firstRow="0" w:lastRow="0" w:firstColumn="0" w:lastColumn="0" w:oddVBand="0" w:evenVBand="0" w:oddHBand="0" w:evenHBand="0" w:firstRowFirstColumn="0" w:firstRowLastColumn="0" w:lastRowFirstColumn="0" w:lastRowLastColumn="0"/>
+              <w:rPr>
+                <w:sz w:val="20"/>
+                <w:szCs w:val="20"/>
+              </w:rPr>
+            </w:pPr>
+            <w:r>
+              <w:rPr>
+                <w:sz w:val="20"/>
+                <w:szCs w:val="20"/>
+              </w:rPr>
+              <w:t>PASS</w:t>
+            </w:r>
+          </w:p>
+        </w:tc>
+      </w:tr>
+      <w:tr>
+        <w:trPr>
+          <w:cnfStyle w:val="000000100000" w:firstRow="0" w:lastRow="0" w:firstColumn="0" w:lastColumn="0" w:oddVBand="0" w:evenVBand="0" w:oddHBand="1" w:evenHBand="0" w:firstRowFirstColumn="0" w:firstRowLastColumn="0" w:lastRowFirstColumn="0" w:lastRowLastColumn="0"/>
+        </w:trPr>
+        <w:tc>
+          <w:tcPr>
+            <w:cnfStyle w:val="001000000000" w:firstRow="0" w:lastRow="0" w:firstColumn="1" w:lastColumn="0" w:oddVBand="0" w:evenVBand="0" w:oddHBand="0" w:evenHBand="0" w:firstRowFirstColumn="0" w:firstRowLastColumn="0" w:lastRowFirstColumn="0" w:lastRowLastColumn="0"/>
+            <w:tcW w:w="0" w:type="auto"/>
+          </w:tcPr>
+          <w:p>
+            <w:pPr>
+              <w:rPr>
+                <w:sz w:val="20"/>
+                <w:szCs w:val="20"/>
+              </w:rPr>
+            </w:pPr>
+            <w:r>
+              <w:rPr>
+                <w:sz w:val="20"/>
+                <w:szCs w:val="20"/>
+              </w:rPr>
+              <w:t>TC-AUTO-0</w:t>
+            </w:r>
+            <w:r>
+              <w:rPr>
+                <w:sz w:val="20"/>
+                <w:szCs w:val="20"/>
+              </w:rPr>
+              <w:t>7</w:t>
+            </w:r>
+          </w:p>
+        </w:tc>
+        <w:tc>
+          <w:tcPr>
+            <w:tcW w:w="0" w:type="auto"/>
+          </w:tcPr>
+          <w:p>
+            <w:pPr>
+              <w:cnfStyle w:val="000000100000" w:firstRow="0" w:lastRow="0" w:firstColumn="0" w:lastColumn="0" w:oddVBand="0" w:evenVBand="0" w:oddHBand="1" w:evenHBand="0" w:firstRowFirstColumn="0" w:firstRowLastColumn="0" w:lastRowFirstColumn="0" w:lastRowLastColumn="0"/>
+              <w:rPr>
+                <w:sz w:val="20"/>
+                <w:szCs w:val="20"/>
+              </w:rPr>
+            </w:pPr>
+            <w:r>
+              <w:rPr>
+                <w:sz w:val="20"/>
+                <w:szCs w:val="20"/>
+              </w:rPr>
+              <w:t>07/08/2026</w:t>
+            </w:r>
+          </w:p>
+        </w:tc>
+        <w:tc>
+          <w:tcPr>
+            <w:tcW w:w="0" w:type="auto"/>
+          </w:tcPr>
+          <w:p>
+            <w:pPr>
+              <w:cnfStyle w:val="000000100000" w:firstRow="0" w:lastRow="0" w:firstColumn="0" w:lastColumn="0" w:oddVBand="0" w:evenVBand="0" w:oddHBand="1" w:evenHBand="0" w:firstRowFirstColumn="0" w:firstRowLastColumn="0" w:lastRowFirstColumn="0" w:lastRowLastColumn="0"/>
+              <w:rPr>
+                <w:sz w:val="20"/>
+                <w:szCs w:val="20"/>
+              </w:rPr>
+            </w:pPr>
+            <w:r>
+              <w:rPr>
+                <w:sz w:val="20"/>
+                <w:szCs w:val="20"/>
+              </w:rPr>
+              <w:t>PrivacyValidator.IsValidEmail</w:t>
+            </w:r>
+          </w:p>
+        </w:tc>
+        <w:tc>
+          <w:tcPr>
+            <w:tcW w:w="0" w:type="auto"/>
+          </w:tcPr>
+          <w:p>
+            <w:pPr>
+              <w:cnfStyle w:val="000000100000" w:firstRow="0" w:lastRow="0" w:firstColumn="0" w:lastColumn="0" w:oddVBand="0" w:evenVBand="0" w:oddHBand="1" w:evenHBand="0" w:firstRowFirstColumn="0" w:firstRowLastColumn="0" w:lastRowFirstColumn="0" w:lastRowLastColumn="0"/>
+              <w:rPr>
+                <w:sz w:val="20"/>
+                <w:szCs w:val="20"/>
+              </w:rPr>
+            </w:pPr>
+            <w:r>
+              <w:rPr>
+                <w:sz w:val="20"/>
+                <w:szCs w:val="20"/>
+              </w:rPr>
+              <w:t>null</w:t>
+            </w:r>
+          </w:p>
+        </w:tc>
+        <w:tc>
+          <w:tcPr>
+            <w:tcW w:w="0" w:type="auto"/>
+          </w:tcPr>
+          <w:p>
+            <w:pPr>
+              <w:cnfStyle w:val="000000100000" w:firstRow="0" w:lastRow="0" w:firstColumn="0" w:lastColumn="0" w:oddVBand="0" w:evenVBand="0" w:oddHBand="1" w:evenHBand="0" w:firstRowFirstColumn="0" w:firstRowLastColumn="0" w:lastRowFirstColumn="0" w:lastRowLastColumn="0"/>
+              <w:rPr>
+                <w:sz w:val="20"/>
+                <w:szCs w:val="20"/>
+              </w:rPr>
+            </w:pPr>
+            <w:r>
+              <w:rPr>
+                <w:sz w:val="20"/>
+                <w:szCs w:val="20"/>
+              </w:rPr>
+              <w:t>False</w:t>
+            </w:r>
+          </w:p>
+        </w:tc>
+        <w:tc>
+          <w:tcPr>
+            <w:tcW w:w="0" w:type="auto"/>
+          </w:tcPr>
+          <w:p>
+            <w:pPr>
+              <w:cnfStyle w:val="000000100000" w:firstRow="0" w:lastRow="0" w:firstColumn="0" w:lastColumn="0" w:oddVBand="0" w:evenVBand="0" w:oddHBand="1" w:evenHBand="0" w:firstRowFirstColumn="0" w:firstRowLastColumn="0" w:lastRowFirstColumn="0" w:lastRowLastColumn="0"/>
+              <w:rPr>
+                <w:sz w:val="20"/>
+                <w:szCs w:val="20"/>
+              </w:rPr>
+            </w:pPr>
+            <w:r>
+              <w:rPr>
+                <w:sz w:val="20"/>
+                <w:szCs w:val="20"/>
+              </w:rPr>
+              <w:t>False</w:t>
+            </w:r>
+          </w:p>
+        </w:tc>
+        <w:tc>
+          <w:tcPr>
+            <w:tcW w:w="0" w:type="auto"/>
+          </w:tcPr>
+          <w:p>
+            <w:pPr>
+              <w:cnfStyle w:val="000000100000" w:firstRow="0" w:lastRow="0" w:firstColumn="0" w:lastColumn="0" w:oddVBand="0" w:evenVBand="0" w:oddHBand="1" w:evenHBand="0" w:firstRowFirstColumn="0" w:firstRowLastColumn="0" w:lastRowFirstColumn="0" w:lastRowLastColumn="0"/>
+              <w:rPr>
+                <w:sz w:val="20"/>
+                <w:szCs w:val="20"/>
+              </w:rPr>
+            </w:pPr>
+            <w:r>
+              <w:rPr>
+                <w:sz w:val="20"/>
+                <w:szCs w:val="20"/>
+              </w:rPr>
+              <w:t>PASS</w:t>
+            </w:r>
+          </w:p>
+        </w:tc>
+      </w:tr>
+      <w:tr>
+        <w:tc>
+          <w:tcPr>
+            <w:cnfStyle w:val="001000000000" w:firstRow="0" w:lastRow="0" w:firstColumn="1" w:lastColumn="0" w:oddVBand="0" w:evenVBand="0" w:oddHBand="0" w:evenHBand="0" w:firstRowFirstColumn="0" w:firstRowLastColumn="0" w:lastRowFirstColumn="0" w:lastRowLastColumn="0"/>
+            <w:tcW w:w="0" w:type="auto"/>
+          </w:tcPr>
+          <w:p>
+            <w:pPr>
+              <w:rPr>
+                <w:sz w:val="20"/>
+                <w:szCs w:val="20"/>
+              </w:rPr>
+            </w:pPr>
+            <w:r>
+              <w:rPr>
+                <w:sz w:val="20"/>
+                <w:szCs w:val="20"/>
+              </w:rPr>
+              <w:t>TC-AUTO-0</w:t>
+            </w:r>
+            <w:r>
+              <w:rPr>
+                <w:sz w:val="20"/>
+                <w:szCs w:val="20"/>
+              </w:rPr>
+              <w:t>8</w:t>
+            </w:r>
+          </w:p>
+        </w:tc>
+        <w:tc>
+          <w:tcPr>
+            <w:tcW w:w="0" w:type="auto"/>
+          </w:tcPr>
+          <w:p>
+            <w:pPr>
+              <w:cnfStyle w:val="000000000000" w:firstRow="0" w:lastRow="0" w:firstColumn="0" w:lastColumn="0" w:oddVBand="0" w:evenVBand="0" w:oddHBand="0" w:evenHBand="0" w:firstRowFirstColumn="0" w:firstRowLastColumn="0" w:lastRowFirstColumn="0" w:lastRowLastColumn="0"/>
+              <w:rPr>
+                <w:sz w:val="20"/>
+                <w:szCs w:val="20"/>
+              </w:rPr>
+            </w:pPr>
+            <w:r>
+              <w:rPr>
+                <w:sz w:val="20"/>
+                <w:szCs w:val="20"/>
+              </w:rPr>
+              <w:t>07/08/2026</w:t>
+            </w:r>
+          </w:p>
+        </w:tc>
+        <w:tc>
+          <w:tcPr>
+            <w:tcW w:w="0" w:type="auto"/>
+          </w:tcPr>
+          <w:p>
+            <w:pPr>
+              <w:cnfStyle w:val="000000000000" w:firstRow="0" w:lastRow="0" w:firstColumn="0" w:lastColumn="0" w:oddVBand="0" w:evenVBand="0" w:oddHBand="0" w:evenHBand="0" w:firstRowFirstColumn="0" w:firstRowLastColumn="0" w:lastRowFirstColumn="0" w:lastRowLastColumn="0"/>
+              <w:rPr>
+                <w:sz w:val="20"/>
+                <w:szCs w:val="20"/>
+              </w:rPr>
+            </w:pPr>
+            <w:r>
+              <w:rPr>
+                <w:sz w:val="20"/>
+                <w:szCs w:val="20"/>
+              </w:rPr>
+              <w:t>PrivacyValidator.IsValidPhone</w:t>
+            </w:r>
+          </w:p>
+        </w:tc>
+        <w:tc>
+          <w:tcPr>
+            <w:tcW w:w="0" w:type="auto"/>
+          </w:tcPr>
+          <w:p>
+            <w:pPr>
+              <w:cnfStyle w:val="000000000000" w:firstRow="0" w:lastRow="0" w:firstColumn="0" w:lastColumn="0" w:oddVBand="0" w:evenVBand="0" w:oddHBand="0" w:evenHBand="0" w:firstRowFirstColumn="0" w:firstRowLastColumn="0" w:lastRowFirstColumn="0" w:lastRowLastColumn="0"/>
+              <w:rPr>
+                <w:sz w:val="20"/>
+                <w:szCs w:val="20"/>
+              </w:rPr>
+            </w:pPr>
+            <w:r>
+              <w:rPr>
+                <w:sz w:val="20"/>
+                <w:szCs w:val="20"/>
+              </w:rPr>
+              <w:t>"0211234567"</w:t>
+            </w:r>
+          </w:p>
+        </w:tc>
+        <w:tc>
+          <w:tcPr>
+            <w:tcW w:w="0" w:type="auto"/>
+          </w:tcPr>
+          <w:p>
+            <w:pPr>
+              <w:cnfStyle w:val="000000000000" w:firstRow="0" w:lastRow="0" w:firstColumn="0" w:lastColumn="0" w:oddVBand="0" w:evenVBand="0" w:oddHBand="0" w:evenHBand="0" w:firstRowFirstColumn="0" w:firstRowLastColumn="0" w:lastRowFirstColumn="0" w:lastRowLastColumn="0"/>
+              <w:rPr>
+                <w:sz w:val="20"/>
+                <w:szCs w:val="20"/>
+              </w:rPr>
+            </w:pPr>
+            <w:r>
+              <w:rPr>
+                <w:sz w:val="20"/>
+                <w:szCs w:val="20"/>
+              </w:rPr>
+              <w:t>True</w:t>
+            </w:r>
+          </w:p>
+        </w:tc>
+        <w:tc>
+          <w:tcPr>
+            <w:tcW w:w="0" w:type="auto"/>
+          </w:tcPr>
+          <w:p>
+            <w:pPr>
+              <w:cnfStyle w:val="000000000000" w:firstRow="0" w:lastRow="0" w:firstColumn="0" w:lastColumn="0" w:oddVBand="0" w:evenVBand="0" w:oddHBand="0" w:evenHBand="0" w:firstRowFirstColumn="0" w:firstRowLastColumn="0" w:lastRowFirstColumn="0" w:lastRowLastColumn="0"/>
+              <w:rPr>
+                <w:sz w:val="20"/>
+                <w:szCs w:val="20"/>
+              </w:rPr>
+            </w:pPr>
+            <w:r>
+              <w:rPr>
+                <w:sz w:val="20"/>
+                <w:szCs w:val="20"/>
+              </w:rPr>
+              <w:t>True</w:t>
+            </w:r>
+          </w:p>
+        </w:tc>
+        <w:tc>
+          <w:tcPr>
+            <w:tcW w:w="0" w:type="auto"/>
+          </w:tcPr>
+          <w:p>
+            <w:pPr>
+              <w:cnfStyle w:val="000000000000" w:firstRow="0" w:lastRow="0" w:firstColumn="0" w:lastColumn="0" w:oddVBand="0" w:evenVBand="0" w:oddHBand="0" w:evenHBand="0" w:firstRowFirstColumn="0" w:firstRowLastColumn="0" w:lastRowFirstColumn="0" w:lastRowLastColumn="0"/>
+              <w:rPr>
+                <w:sz w:val="20"/>
+                <w:szCs w:val="20"/>
+              </w:rPr>
+            </w:pPr>
+            <w:r>
+              <w:rPr>
+                <w:sz w:val="20"/>
+                <w:szCs w:val="20"/>
+              </w:rPr>
+              <w:t>PASS</w:t>
+            </w:r>
+          </w:p>
+        </w:tc>
+      </w:tr>
+      <w:tr>
+        <w:trPr>
+          <w:cnfStyle w:val="000000100000" w:firstRow="0" w:lastRow="0" w:firstColumn="0" w:lastColumn="0" w:oddVBand="0" w:evenVBand="0" w:oddHBand="1" w:evenHBand="0" w:firstRowFirstColumn="0" w:firstRowLastColumn="0" w:lastRowFirstColumn="0" w:lastRowLastColumn="0"/>
+        </w:trPr>
+        <w:tc>
+          <w:tcPr>
+            <w:cnfStyle w:val="001000000000" w:firstRow="0" w:lastRow="0" w:firstColumn="1" w:lastColumn="0" w:oddVBand="0" w:evenVBand="0" w:oddHBand="0" w:evenHBand="0" w:firstRowFirstColumn="0" w:firstRowLastColumn="0" w:lastRowFirstColumn="0" w:lastRowLastColumn="0"/>
+            <w:tcW w:w="0" w:type="auto"/>
+          </w:tcPr>
+          <w:p>
+            <w:pPr>
+              <w:rPr>
+                <w:sz w:val="20"/>
+                <w:szCs w:val="20"/>
+              </w:rPr>
+            </w:pPr>
+            <w:r>
+              <w:rPr>
+                <w:sz w:val="20"/>
+                <w:szCs w:val="20"/>
+              </w:rPr>
+              <w:t>TC-AUTO-0</w:t>
+            </w:r>
+            <w:r>
+              <w:rPr>
+                <w:sz w:val="20"/>
+                <w:szCs w:val="20"/>
+              </w:rPr>
+              <w:t>9</w:t>
+            </w:r>
+          </w:p>
+        </w:tc>
+        <w:tc>
+          <w:tcPr>
+            <w:tcW w:w="0" w:type="auto"/>
+          </w:tcPr>
+          <w:p>
+            <w:pPr>
+              <w:cnfStyle w:val="000000100000" w:firstRow="0" w:lastRow="0" w:firstColumn="0" w:lastColumn="0" w:oddVBand="0" w:evenVBand="0" w:oddHBand="1" w:evenHBand="0" w:firstRowFirstColumn="0" w:firstRowLastColumn="0" w:lastRowFirstColumn="0" w:lastRowLastColumn="0"/>
+              <w:rPr>
+                <w:sz w:val="20"/>
+                <w:szCs w:val="20"/>
+              </w:rPr>
+            </w:pPr>
+            <w:r>
+              <w:rPr>
+                <w:sz w:val="20"/>
+                <w:szCs w:val="20"/>
+              </w:rPr>
+              <w:t>07/08/2026</w:t>
+            </w:r>
+          </w:p>
+        </w:tc>
+        <w:tc>
+          <w:tcPr>
+            <w:tcW w:w="0" w:type="auto"/>
+          </w:tcPr>
+          <w:p>
+            <w:pPr>
+              <w:cnfStyle w:val="000000100000" w:firstRow="0" w:lastRow="0" w:firstColumn="0" w:lastColumn="0" w:oddVBand="0" w:evenVBand="0" w:oddHBand="1" w:evenHBand="0" w:firstRowFirstColumn="0" w:firstRowLastColumn="0" w:lastRowFirstColumn="0" w:lastRowLastColumn="0"/>
+              <w:rPr>
+                <w:sz w:val="20"/>
+                <w:szCs w:val="20"/>
+              </w:rPr>
+            </w:pPr>
+            <w:r>
+              <w:rPr>
+                <w:sz w:val="20"/>
+                <w:szCs w:val="20"/>
+              </w:rPr>
+              <w:t>PrivacyValidator.IsValidPhone</w:t>
+            </w:r>
+          </w:p>
+        </w:tc>
+        <w:tc>
+          <w:tcPr>
+            <w:tcW w:w="0" w:type="auto"/>
+          </w:tcPr>
+          <w:p>
+            <w:pPr>
+              <w:cnfStyle w:val="000000100000" w:firstRow="0" w:lastRow="0" w:firstColumn="0" w:lastColumn="0" w:oddVBand="0" w:evenVBand="0" w:oddHBand="1" w:evenHBand="0" w:firstRowFirstColumn="0" w:firstRowLastColumn="0" w:lastRowFirstColumn="0" w:lastRowLastColumn="0"/>
+              <w:rPr>
+                <w:sz w:val="20"/>
+                <w:szCs w:val="20"/>
+              </w:rPr>
+            </w:pPr>
+            <w:r>
+              <w:rPr>
+                <w:sz w:val="20"/>
+                <w:szCs w:val="20"/>
+              </w:rPr>
+              <w:t>"+64211234567"</w:t>
+            </w:r>
+          </w:p>
+        </w:tc>
+        <w:tc>
+          <w:tcPr>
+            <w:tcW w:w="0" w:type="auto"/>
+          </w:tcPr>
+          <w:p>
+            <w:pPr>
+              <w:cnfStyle w:val="000000100000" w:firstRow="0" w:lastRow="0" w:firstColumn="0" w:lastColumn="0" w:oddVBand="0" w:evenVBand="0" w:oddHBand="1" w:evenHBand="0" w:firstRowFirstColumn="0" w:firstRowLastColumn="0" w:lastRowFirstColumn="0" w:lastRowLastColumn="0"/>
+              <w:rPr>
+                <w:sz w:val="20"/>
+                <w:szCs w:val="20"/>
+              </w:rPr>
+            </w:pPr>
+            <w:r>
+              <w:rPr>
+                <w:sz w:val="20"/>
+                <w:szCs w:val="20"/>
+              </w:rPr>
+              <w:t>True</w:t>
+            </w:r>
+          </w:p>
+        </w:tc>
+        <w:tc>
+          <w:tcPr>
+            <w:tcW w:w="0" w:type="auto"/>
+          </w:tcPr>
+          <w:p>
+            <w:pPr>
+              <w:cnfStyle w:val="000000100000" w:firstRow="0" w:lastRow="0" w:firstColumn="0" w:lastColumn="0" w:oddVBand="0" w:evenVBand="0" w:oddHBand="1" w:evenHBand="0" w:firstRowFirstColumn="0" w:firstRowLastColumn="0" w:lastRowFirstColumn="0" w:lastRowLastColumn="0"/>
+              <w:rPr>
+                <w:sz w:val="20"/>
+                <w:szCs w:val="20"/>
+              </w:rPr>
+            </w:pPr>
+            <w:r>
+              <w:rPr>
+                <w:sz w:val="20"/>
+                <w:szCs w:val="20"/>
+              </w:rPr>
+              <w:t>True</w:t>
+            </w:r>
+          </w:p>
+        </w:tc>
+        <w:tc>
+          <w:tcPr>
+            <w:tcW w:w="0" w:type="auto"/>
+          </w:tcPr>
+          <w:p>
+            <w:pPr>
+              <w:cnfStyle w:val="000000100000" w:firstRow="0" w:lastRow="0" w:firstColumn="0" w:lastColumn="0" w:oddVBand="0" w:evenVBand="0" w:oddHBand="1" w:evenHBand="0" w:firstRowFirstColumn="0" w:firstRowLastColumn="0" w:lastRowFirstColumn="0" w:lastRowLastColumn="0"/>
+              <w:rPr>
+                <w:sz w:val="20"/>
+                <w:szCs w:val="20"/>
+              </w:rPr>
+            </w:pPr>
+            <w:r>
+              <w:rPr>
+                <w:sz w:val="20"/>
+                <w:szCs w:val="20"/>
+              </w:rPr>
+              <w:t>PASS</w:t>
+            </w:r>
+          </w:p>
+        </w:tc>
+      </w:tr>
+      <w:tr>
+        <w:tc>
+          <w:tcPr>
+            <w:cnfStyle w:val="001000000000" w:firstRow="0" w:lastRow="0" w:firstColumn="1" w:lastColumn="0" w:oddVBand="0" w:evenVBand="0" w:oddHBand="0" w:evenHBand="0" w:firstRowFirstColumn="0" w:firstRowLastColumn="0" w:lastRowFirstColumn="0" w:lastRowLastColumn="0"/>
+            <w:tcW w:w="0" w:type="auto"/>
+          </w:tcPr>
+          <w:p>
+            <w:pPr>
+              <w:rPr>
+                <w:sz w:val="20"/>
+                <w:szCs w:val="20"/>
+              </w:rPr>
+            </w:pPr>
+            <w:r>
+              <w:rPr>
+                <w:sz w:val="20"/>
+                <w:szCs w:val="20"/>
+              </w:rPr>
+              <w:t>TC-AUTO-</w:t>
+            </w:r>
+            <w:r>
+              <w:rPr>
+                <w:sz w:val="20"/>
+                <w:szCs w:val="20"/>
+              </w:rPr>
+              <w:t>10</w:t>
+            </w:r>
+          </w:p>
+        </w:tc>
+        <w:tc>
+          <w:tcPr>
+            <w:tcW w:w="0" w:type="auto"/>
+          </w:tcPr>
+          <w:p>
+            <w:pPr>
+              <w:cnfStyle w:val="000000000000" w:firstRow="0" w:lastRow="0" w:firstColumn="0" w:lastColumn="0" w:oddVBand="0" w:evenVBand="0" w:oddHBand="0" w:evenHBand="0" w:firstRowFirstColumn="0" w:firstRowLastColumn="0" w:lastRowFirstColumn="0" w:lastRowLastColumn="0"/>
+              <w:rPr>
+                <w:sz w:val="20"/>
+                <w:szCs w:val="20"/>
+              </w:rPr>
+            </w:pPr>
+            <w:r>
+              <w:rPr>
+                <w:sz w:val="20"/>
+                <w:szCs w:val="20"/>
+              </w:rPr>
+              <w:t>07/08/2026</w:t>
+            </w:r>
+          </w:p>
+        </w:tc>
+        <w:tc>
+          <w:tcPr>
+            <w:tcW w:w="0" w:type="auto"/>
+          </w:tcPr>
+          <w:p>
+            <w:pPr>
+              <w:cnfStyle w:val="000000000000" w:firstRow="0" w:lastRow="0" w:firstColumn="0" w:lastColumn="0" w:oddVBand="0" w:evenVBand="0" w:oddHBand="0" w:evenHBand="0" w:firstRowFirstColumn="0" w:firstRowLastColumn="0" w:lastRowFirstColumn="0" w:lastRowLastColumn="0"/>
+              <w:rPr>
+                <w:sz w:val="20"/>
+                <w:szCs w:val="20"/>
+              </w:rPr>
+            </w:pPr>
+            <w:r>
+              <w:rPr>
+                <w:sz w:val="20"/>
+                <w:szCs w:val="20"/>
+              </w:rPr>
+              <w:t>PrivacyValidator.IsValidPhone</w:t>
+            </w:r>
+          </w:p>
+        </w:tc>
+        <w:tc>
+          <w:tcPr>
+            <w:tcW w:w="0" w:type="auto"/>
+          </w:tcPr>
+          <w:p>
+            <w:pPr>
+              <w:cnfStyle w:val="000000000000" w:firstRow="0" w:lastRow="0" w:firstColumn="0" w:lastColumn="0" w:oddVBand="0" w:evenVBand="0" w:oddHBand="0" w:evenHBand="0" w:firstRowFirstColumn="0" w:firstRowLastColumn="0" w:lastRowFirstColumn="0" w:lastRowLastColumn="0"/>
+              <w:rPr>
+                <w:sz w:val="20"/>
+                <w:szCs w:val="20"/>
+              </w:rPr>
+            </w:pPr>
+            <w:r>
+              <w:rPr>
+                <w:sz w:val="20"/>
+                <w:szCs w:val="20"/>
+              </w:rPr>
+              <w:t>"03-345-6789"</w:t>
+            </w:r>
+          </w:p>
+        </w:tc>
+        <w:tc>
+          <w:tcPr>
+            <w:tcW w:w="0" w:type="auto"/>
+          </w:tcPr>
+          <w:p>
+            <w:pPr>
+              <w:cnfStyle w:val="000000000000" w:firstRow="0" w:lastRow="0" w:firstColumn="0" w:lastColumn="0" w:oddVBand="0" w:evenVBand="0" w:oddHBand="0" w:evenHBand="0" w:firstRowFirstColumn="0" w:firstRowLastColumn="0" w:lastRowFirstColumn="0" w:lastRowLastColumn="0"/>
+              <w:rPr>
+                <w:sz w:val="20"/>
+                <w:szCs w:val="20"/>
+              </w:rPr>
+            </w:pPr>
+            <w:r>
+              <w:rPr>
+                <w:sz w:val="20"/>
+                <w:szCs w:val="20"/>
+              </w:rPr>
+              <w:t>True</w:t>
+            </w:r>
+          </w:p>
+        </w:tc>
+        <w:tc>
+          <w:tcPr>
+            <w:tcW w:w="0" w:type="auto"/>
+          </w:tcPr>
+          <w:p>
+            <w:pPr>
+              <w:cnfStyle w:val="000000000000" w:firstRow="0" w:lastRow="0" w:firstColumn="0" w:lastColumn="0" w:oddVBand="0" w:evenVBand="0" w:oddHBand="0" w:evenHBand="0" w:firstRowFirstColumn="0" w:firstRowLastColumn="0" w:lastRowFirstColumn="0" w:lastRowLastColumn="0"/>
+              <w:rPr>
+                <w:sz w:val="20"/>
+                <w:szCs w:val="20"/>
+              </w:rPr>
+            </w:pPr>
+            <w:r>
+              <w:rPr>
+                <w:sz w:val="20"/>
+                <w:szCs w:val="20"/>
+              </w:rPr>
+              <w:t>True</w:t>
+            </w:r>
+          </w:p>
+        </w:tc>
+        <w:tc>
+          <w:tcPr>
+            <w:tcW w:w="0" w:type="auto"/>
+          </w:tcPr>
+          <w:p>
+            <w:pPr>
+              <w:cnfStyle w:val="000000000000" w:firstRow="0" w:lastRow="0" w:firstColumn="0" w:lastColumn="0" w:oddVBand="0" w:evenVBand="0" w:oddHBand="0" w:evenHBand="0" w:firstRowFirstColumn="0" w:firstRowLastColumn="0" w:lastRowFirstColumn="0" w:lastRowLastColumn="0"/>
+              <w:rPr>
+                <w:sz w:val="20"/>
+                <w:szCs w:val="20"/>
+              </w:rPr>
+            </w:pPr>
+            <w:r>
+              <w:rPr>
+                <w:sz w:val="20"/>
+                <w:szCs w:val="20"/>
+              </w:rPr>
+              <w:t>PASS</w:t>
+            </w:r>
+          </w:p>
+        </w:tc>
+      </w:tr>
+      <w:tr>
+        <w:trPr>
+          <w:cnfStyle w:val="000000100000" w:firstRow="0" w:lastRow="0" w:firstColumn="0" w:lastColumn="0" w:oddVBand="0" w:evenVBand="0" w:oddHBand="1" w:evenHBand="0" w:firstRowFirstColumn="0" w:firstRowLastColumn="0" w:lastRowFirstColumn="0" w:lastRowLastColumn="0"/>
+        </w:trPr>
+        <w:tc>
+          <w:tcPr>
+            <w:cnfStyle w:val="001000000000" w:firstRow="0" w:lastRow="0" w:firstColumn="1" w:lastColumn="0" w:oddVBand="0" w:evenVBand="0" w:oddHBand="0" w:evenHBand="0" w:firstRowFirstColumn="0" w:firstRowLastColumn="0" w:lastRowFirstColumn="0" w:lastRowLastColumn="0"/>
+            <w:tcW w:w="0" w:type="auto"/>
+          </w:tcPr>
+          <w:p>
+            <w:pPr>
+              <w:rPr>
+                <w:sz w:val="20"/>
+                <w:szCs w:val="20"/>
+              </w:rPr>
+            </w:pPr>
+            <w:r>
+              <w:rPr>
+                <w:sz w:val="20"/>
+                <w:szCs w:val="20"/>
+              </w:rPr>
+              <w:t>TC-AUTO-</w:t>
+            </w:r>
+            <w:r>
+              <w:rPr>
+                <w:sz w:val="20"/>
+                <w:szCs w:val="20"/>
+              </w:rPr>
+              <w:t>11</w:t>
+            </w:r>
+          </w:p>
+        </w:tc>
+        <w:tc>
+          <w:tcPr>
+            <w:tcW w:w="0" w:type="auto"/>
+          </w:tcPr>
+          <w:p>
+            <w:pPr>
+              <w:cnfStyle w:val="000000100000" w:firstRow="0" w:lastRow="0" w:firstColumn="0" w:lastColumn="0" w:oddVBand="0" w:evenVBand="0" w:oddHBand="1" w:evenHBand="0" w:firstRowFirstColumn="0" w:firstRowLastColumn="0" w:lastRowFirstColumn="0" w:lastRowLastColumn="0"/>
+              <w:rPr>
+                <w:sz w:val="20"/>
+                <w:szCs w:val="20"/>
+              </w:rPr>
+            </w:pPr>
+            <w:r>
+              <w:rPr>
+                <w:sz w:val="20"/>
+                <w:szCs w:val="20"/>
+              </w:rPr>
+              <w:t>07/08/2026</w:t>
+            </w:r>
+          </w:p>
+        </w:tc>
+        <w:tc>
+          <w:tcPr>
+            <w:tcW w:w="0" w:type="auto"/>
+          </w:tcPr>
+          <w:p>
+            <w:pPr>
+              <w:cnfStyle w:val="000000100000" w:firstRow="0" w:lastRow="0" w:firstColumn="0" w:lastColumn="0" w:oddVBand="0" w:evenVBand="0" w:oddHBand="1" w:evenHBand="0" w:firstRowFirstColumn="0" w:firstRowLastColumn="0" w:lastRowFirstColumn="0" w:lastRowLastColumn="0"/>
+              <w:rPr>
+                <w:sz w:val="20"/>
+                <w:szCs w:val="20"/>
+              </w:rPr>
+            </w:pPr>
+            <w:r>
+              <w:rPr>
+                <w:sz w:val="20"/>
+                <w:szCs w:val="20"/>
+              </w:rPr>
+              <w:t>PrivacyValidator.IsValidPhone</w:t>
+            </w:r>
+          </w:p>
+        </w:tc>
+        <w:tc>
+          <w:tcPr>
+            <w:tcW w:w="0" w:type="auto"/>
+          </w:tcPr>
+          <w:p>
+            <w:pPr>
+              <w:cnfStyle w:val="000000100000" w:firstRow="0" w:lastRow="0" w:firstColumn="0" w:lastColumn="0" w:oddVBand="0" w:evenVBand="0" w:oddHBand="1" w:evenHBand="0" w:firstRowFirstColumn="0" w:firstRowLastColumn="0" w:lastRowFirstColumn="0" w:lastRowLastColumn="0"/>
+              <w:rPr>
+                <w:sz w:val="20"/>
+                <w:szCs w:val="20"/>
+              </w:rPr>
+            </w:pPr>
+            <w:r>
+              <w:rPr>
+                <w:sz w:val="20"/>
+                <w:szCs w:val="20"/>
+              </w:rPr>
+              <w:t>"123"</w:t>
+            </w:r>
+          </w:p>
+        </w:tc>
+        <w:tc>
+          <w:tcPr>
+            <w:tcW w:w="0" w:type="auto"/>
+          </w:tcPr>
+          <w:p>
+            <w:pPr>
+              <w:cnfStyle w:val="000000100000" w:firstRow="0" w:lastRow="0" w:firstColumn="0" w:lastColumn="0" w:oddVBand="0" w:evenVBand="0" w:oddHBand="1" w:evenHBand="0" w:firstRowFirstColumn="0" w:firstRowLastColumn="0" w:lastRowFirstColumn="0" w:lastRowLastColumn="0"/>
+              <w:rPr>
+                <w:sz w:val="20"/>
+                <w:szCs w:val="20"/>
+              </w:rPr>
+            </w:pPr>
+            <w:r>
+              <w:rPr>
+                <w:sz w:val="20"/>
+                <w:szCs w:val="20"/>
+              </w:rPr>
+              <w:t>False</w:t>
+            </w:r>
+          </w:p>
+        </w:tc>
+        <w:tc>
+          <w:tcPr>
+            <w:tcW w:w="0" w:type="auto"/>
+          </w:tcPr>
+          <w:p>
+            <w:pPr>
+              <w:cnfStyle w:val="000000100000" w:firstRow="0" w:lastRow="0" w:firstColumn="0" w:lastColumn="0" w:oddVBand="0" w:evenVBand="0" w:oddHBand="1" w:evenHBand="0" w:firstRowFirstColumn="0" w:firstRowLastColumn="0" w:lastRowFirstColumn="0" w:lastRowLastColumn="0"/>
+              <w:rPr>
+                <w:sz w:val="20"/>
+                <w:szCs w:val="20"/>
+              </w:rPr>
+            </w:pPr>
+            <w:r>
+              <w:rPr>
+                <w:sz w:val="20"/>
+                <w:szCs w:val="20"/>
+              </w:rPr>
+              <w:t>False</w:t>
+            </w:r>
+          </w:p>
+        </w:tc>
+        <w:tc>
+          <w:tcPr>
+            <w:tcW w:w="0" w:type="auto"/>
+          </w:tcPr>
+          <w:p>
+            <w:pPr>
+              <w:cnfStyle w:val="000000100000" w:firstRow="0" w:lastRow="0" w:firstColumn="0" w:lastColumn="0" w:oddVBand="0" w:evenVBand="0" w:oddHBand="1" w:evenHBand="0" w:firstRowFirstColumn="0" w:firstRowLastColumn="0" w:lastRowFirstColumn="0" w:lastRowLastColumn="0"/>
+              <w:rPr>
+                <w:sz w:val="20"/>
+                <w:szCs w:val="20"/>
+              </w:rPr>
+            </w:pPr>
+            <w:r>
+              <w:rPr>
+                <w:sz w:val="20"/>
+                <w:szCs w:val="20"/>
+              </w:rPr>
+              <w:t>PASS</w:t>
+            </w:r>
+          </w:p>
+        </w:tc>
+      </w:tr>
+      <w:tr>
+        <w:tc>
+          <w:tcPr>
+            <w:cnfStyle w:val="001000000000" w:firstRow="0" w:lastRow="0" w:firstColumn="1" w:lastColumn="0" w:oddVBand="0" w:evenVBand="0" w:oddHBand="0" w:evenHBand="0" w:firstRowFirstColumn="0" w:firstRowLastColumn="0" w:lastRowFirstColumn="0" w:lastRowLastColumn="0"/>
+            <w:tcW w:w="0" w:type="auto"/>
+          </w:tcPr>
+          <w:p>
+            <w:pPr>
+              <w:rPr>
+                <w:sz w:val="20"/>
+                <w:szCs w:val="20"/>
+              </w:rPr>
+            </w:pPr>
+            <w:r>
+              <w:rPr>
+                <w:sz w:val="20"/>
+                <w:szCs w:val="20"/>
+              </w:rPr>
+              <w:t>TC-AUTO-</w:t>
+            </w:r>
+            <w:r>
+              <w:rPr>
+                <w:sz w:val="20"/>
+                <w:szCs w:val="20"/>
+              </w:rPr>
+              <w:t>12</w:t>
+            </w:r>
+          </w:p>
+        </w:tc>
+        <w:tc>
+          <w:tcPr>
+            <w:tcW w:w="0" w:type="auto"/>
+          </w:tcPr>
+          <w:p>
+            <w:pPr>
+              <w:cnfStyle w:val="000000000000" w:firstRow="0" w:lastRow="0" w:firstColumn="0" w:lastColumn="0" w:oddVBand="0" w:evenVBand="0" w:oddHBand="0" w:evenHBand="0" w:firstRowFirstColumn="0" w:firstRowLastColumn="0" w:lastRowFirstColumn="0" w:lastRowLastColumn="0"/>
+              <w:rPr>
+                <w:sz w:val="20"/>
+                <w:szCs w:val="20"/>
+              </w:rPr>
+            </w:pPr>
+            <w:r>
+              <w:rPr>
+                <w:sz w:val="20"/>
+                <w:szCs w:val="20"/>
+              </w:rPr>
+              <w:t>07/08/2026</w:t>
+            </w:r>
+          </w:p>
+        </w:tc>
+        <w:tc>
+          <w:tcPr>
+            <w:tcW w:w="0" w:type="auto"/>
+          </w:tcPr>
+          <w:p>
+            <w:pPr>
+              <w:cnfStyle w:val="000000000000" w:firstRow="0" w:lastRow="0" w:firstColumn="0" w:lastColumn="0" w:oddVBand="0" w:evenVBand="0" w:oddHBand="0" w:evenHBand="0" w:firstRowFirstColumn="0" w:firstRowLastColumn="0" w:lastRowFirstColumn="0" w:lastRowLastColumn="0"/>
+              <w:rPr>
+                <w:sz w:val="20"/>
+                <w:szCs w:val="20"/>
+              </w:rPr>
+            </w:pPr>
+            <w:r>
+              <w:rPr>
+                <w:sz w:val="20"/>
+                <w:szCs w:val="20"/>
+              </w:rPr>
+              <w:t>PrivacyValidator.IsValidPhone</w:t>
+            </w:r>
+          </w:p>
+        </w:tc>
+        <w:tc>
+          <w:tcPr>
+            <w:tcW w:w="0" w:type="auto"/>
+          </w:tcPr>
+          <w:p>
+            <w:pPr>
+              <w:cnfStyle w:val="000000000000" w:firstRow="0" w:lastRow="0" w:firstColumn="0" w:lastColumn="0" w:oddVBand="0" w:evenVBand="0" w:oddHBand="0" w:evenHBand="0" w:firstRowFirstColumn="0" w:firstRowLastColumn="0" w:lastRowFirstColumn="0" w:lastRowLastColumn="0"/>
+              <w:rPr>
+                <w:sz w:val="20"/>
+                <w:szCs w:val="20"/>
+              </w:rPr>
+            </w:pPr>
+            <w:r>
+              <w:rPr>
+                <w:sz w:val="20"/>
+                <w:szCs w:val="20"/>
+              </w:rPr>
+              <w:t>"</w:t>
+            </w:r>
+            <w:proofErr w:type="gramStart"/>
+            <w:r>
+              <w:rPr>
+                <w:sz w:val="20"/>
+                <w:szCs w:val="20"/>
+              </w:rPr>
+              <w:t>abc</w:t>
+            </w:r>
+            <w:proofErr w:type="gramEnd"/>
+            <w:r>
+              <w:rPr>
+                <w:sz w:val="20"/>
+                <w:szCs w:val="20"/>
+              </w:rPr>
+              <w:t>-def-ghij"</w:t>
+            </w:r>
+          </w:p>
+        </w:tc>
+        <w:tc>
+          <w:tcPr>
+            <w:tcW w:w="0" w:type="auto"/>
+          </w:tcPr>
+          <w:p>
+            <w:pPr>
+              <w:cnfStyle w:val="000000000000" w:firstRow="0" w:lastRow="0" w:firstColumn="0" w:lastColumn="0" w:oddVBand="0" w:evenVBand="0" w:oddHBand="0" w:evenHBand="0" w:firstRowFirstColumn="0" w:firstRowLastColumn="0" w:lastRowFirstColumn="0" w:lastRowLastColumn="0"/>
+              <w:rPr>
+                <w:sz w:val="20"/>
+                <w:szCs w:val="20"/>
+              </w:rPr>
+            </w:pPr>
+            <w:r>
+              <w:rPr>
+                <w:sz w:val="20"/>
+                <w:szCs w:val="20"/>
+              </w:rPr>
+              <w:t>False</w:t>
+            </w:r>
+          </w:p>
+        </w:tc>
+        <w:tc>
+          <w:tcPr>
+            <w:tcW w:w="0" w:type="auto"/>
+          </w:tcPr>
+          <w:p>
+            <w:pPr>
+              <w:cnfStyle w:val="000000000000" w:firstRow="0" w:lastRow="0" w:firstColumn="0" w:lastColumn="0" w:oddVBand="0" w:evenVBand="0" w:oddHBand="0" w:evenHBand="0" w:firstRowFirstColumn="0" w:firstRowLastColumn="0" w:lastRowFirstColumn="0" w:lastRowLastColumn="0"/>
+              <w:rPr>
+                <w:sz w:val="20"/>
+                <w:szCs w:val="20"/>
+              </w:rPr>
+            </w:pPr>
+            <w:r>
+              <w:rPr>
+                <w:sz w:val="20"/>
+                <w:szCs w:val="20"/>
+              </w:rPr>
+              <w:t>False</w:t>
+            </w:r>
+          </w:p>
+        </w:tc>
+        <w:tc>
+          <w:tcPr>
+            <w:tcW w:w="0" w:type="auto"/>
+          </w:tcPr>
+          <w:p>
+            <w:pPr>
+              <w:cnfStyle w:val="000000000000" w:firstRow="0" w:lastRow="0" w:firstColumn="0" w:lastColumn="0" w:oddVBand="0" w:evenVBand="0" w:oddHBand="0" w:evenHBand="0" w:firstRowFirstColumn="0" w:firstRowLastColumn="0" w:lastRowFirstColumn="0" w:lastRowLastColumn="0"/>
+              <w:rPr>
+                <w:sz w:val="20"/>
+                <w:szCs w:val="20"/>
+              </w:rPr>
+            </w:pPr>
+            <w:r>
+              <w:rPr>
+                <w:sz w:val="20"/>
+                <w:szCs w:val="20"/>
+              </w:rPr>
+              <w:t>PASS</w:t>
+            </w:r>
+          </w:p>
+        </w:tc>
+      </w:tr>
+      <w:tr>
+        <w:trPr>
+          <w:cnfStyle w:val="000000100000" w:firstRow="0" w:lastRow="0" w:firstColumn="0" w:lastColumn="0" w:oddVBand="0" w:evenVBand="0" w:oddHBand="1" w:evenHBand="0" w:firstRowFirstColumn="0" w:firstRowLastColumn="0" w:lastRowFirstColumn="0" w:lastRowLastColumn="0"/>
+        </w:trPr>
+        <w:tc>
+          <w:tcPr>
+            <w:cnfStyle w:val="001000000000" w:firstRow="0" w:lastRow="0" w:firstColumn="1" w:lastColumn="0" w:oddVBand="0" w:evenVBand="0" w:oddHBand="0" w:evenHBand="0" w:firstRowFirstColumn="0" w:firstRowLastColumn="0" w:lastRowFirstColumn="0" w:lastRowLastColumn="0"/>
+            <w:tcW w:w="0" w:type="auto"/>
+          </w:tcPr>
+          <w:p>
+            <w:pPr>
+              <w:rPr>
+                <w:sz w:val="20"/>
+                <w:szCs w:val="20"/>
+              </w:rPr>
+            </w:pPr>
+            <w:r>
+              <w:rPr>
+                <w:sz w:val="20"/>
+                <w:szCs w:val="20"/>
+              </w:rPr>
+              <w:t>TC-AUTO-</w:t>
+            </w:r>
+            <w:r>
+              <w:rPr>
+                <w:sz w:val="20"/>
+                <w:szCs w:val="20"/>
+              </w:rPr>
+              <w:t>13</w:t>
+            </w:r>
+          </w:p>
+        </w:tc>
+        <w:tc>
+          <w:tcPr>
+            <w:tcW w:w="0" w:type="auto"/>
+          </w:tcPr>
+          <w:p>
+            <w:pPr>
+              <w:cnfStyle w:val="000000100000" w:firstRow="0" w:lastRow="0" w:firstColumn="0" w:lastColumn="0" w:oddVBand="0" w:evenVBand="0" w:oddHBand="1" w:evenHBand="0" w:firstRowFirstColumn="0" w:firstRowLastColumn="0" w:lastRowFirstColumn="0" w:lastRowLastColumn="0"/>
+              <w:rPr>
+                <w:sz w:val="20"/>
+                <w:szCs w:val="20"/>
+              </w:rPr>
+            </w:pPr>
+            <w:r>
+              <w:rPr>
+                <w:sz w:val="20"/>
+                <w:szCs w:val="20"/>
+              </w:rPr>
+              <w:t>07/08/2026</w:t>
+            </w:r>
+          </w:p>
+        </w:tc>
+        <w:tc>
+          <w:tcPr>
+            <w:tcW w:w="0" w:type="auto"/>
+          </w:tcPr>
+          <w:p>
+            <w:pPr>
+              <w:cnfStyle w:val="000000100000" w:firstRow="0" w:lastRow="0" w:firstColumn="0" w:lastColumn="0" w:oddVBand="0" w:evenVBand="0" w:oddHBand="1" w:evenHBand="0" w:firstRowFirstColumn="0" w:firstRowLastColumn="0" w:lastRowFirstColumn="0" w:lastRowLastColumn="0"/>
+              <w:rPr>
+                <w:sz w:val="20"/>
+                <w:szCs w:val="20"/>
+              </w:rPr>
+            </w:pPr>
+            <w:r>
+              <w:rPr>
+                <w:sz w:val="20"/>
+                <w:szCs w:val="20"/>
+              </w:rPr>
+              <w:t>PrivacyValidator.IsValidPhone</w:t>
+            </w:r>
+          </w:p>
+        </w:tc>
+        <w:tc>
+          <w:tcPr>
+            <w:tcW w:w="0" w:type="auto"/>
+          </w:tcPr>
+          <w:p>
+            <w:pPr>
+              <w:cnfStyle w:val="000000100000" w:firstRow="0" w:lastRow="0" w:firstColumn="0" w:lastColumn="0" w:oddVBand="0" w:evenVBand="0" w:oddHBand="1" w:evenHBand="0" w:firstRowFirstColumn="0" w:firstRowLastColumn="0" w:lastRowFirstColumn="0" w:lastRowLastColumn="0"/>
+              <w:rPr>
+                <w:sz w:val="20"/>
+                <w:szCs w:val="20"/>
+              </w:rPr>
+            </w:pPr>
+            <w:r>
+              <w:rPr>
+                <w:sz w:val="20"/>
+                <w:szCs w:val="20"/>
+              </w:rPr>
+              <w:t>"" (Empty string)</w:t>
+            </w:r>
+          </w:p>
+        </w:tc>
+        <w:tc>
+          <w:tcPr>
+            <w:tcW w:w="0" w:type="auto"/>
+          </w:tcPr>
+          <w:p>
+            <w:pPr>
+              <w:cnfStyle w:val="000000100000" w:firstRow="0" w:lastRow="0" w:firstColumn="0" w:lastColumn="0" w:oddVBand="0" w:evenVBand="0" w:oddHBand="1" w:evenHBand="0" w:firstRowFirstColumn="0" w:firstRowLastColumn="0" w:lastRowFirstColumn="0" w:lastRowLastColumn="0"/>
+              <w:rPr>
+                <w:sz w:val="20"/>
+                <w:szCs w:val="20"/>
+              </w:rPr>
+            </w:pPr>
+            <w:r>
+              <w:rPr>
+                <w:sz w:val="20"/>
+                <w:szCs w:val="20"/>
+              </w:rPr>
+              <w:t>False</w:t>
+            </w:r>
+          </w:p>
+        </w:tc>
+        <w:tc>
+          <w:tcPr>
+            <w:tcW w:w="0" w:type="auto"/>
+          </w:tcPr>
+          <w:p>
+            <w:pPr>
+              <w:cnfStyle w:val="000000100000" w:firstRow="0" w:lastRow="0" w:firstColumn="0" w:lastColumn="0" w:oddVBand="0" w:evenVBand="0" w:oddHBand="1" w:evenHBand="0" w:firstRowFirstColumn="0" w:firstRowLastColumn="0" w:lastRowFirstColumn="0" w:lastRowLastColumn="0"/>
+              <w:rPr>
+                <w:sz w:val="20"/>
+                <w:szCs w:val="20"/>
+              </w:rPr>
+            </w:pPr>
+            <w:r>
+              <w:rPr>
+                <w:sz w:val="20"/>
+                <w:szCs w:val="20"/>
+              </w:rPr>
+              <w:t>False</w:t>
+            </w:r>
+          </w:p>
+        </w:tc>
+        <w:tc>
+          <w:tcPr>
+            <w:tcW w:w="0" w:type="auto"/>
+          </w:tcPr>
+          <w:p>
+            <w:pPr>
+              <w:cnfStyle w:val="000000100000" w:firstRow="0" w:lastRow="0" w:firstColumn="0" w:lastColumn="0" w:oddVBand="0" w:evenVBand="0" w:oddHBand="1" w:evenHBand="0" w:firstRowFirstColumn="0" w:firstRowLastColumn="0" w:lastRowFirstColumn="0" w:lastRowLastColumn="0"/>
+              <w:rPr>
+                <w:sz w:val="20"/>
+                <w:szCs w:val="20"/>
+              </w:rPr>
+            </w:pPr>
+            <w:r>
+              <w:rPr>
+                <w:sz w:val="20"/>
+                <w:szCs w:val="20"/>
+              </w:rPr>
+              <w:t>PASS</w:t>
+            </w:r>
+          </w:p>
+        </w:tc>
+      </w:tr>
+      <w:tr>
+        <w:tc>
+          <w:tcPr>
+            <w:cnfStyle w:val="001000000000" w:firstRow="0" w:lastRow="0" w:firstColumn="1" w:lastColumn="0" w:oddVBand="0" w:evenVBand="0" w:oddHBand="0" w:evenHBand="0" w:firstRowFirstColumn="0" w:firstRowLastColumn="0" w:lastRowFirstColumn="0" w:lastRowLastColumn="0"/>
+            <w:tcW w:w="0" w:type="auto"/>
+          </w:tcPr>
+          <w:p>
+            <w:pPr>
+              <w:rPr>
+                <w:sz w:val="20"/>
+                <w:szCs w:val="20"/>
+              </w:rPr>
+            </w:pPr>
+            <w:r>
+              <w:rPr>
+                <w:sz w:val="20"/>
+                <w:szCs w:val="20"/>
+              </w:rPr>
+              <w:t>TC-AUTO-</w:t>
+            </w:r>
+            <w:r>
+              <w:rPr>
+                <w:sz w:val="20"/>
+                <w:szCs w:val="20"/>
+              </w:rPr>
+              <w:t>14</w:t>
+            </w:r>
+          </w:p>
+        </w:tc>
+        <w:tc>
+          <w:tcPr>
+            <w:tcW w:w="0" w:type="auto"/>
+          </w:tcPr>
+          <w:p>
+            <w:pPr>
+              <w:cnfStyle w:val="000000000000" w:firstRow="0" w:lastRow="0" w:firstColumn="0" w:lastColumn="0" w:oddVBand="0" w:evenVBand="0" w:oddHBand="0" w:evenHBand="0" w:firstRowFirstColumn="0" w:firstRowLastColumn="0" w:lastRowFirstColumn="0" w:lastRowLastColumn="0"/>
+              <w:rPr>
+                <w:sz w:val="20"/>
+                <w:szCs w:val="20"/>
+              </w:rPr>
+            </w:pPr>
+            <w:r>
+              <w:rPr>
+                <w:sz w:val="20"/>
+                <w:szCs w:val="20"/>
+              </w:rPr>
+              <w:t>07/08/2026</w:t>
+            </w:r>
+          </w:p>
+        </w:tc>
+        <w:tc>
+          <w:tcPr>
+            <w:tcW w:w="0" w:type="auto"/>
+          </w:tcPr>
+          <w:p>
+            <w:pPr>
+              <w:cnfStyle w:val="000000000000" w:firstRow="0" w:lastRow="0" w:firstColumn="0" w:lastColumn="0" w:oddVBand="0" w:evenVBand="0" w:oddHBand="0" w:evenHBand="0" w:firstRowFirstColumn="0" w:firstRowLastColumn="0" w:lastRowFirstColumn="0" w:lastRowLastColumn="0"/>
+              <w:rPr>
+                <w:sz w:val="20"/>
+                <w:szCs w:val="20"/>
+              </w:rPr>
+            </w:pPr>
+            <w:r>
+              <w:rPr>
+                <w:sz w:val="20"/>
+                <w:szCs w:val="20"/>
+              </w:rPr>
+              <w:t>PrivacyValidator.IsValidPhone</w:t>
+            </w:r>
+          </w:p>
+        </w:tc>
+        <w:tc>
+          <w:tcPr>
+            <w:tcW w:w="0" w:type="auto"/>
+          </w:tcPr>
+          <w:p>
+            <w:pPr>
+              <w:cnfStyle w:val="000000000000" w:firstRow="0" w:lastRow="0" w:firstColumn="0" w:lastColumn="0" w:oddVBand="0" w:evenVBand="0" w:oddHBand="0" w:evenHBand="0" w:firstRowFirstColumn="0" w:firstRowLastColumn="0" w:lastRowFirstColumn="0" w:lastRowLastColumn="0"/>
+              <w:rPr>
+                <w:sz w:val="20"/>
+                <w:szCs w:val="20"/>
+              </w:rPr>
+            </w:pPr>
+            <w:r>
+              <w:rPr>
+                <w:sz w:val="20"/>
+                <w:szCs w:val="20"/>
+              </w:rPr>
+              <w:t>null</w:t>
+            </w:r>
+          </w:p>
+        </w:tc>
+        <w:tc>
+          <w:tcPr>
+            <w:tcW w:w="0" w:type="auto"/>
+          </w:tcPr>
+          <w:p>
+            <w:pPr>
+              <w:cnfStyle w:val="000000000000" w:firstRow="0" w:lastRow="0" w:firstColumn="0" w:lastColumn="0" w:oddVBand="0" w:evenVBand="0" w:oddHBand="0" w:evenHBand="0" w:firstRowFirstColumn="0" w:firstRowLastColumn="0" w:lastRowFirstColumn="0" w:lastRowLastColumn="0"/>
+              <w:rPr>
+                <w:sz w:val="20"/>
+                <w:szCs w:val="20"/>
+              </w:rPr>
+            </w:pPr>
+            <w:r>
+              <w:rPr>
+                <w:sz w:val="20"/>
+                <w:szCs w:val="20"/>
+              </w:rPr>
+              <w:t>False</w:t>
+            </w:r>
+          </w:p>
+        </w:tc>
+        <w:tc>
+          <w:tcPr>
+            <w:tcW w:w="0" w:type="auto"/>
+          </w:tcPr>
+          <w:p>
+            <w:pPr>
+              <w:cnfStyle w:val="000000000000" w:firstRow="0" w:lastRow="0" w:firstColumn="0" w:lastColumn="0" w:oddVBand="0" w:evenVBand="0" w:oddHBand="0" w:evenHBand="0" w:firstRowFirstColumn="0" w:firstRowLastColumn="0" w:lastRowFirstColumn="0" w:lastRowLastColumn="0"/>
+              <w:rPr>
+                <w:sz w:val="20"/>
+                <w:szCs w:val="20"/>
+              </w:rPr>
+            </w:pPr>
+            <w:r>
+              <w:rPr>
+                <w:sz w:val="20"/>
+                <w:szCs w:val="20"/>
+              </w:rPr>
+              <w:t>False</w:t>
+            </w:r>
+          </w:p>
+        </w:tc>
+        <w:tc>
+          <w:tcPr>
+            <w:tcW w:w="0" w:type="auto"/>
+          </w:tcPr>
+          <w:p>
+            <w:pPr>
+              <w:cnfStyle w:val="000000000000" w:firstRow="0" w:lastRow="0" w:firstColumn="0" w:lastColumn="0" w:oddVBand="0" w:evenVBand="0" w:oddHBand="0" w:evenHBand="0" w:firstRowFirstColumn="0" w:firstRowLastColumn="0" w:lastRowFirstColumn="0" w:lastRowLastColumn="0"/>
+              <w:rPr>
+                <w:sz w:val="20"/>
+                <w:szCs w:val="20"/>
+              </w:rPr>
+            </w:pPr>
+            <w:r>
+              <w:rPr>
+                <w:sz w:val="20"/>
+                <w:szCs w:val="20"/>
+              </w:rPr>
+              <w:t>PASS</w:t>
+            </w:r>
+          </w:p>
+        </w:tc>
+      </w:tr>
+      <w:tr>
+        <w:trPr>
+          <w:cnfStyle w:val="000000100000" w:firstRow="0" w:lastRow="0" w:firstColumn="0" w:lastColumn="0" w:oddVBand="0" w:evenVBand="0" w:oddHBand="1" w:evenHBand="0" w:firstRowFirstColumn="0" w:firstRowLastColumn="0" w:lastRowFirstColumn="0" w:lastRowLastColumn="0"/>
+        </w:trPr>
+        <w:tc>
+          <w:tcPr>
+            <w:cnfStyle w:val="001000000000" w:firstRow="0" w:lastRow="0" w:firstColumn="1" w:lastColumn="0" w:oddVBand="0" w:evenVBand="0" w:oddHBand="0" w:evenHBand="0" w:firstRowFirstColumn="0" w:firstRowLastColumn="0" w:lastRowFirstColumn="0" w:lastRowLastColumn="0"/>
+            <w:tcW w:w="0" w:type="auto"/>
+          </w:tcPr>
+          <w:p>
+            <w:pPr>
+              <w:rPr>
+                <w:sz w:val="20"/>
+                <w:szCs w:val="20"/>
+              </w:rPr>
+            </w:pPr>
+            <w:r>
+              <w:rPr>
+                <w:sz w:val="20"/>
+                <w:szCs w:val="20"/>
+              </w:rPr>
+              <w:t>TC-AUTO-</w:t>
+            </w:r>
+            <w:r>
+              <w:rPr>
+                <w:sz w:val="20"/>
+                <w:szCs w:val="20"/>
+              </w:rPr>
+              <w:t>15</w:t>
+            </w:r>
+          </w:p>
+        </w:tc>
+        <w:tc>
+          <w:tcPr>
+            <w:tcW w:w="0" w:type="auto"/>
+          </w:tcPr>
+          <w:p>
+            <w:pPr>
+              <w:cnfStyle w:val="000000100000" w:firstRow="0" w:lastRow="0" w:firstColumn="0" w:lastColumn="0" w:oddVBand="0" w:evenVBand="0" w:oddHBand="1" w:evenHBand="0" w:firstRowFirstColumn="0" w:firstRowLastColumn="0" w:lastRowFirstColumn="0" w:lastRowLastColumn="0"/>
+              <w:rPr>
+                <w:sz w:val="20"/>
+                <w:szCs w:val="20"/>
+              </w:rPr>
+            </w:pPr>
+            <w:r>
+              <w:rPr>
+                <w:sz w:val="20"/>
+                <w:szCs w:val="20"/>
+              </w:rPr>
+              <w:t>07/08/2026</w:t>
+            </w:r>
+          </w:p>
+        </w:tc>
+        <w:tc>
+          <w:tcPr>
+            <w:tcW w:w="0" w:type="auto"/>
+          </w:tcPr>
+          <w:p>
+            <w:pPr>
+              <w:cnfStyle w:val="000000100000" w:firstRow="0" w:lastRow="0" w:firstColumn="0" w:lastColumn="0" w:oddVBand="0" w:evenVBand="0" w:oddHBand="1" w:evenHBand="0" w:firstRowFirstColumn="0" w:firstRowLastColumn="0" w:lastRowFirstColumn="0" w:lastRowLastColumn="0"/>
+              <w:rPr>
+                <w:sz w:val="20"/>
+                <w:szCs w:val="20"/>
+              </w:rPr>
+            </w:pPr>
+            <w:r>
+              <w:rPr>
+                <w:sz w:val="20"/>
+                <w:szCs w:val="20"/>
+              </w:rPr>
+              <w:t>PrivacyValidator.IsValidContact</w:t>
+            </w:r>
+          </w:p>
+        </w:tc>
+        <w:tc>
+          <w:tcPr>
+            <w:tcW w:w="0" w:type="auto"/>
+          </w:tcPr>
+          <w:p>
+            <w:pPr>
+              <w:tabs>
+                <w:tab w:val="left" w:pos="185"/>
+              </w:tabs>
+              <w:cnfStyle w:val="000000100000" w:firstRow="0" w:lastRow="0" w:firstColumn="0" w:lastColumn="0" w:oddVBand="0" w:evenVBand="0" w:oddHBand="1" w:evenHBand="0" w:firstRowFirstColumn="0" w:firstRowLastColumn="0" w:lastRowFirstColumn="0" w:lastRowLastColumn="0"/>
+              <w:rPr>
+                <w:sz w:val="20"/>
+                <w:szCs w:val="20"/>
+              </w:rPr>
+            </w:pPr>
+            <w:r>
+              <w:rPr>
+                <w:sz w:val="20"/>
+                <w:szCs w:val="20"/>
+              </w:rPr>
+              <w:tab/>
+            </w:r>
+            <w:r>
+              <w:rPr>
+                <w:sz w:val="20"/>
+                <w:szCs w:val="20"/>
+              </w:rPr>
+              <w:t>"alex@test.nz"</w:t>
+            </w:r>
+          </w:p>
+        </w:tc>
+        <w:tc>
+          <w:tcPr>
+            <w:tcW w:w="0" w:type="auto"/>
+          </w:tcPr>
+          <w:p>
+            <w:pPr>
+              <w:cnfStyle w:val="000000100000" w:firstRow="0" w:lastRow="0" w:firstColumn="0" w:lastColumn="0" w:oddVBand="0" w:evenVBand="0" w:oddHBand="1" w:evenHBand="0" w:firstRowFirstColumn="0" w:firstRowLastColumn="0" w:lastRowFirstColumn="0" w:lastRowLastColumn="0"/>
+              <w:rPr>
+                <w:sz w:val="20"/>
+                <w:szCs w:val="20"/>
+              </w:rPr>
+            </w:pPr>
+            <w:r>
+              <w:rPr>
+                <w:sz w:val="20"/>
+                <w:szCs w:val="20"/>
+              </w:rPr>
+              <w:t>True</w:t>
+            </w:r>
+          </w:p>
+        </w:tc>
+        <w:tc>
+          <w:tcPr>
+            <w:tcW w:w="0" w:type="auto"/>
+          </w:tcPr>
+          <w:p>
+            <w:pPr>
+              <w:cnfStyle w:val="000000100000" w:firstRow="0" w:lastRow="0" w:firstColumn="0" w:lastColumn="0" w:oddVBand="0" w:evenVBand="0" w:oddHBand="1" w:evenHBand="0" w:firstRowFirstColumn="0" w:firstRowLastColumn="0" w:lastRowFirstColumn="0" w:lastRowLastColumn="0"/>
+              <w:rPr>
+                <w:sz w:val="20"/>
+                <w:szCs w:val="20"/>
+              </w:rPr>
+            </w:pPr>
+            <w:r>
+              <w:rPr>
+                <w:sz w:val="20"/>
+                <w:szCs w:val="20"/>
+              </w:rPr>
+              <w:t>True</w:t>
+            </w:r>
+          </w:p>
+        </w:tc>
+        <w:tc>
+          <w:tcPr>
+            <w:tcW w:w="0" w:type="auto"/>
+          </w:tcPr>
+          <w:p>
+            <w:pPr>
+              <w:cnfStyle w:val="000000100000" w:firstRow="0" w:lastRow="0" w:firstColumn="0" w:lastColumn="0" w:oddVBand="0" w:evenVBand="0" w:oddHBand="1" w:evenHBand="0" w:firstRowFirstColumn="0" w:firstRowLastColumn="0" w:lastRowFirstColumn="0" w:lastRowLastColumn="0"/>
+              <w:rPr>
+                <w:sz w:val="20"/>
+                <w:szCs w:val="20"/>
+              </w:rPr>
+            </w:pPr>
+            <w:r>
+              <w:rPr>
+                <w:sz w:val="20"/>
+                <w:szCs w:val="20"/>
+              </w:rPr>
+              <w:t>PASS</w:t>
+            </w:r>
+          </w:p>
+        </w:tc>
+      </w:tr>
+      <w:tr>
+        <w:tc>
+          <w:tcPr>
+            <w:cnfStyle w:val="001000000000" w:firstRow="0" w:lastRow="0" w:firstColumn="1" w:lastColumn="0" w:oddVBand="0" w:evenVBand="0" w:oddHBand="0" w:evenHBand="0" w:firstRowFirstColumn="0" w:firstRowLastColumn="0" w:lastRowFirstColumn="0" w:lastRowLastColumn="0"/>
+            <w:tcW w:w="0" w:type="auto"/>
+          </w:tcPr>
+          <w:p>
+            <w:pPr>
+              <w:rPr>
+                <w:sz w:val="20"/>
+                <w:szCs w:val="20"/>
+              </w:rPr>
+            </w:pPr>
+            <w:r>
+              <w:rPr>
+                <w:sz w:val="20"/>
+                <w:szCs w:val="20"/>
+              </w:rPr>
+              <w:t>TC-AUTO-</w:t>
+            </w:r>
+            <w:r>
+              <w:rPr>
+                <w:sz w:val="20"/>
+                <w:szCs w:val="20"/>
+              </w:rPr>
+              <w:t>16</w:t>
+            </w:r>
+          </w:p>
+        </w:tc>
+        <w:tc>
+          <w:tcPr>
+            <w:tcW w:w="0" w:type="auto"/>
+          </w:tcPr>
+          <w:p>
+            <w:pPr>
+              <w:cnfStyle w:val="000000000000" w:firstRow="0" w:lastRow="0" w:firstColumn="0" w:lastColumn="0" w:oddVBand="0" w:evenVBand="0" w:oddHBand="0" w:evenHBand="0" w:firstRowFirstColumn="0" w:firstRowLastColumn="0" w:lastRowFirstColumn="0" w:lastRowLastColumn="0"/>
+              <w:rPr>
+                <w:sz w:val="20"/>
+                <w:szCs w:val="20"/>
+              </w:rPr>
+            </w:pPr>
+            <w:r>
+              <w:rPr>
+                <w:sz w:val="20"/>
+                <w:szCs w:val="20"/>
+              </w:rPr>
+              <w:t>07/08/2026</w:t>
+            </w:r>
+          </w:p>
+        </w:tc>
+        <w:tc>
+          <w:tcPr>
+            <w:tcW w:w="0" w:type="auto"/>
+          </w:tcPr>
+          <w:p>
+            <w:pPr>
+              <w:cnfStyle w:val="000000000000" w:firstRow="0" w:lastRow="0" w:firstColumn="0" w:lastColumn="0" w:oddVBand="0" w:evenVBand="0" w:oddHBand="0" w:evenHBand="0" w:firstRowFirstColumn="0" w:firstRowLastColumn="0" w:lastRowFirstColumn="0" w:lastRowLastColumn="0"/>
+              <w:rPr>
+                <w:sz w:val="20"/>
+                <w:szCs w:val="20"/>
+              </w:rPr>
+            </w:pPr>
+            <w:r>
+              <w:rPr>
+                <w:sz w:val="20"/>
+                <w:szCs w:val="20"/>
+              </w:rPr>
+              <w:t>PrivacyValidator.IsValidContact</w:t>
+            </w:r>
+          </w:p>
+        </w:tc>
+        <w:tc>
+          <w:tcPr>
+            <w:tcW w:w="0" w:type="auto"/>
+          </w:tcPr>
+          <w:p>
+            <w:pPr>
+              <w:cnfStyle w:val="000000000000" w:firstRow="0" w:lastRow="0" w:firstColumn="0" w:lastColumn="0" w:oddVBand="0" w:evenVBand="0" w:oddHBand="0" w:evenHBand="0" w:firstRowFirstColumn="0" w:firstRowLastColumn="0" w:lastRowFirstColumn="0" w:lastRowLastColumn="0"/>
+              <w:rPr>
+                <w:sz w:val="20"/>
+                <w:szCs w:val="20"/>
+              </w:rPr>
+            </w:pPr>
+            <w:r>
+              <w:rPr>
+                <w:sz w:val="20"/>
+                <w:szCs w:val="20"/>
+              </w:rPr>
+              <w:t>"</w:t>
+            </w:r>
+            <w:proofErr w:type="gramStart"/>
+            <w:r>
+              <w:rPr>
+                <w:sz w:val="20"/>
+                <w:szCs w:val="20"/>
+              </w:rPr>
+              <w:t>not</w:t>
+            </w:r>
+            <w:proofErr w:type="gramEnd"/>
+            <w:r>
+              <w:rPr>
+                <w:sz w:val="20"/>
+                <w:szCs w:val="20"/>
+              </w:rPr>
+              <w:t>-a-valid-contact"</w:t>
+            </w:r>
+          </w:p>
+        </w:tc>
+        <w:tc>
+          <w:tcPr>
+            <w:tcW w:w="0" w:type="auto"/>
+          </w:tcPr>
+          <w:p>
+            <w:pPr>
+              <w:cnfStyle w:val="000000000000" w:firstRow="0" w:lastRow="0" w:firstColumn="0" w:lastColumn="0" w:oddVBand="0" w:evenVBand="0" w:oddHBand="0" w:evenHBand="0" w:firstRowFirstColumn="0" w:firstRowLastColumn="0" w:lastRowFirstColumn="0" w:lastRowLastColumn="0"/>
+              <w:rPr>
+                <w:sz w:val="20"/>
+                <w:szCs w:val="20"/>
+              </w:rPr>
+            </w:pPr>
+            <w:r>
+              <w:rPr>
+                <w:sz w:val="20"/>
+                <w:szCs w:val="20"/>
+              </w:rPr>
+              <w:t>False</w:t>
+            </w:r>
+          </w:p>
+        </w:tc>
+        <w:tc>
+          <w:tcPr>
+            <w:tcW w:w="0" w:type="auto"/>
+          </w:tcPr>
+          <w:p>
+            <w:pPr>
+              <w:cnfStyle w:val="000000000000" w:firstRow="0" w:lastRow="0" w:firstColumn="0" w:lastColumn="0" w:oddVBand="0" w:evenVBand="0" w:oddHBand="0" w:evenHBand="0" w:firstRowFirstColumn="0" w:firstRowLastColumn="0" w:lastRowFirstColumn="0" w:lastRowLastColumn="0"/>
+              <w:rPr>
+                <w:sz w:val="20"/>
+                <w:szCs w:val="20"/>
+              </w:rPr>
+            </w:pPr>
+            <w:r>
+              <w:rPr>
+                <w:sz w:val="20"/>
+                <w:szCs w:val="20"/>
+              </w:rPr>
+              <w:t>False</w:t>
+            </w:r>
+          </w:p>
+        </w:tc>
+        <w:tc>
+          <w:tcPr>
+            <w:tcW w:w="0" w:type="auto"/>
+          </w:tcPr>
+          <w:p>
+            <w:pPr>
+              <w:cnfStyle w:val="000000000000" w:firstRow="0" w:lastRow="0" w:firstColumn="0" w:lastColumn="0" w:oddVBand="0" w:evenVBand="0" w:oddHBand="0" w:evenHBand="0" w:firstRowFirstColumn="0" w:firstRowLastColumn="0" w:lastRowFirstColumn="0" w:lastRowLastColumn="0"/>
+              <w:rPr>
+                <w:sz w:val="20"/>
+                <w:szCs w:val="20"/>
+              </w:rPr>
+            </w:pPr>
+            <w:r>
+              <w:rPr>
+                <w:sz w:val="20"/>
+                <w:szCs w:val="20"/>
+              </w:rPr>
+              <w:t>PASS</w:t>
+            </w:r>
+          </w:p>
+        </w:tc>
+      </w:tr>
+      <w:tr>
+        <w:trPr>
+          <w:cnfStyle w:val="000000100000" w:firstRow="0" w:lastRow="0" w:firstColumn="0" w:lastColumn="0" w:oddVBand="0" w:evenVBand="0" w:oddHBand="1" w:evenHBand="0" w:firstRowFirstColumn="0" w:firstRowLastColumn="0" w:lastRowFirstColumn="0" w:lastRowLastColumn="0"/>
+        </w:trPr>
+        <w:tc>
+          <w:tcPr>
+            <w:cnfStyle w:val="001000000000" w:firstRow="0" w:lastRow="0" w:firstColumn="1" w:lastColumn="0" w:oddVBand="0" w:evenVBand="0" w:oddHBand="0" w:evenHBand="0" w:firstRowFirstColumn="0" w:firstRowLastColumn="0" w:lastRowFirstColumn="0" w:lastRowLastColumn="0"/>
+            <w:tcW w:w="0" w:type="auto"/>
+          </w:tcPr>
+          <w:p>
+            <w:pPr>
+              <w:rPr>
+                <w:sz w:val="20"/>
+                <w:szCs w:val="20"/>
+              </w:rPr>
+            </w:pPr>
+          </w:p>
+        </w:tc>
+        <w:tc>
+          <w:tcPr>
+            <w:tcW w:w="0" w:type="auto"/>
+          </w:tcPr>
+          <w:p>
+            <w:pPr>
+              <w:cnfStyle w:val="000000100000" w:firstRow="0" w:lastRow="0" w:firstColumn="0" w:lastColumn="0" w:oddVBand="0" w:evenVBand="0" w:oddHBand="1" w:evenHBand="0" w:firstRowFirstColumn="0" w:firstRowLastColumn="0" w:lastRowFirstColumn="0" w:lastRowLastColumn="0"/>
+              <w:rPr>
+                <w:sz w:val="20"/>
+                <w:szCs w:val="20"/>
+              </w:rPr>
+            </w:pPr>
+          </w:p>
+        </w:tc>
+        <w:tc>
+          <w:tcPr>
+            <w:tcW w:w="0" w:type="auto"/>
+          </w:tcPr>
+          <w:p>
+            <w:pPr>
+              <w:cnfStyle w:val="000000100000" w:firstRow="0" w:lastRow="0" w:firstColumn="0" w:lastColumn="0" w:oddVBand="0" w:evenVBand="0" w:oddHBand="1" w:evenHBand="0" w:firstRowFirstColumn="0" w:firstRowLastColumn="0" w:lastRowFirstColumn="0" w:lastRowLastColumn="0"/>
+              <w:rPr>
+                <w:sz w:val="20"/>
+                <w:szCs w:val="20"/>
+              </w:rPr>
+            </w:pPr>
+          </w:p>
+        </w:tc>
+        <w:tc>
+          <w:tcPr>
+            <w:tcW w:w="0" w:type="auto"/>
+          </w:tcPr>
+          <w:p>
+            <w:pPr>
+              <w:cnfStyle w:val="000000100000" w:firstRow="0" w:lastRow="0" w:firstColumn="0" w:lastColumn="0" w:oddVBand="0" w:evenVBand="0" w:oddHBand="1" w:evenHBand="0" w:firstRowFirstColumn="0" w:firstRowLastColumn="0" w:lastRowFirstColumn="0" w:lastRowLastColumn="0"/>
+              <w:rPr>
+                <w:sz w:val="20"/>
+                <w:szCs w:val="20"/>
+              </w:rPr>
+            </w:pPr>
+          </w:p>
+        </w:tc>
+        <w:tc>
+          <w:tcPr>
+            <w:tcW w:w="0" w:type="auto"/>
+          </w:tcPr>
+          <w:p>
+            <w:pPr>
+              <w:cnfStyle w:val="000000100000" w:firstRow="0" w:lastRow="0" w:firstColumn="0" w:lastColumn="0" w:oddVBand="0" w:evenVBand="0" w:oddHBand="1" w:evenHBand="0" w:firstRowFirstColumn="0" w:firstRowLastColumn="0" w:lastRowFirstColumn="0" w:lastRowLastColumn="0"/>
+              <w:rPr>
+                <w:sz w:val="20"/>
+                <w:szCs w:val="20"/>
+              </w:rPr>
+            </w:pPr>
+          </w:p>
+        </w:tc>
+        <w:tc>
+          <w:tcPr>
+            <w:tcW w:w="0" w:type="auto"/>
+          </w:tcPr>
+          <w:p>
+            <w:pPr>
+              <w:cnfStyle w:val="000000100000" w:firstRow="0" w:lastRow="0" w:firstColumn="0" w:lastColumn="0" w:oddVBand="0" w:evenVBand="0" w:oddHBand="1" w:evenHBand="0" w:firstRowFirstColumn="0" w:firstRowLastColumn="0" w:lastRowFirstColumn="0" w:lastRowLastColumn="0"/>
+              <w:rPr>
+                <w:sz w:val="20"/>
+                <w:szCs w:val="20"/>
+              </w:rPr>
+            </w:pPr>
+          </w:p>
+        </w:tc>
+        <w:tc>
+          <w:tcPr>
+            <w:tcW w:w="0" w:type="auto"/>
+          </w:tcPr>
+          <w:p>
+            <w:pPr>
+              <w:cnfStyle w:val="000000100000" w:firstRow="0" w:lastRow="0" w:firstColumn="0" w:lastColumn="0" w:oddVBand="0" w:evenVBand="0" w:oddHBand="1" w:evenHBand="0" w:firstRowFirstColumn="0" w:firstRowLastColumn="0" w:lastRowFirstColumn="0" w:lastRowLastColumn="0"/>
+              <w:rPr>
+                <w:sz w:val="20"/>
+                <w:szCs w:val="20"/>
+              </w:rPr>
+            </w:pPr>
           </w:p>
         </w:tc>
       </w:tr>
@@ -1464,23 +3484,7 @@
                 <w:sz w:val="20"/>
                 <w:szCs w:val="20"/>
               </w:rPr>
-              <w:t xml:space="preserve">Review </w:t>
-            </w:r>
-            <w:proofErr w:type="spellStart"/>
-            <w:r>
-              <w:rPr>
-                <w:sz w:val="20"/>
-                <w:szCs w:val="20"/>
-              </w:rPr>
-              <w:t>VolunteerRegistration.cs</w:t>
-            </w:r>
-            <w:proofErr w:type="spellEnd"/>
-            <w:r>
-              <w:rPr>
-                <w:sz w:val="20"/>
-                <w:szCs w:val="20"/>
-              </w:rPr>
-              <w:t xml:space="preserve"> properties</w:t>
+              <w:t>Review VolunteerRegistration.cs properties</w:t>
             </w:r>
           </w:p>
         </w:tc>
@@ -1579,199 +3583,191 @@
                 <w:sz w:val="20"/>
                 <w:szCs w:val="20"/>
               </w:rPr>
-              <w:t>TC-MAN-0</w:t>
-            </w:r>
-            <w:r>
+              <w:lastRenderedPageBreak/>
+              <w:t>TC-MAN-03</w:t>
+            </w:r>
+          </w:p>
+        </w:tc>
+        <w:tc>
+          <w:tcPr>
+            <w:tcW w:w="0" w:type="auto"/>
+          </w:tcPr>
+          <w:p>
+            <w:pPr>
+              <w:cnfStyle w:val="000000100000" w:firstRow="0" w:lastRow="0" w:firstColumn="0" w:lastColumn="0" w:oddVBand="0" w:evenVBand="0" w:oddHBand="1" w:evenHBand="0" w:firstRowFirstColumn="0" w:firstRowLastColumn="0" w:lastRowFirstColumn="0" w:lastRowLastColumn="0"/>
+              <w:rPr>
+                <w:sz w:val="20"/>
+                <w:szCs w:val="20"/>
+              </w:rPr>
+            </w:pPr>
+            <w:r>
+              <w:rPr>
+                <w:sz w:val="20"/>
+                <w:szCs w:val="20"/>
+              </w:rPr>
+              <w:t>05/08/2026</w:t>
+            </w:r>
+          </w:p>
+        </w:tc>
+        <w:tc>
+          <w:tcPr>
+            <w:tcW w:w="0" w:type="auto"/>
+          </w:tcPr>
+          <w:p>
+            <w:pPr>
+              <w:cnfStyle w:val="000000100000" w:firstRow="0" w:lastRow="0" w:firstColumn="0" w:lastColumn="0" w:oddVBand="0" w:evenVBand="0" w:oddHBand="1" w:evenHBand="0" w:firstRowFirstColumn="0" w:firstRowLastColumn="0" w:lastRowFirstColumn="0" w:lastRowLastColumn="0"/>
+              <w:rPr>
+                <w:sz w:val="20"/>
+                <w:szCs w:val="20"/>
+              </w:rPr>
+            </w:pPr>
+            <w:r>
+              <w:rPr>
+                <w:sz w:val="20"/>
+                <w:szCs w:val="20"/>
+              </w:rPr>
+              <w:t>Shell Navigation</w:t>
+            </w:r>
+          </w:p>
+          <w:p>
+            <w:pPr>
+              <w:jc w:val="center"/>
+              <w:cnfStyle w:val="000000100000" w:firstRow="0" w:lastRow="0" w:firstColumn="0" w:lastColumn="0" w:oddVBand="0" w:evenVBand="0" w:oddHBand="1" w:evenHBand="0" w:firstRowFirstColumn="0" w:firstRowLastColumn="0" w:lastRowFirstColumn="0" w:lastRowLastColumn="0"/>
+              <w:rPr>
+                <w:sz w:val="20"/>
+                <w:szCs w:val="20"/>
+              </w:rPr>
+            </w:pPr>
+          </w:p>
+        </w:tc>
+        <w:tc>
+          <w:tcPr>
+            <w:tcW w:w="0" w:type="auto"/>
+          </w:tcPr>
+          <w:p>
+            <w:pPr>
+              <w:cnfStyle w:val="000000100000" w:firstRow="0" w:lastRow="0" w:firstColumn="0" w:lastColumn="0" w:oddVBand="0" w:evenVBand="0" w:oddHBand="1" w:evenHBand="0" w:firstRowFirstColumn="0" w:firstRowLastColumn="0" w:lastRowFirstColumn="0" w:lastRowLastColumn="0"/>
+              <w:rPr>
+                <w:sz w:val="20"/>
+                <w:szCs w:val="20"/>
+              </w:rPr>
+            </w:pPr>
+            <w:r>
+              <w:rPr>
+                <w:sz w:val="20"/>
+                <w:szCs w:val="20"/>
+              </w:rPr>
+              <w:t>Tab Selection</w:t>
+            </w:r>
+          </w:p>
+        </w:tc>
+        <w:tc>
+          <w:tcPr>
+            <w:tcW w:w="0" w:type="auto"/>
+          </w:tcPr>
+          <w:p>
+            <w:pPr>
+              <w:cnfStyle w:val="000000100000" w:firstRow="0" w:lastRow="0" w:firstColumn="0" w:lastColumn="0" w:oddVBand="0" w:evenVBand="0" w:oddHBand="1" w:evenHBand="0" w:firstRowFirstColumn="0" w:firstRowLastColumn="0" w:lastRowFirstColumn="0" w:lastRowLastColumn="0"/>
+              <w:rPr>
+                <w:sz w:val="20"/>
+                <w:szCs w:val="20"/>
+              </w:rPr>
+            </w:pPr>
+            <w:r>
+              <w:rPr>
+                <w:sz w:val="20"/>
+                <w:szCs w:val="20"/>
+              </w:rPr>
+              <w:t>Tap 'Opportunities', 'My Registrations', and 'Privacy' tabs</w:t>
+            </w:r>
+          </w:p>
+        </w:tc>
+        <w:tc>
+          <w:tcPr>
+            <w:tcW w:w="0" w:type="auto"/>
+          </w:tcPr>
+          <w:p>
+            <w:pPr>
+              <w:cnfStyle w:val="000000100000" w:firstRow="0" w:lastRow="0" w:firstColumn="0" w:lastColumn="0" w:oddVBand="0" w:evenVBand="0" w:oddHBand="1" w:evenHBand="0" w:firstRowFirstColumn="0" w:firstRowLastColumn="0" w:lastRowFirstColumn="0" w:lastRowLastColumn="0"/>
+              <w:rPr>
+                <w:sz w:val="20"/>
+                <w:szCs w:val="20"/>
+              </w:rPr>
+            </w:pPr>
+            <w:r>
+              <w:rPr>
+                <w:sz w:val="20"/>
+                <w:szCs w:val="20"/>
+              </w:rPr>
+              <w:t>Smooth navigation across all 4 primary Shell tabs</w:t>
+            </w:r>
+          </w:p>
+        </w:tc>
+        <w:tc>
+          <w:tcPr>
+            <w:tcW w:w="0" w:type="auto"/>
+          </w:tcPr>
+          <w:p>
+            <w:pPr>
+              <w:cnfStyle w:val="000000100000" w:firstRow="0" w:lastRow="0" w:firstColumn="0" w:lastColumn="0" w:oddVBand="0" w:evenVBand="0" w:oddHBand="1" w:evenHBand="0" w:firstRowFirstColumn="0" w:firstRowLastColumn="0" w:lastRowFirstColumn="0" w:lastRowLastColumn="0"/>
+              <w:rPr>
+                <w:sz w:val="20"/>
+                <w:szCs w:val="20"/>
+              </w:rPr>
+            </w:pPr>
+            <w:r>
+              <w:rPr>
+                <w:sz w:val="20"/>
+                <w:szCs w:val="20"/>
+              </w:rPr>
+              <w:t>App navigated smoothly between all bottom bar tabs</w:t>
+            </w:r>
+          </w:p>
+        </w:tc>
+        <w:tc>
+          <w:tcPr>
+            <w:tcW w:w="0" w:type="auto"/>
+          </w:tcPr>
+          <w:p>
+            <w:pPr>
+              <w:cnfStyle w:val="000000100000" w:firstRow="0" w:lastRow="0" w:firstColumn="0" w:lastColumn="0" w:oddVBand="0" w:evenVBand="0" w:oddHBand="1" w:evenHBand="0" w:firstRowFirstColumn="0" w:firstRowLastColumn="0" w:lastRowFirstColumn="0" w:lastRowLastColumn="0"/>
+              <w:rPr>
+                <w:sz w:val="20"/>
+                <w:szCs w:val="20"/>
+              </w:rPr>
+            </w:pPr>
+            <w:r>
+              <w:rPr>
+                <w:sz w:val="20"/>
+                <w:szCs w:val="20"/>
+              </w:rPr>
+              <w:t>PASS</w:t>
+            </w:r>
+          </w:p>
+        </w:tc>
+      </w:tr>
+      <w:tr>
+        <w:tc>
+          <w:tcPr>
+            <w:cnfStyle w:val="001000000000" w:firstRow="0" w:lastRow="0" w:firstColumn="1" w:lastColumn="0" w:oddVBand="0" w:evenVBand="0" w:oddHBand="0" w:evenHBand="0" w:firstRowFirstColumn="0" w:firstRowLastColumn="0" w:lastRowFirstColumn="0" w:lastRowLastColumn="0"/>
+            <w:tcW w:w="0" w:type="auto"/>
+          </w:tcPr>
+          <w:p>
+            <w:pPr>
               <w:rPr>
                 <w:b w:val="0"/>
                 <w:bCs w:val="0"/>
                 <w:sz w:val="20"/>
                 <w:szCs w:val="20"/>
               </w:rPr>
-              <w:t>3</w:t>
-            </w:r>
-          </w:p>
-        </w:tc>
-        <w:tc>
-          <w:tcPr>
-            <w:tcW w:w="0" w:type="auto"/>
-          </w:tcPr>
-          <w:p>
-            <w:pPr>
-              <w:cnfStyle w:val="000000100000" w:firstRow="0" w:lastRow="0" w:firstColumn="0" w:lastColumn="0" w:oddVBand="0" w:evenVBand="0" w:oddHBand="1" w:evenHBand="0" w:firstRowFirstColumn="0" w:firstRowLastColumn="0" w:lastRowFirstColumn="0" w:lastRowLastColumn="0"/>
-              <w:rPr>
-                <w:sz w:val="20"/>
-                <w:szCs w:val="20"/>
-              </w:rPr>
-            </w:pPr>
-            <w:r>
-              <w:rPr>
-                <w:sz w:val="20"/>
-                <w:szCs w:val="20"/>
-              </w:rPr>
-              <w:t>05/08/2026</w:t>
-            </w:r>
-          </w:p>
-        </w:tc>
-        <w:tc>
-          <w:tcPr>
-            <w:tcW w:w="0" w:type="auto"/>
-          </w:tcPr>
-          <w:p>
-            <w:pPr>
-              <w:cnfStyle w:val="000000100000" w:firstRow="0" w:lastRow="0" w:firstColumn="0" w:lastColumn="0" w:oddVBand="0" w:evenVBand="0" w:oddHBand="1" w:evenHBand="0" w:firstRowFirstColumn="0" w:firstRowLastColumn="0" w:lastRowFirstColumn="0" w:lastRowLastColumn="0"/>
-              <w:rPr>
-                <w:sz w:val="20"/>
-                <w:szCs w:val="20"/>
-              </w:rPr>
-            </w:pPr>
-            <w:r>
-              <w:rPr>
-                <w:sz w:val="20"/>
-                <w:szCs w:val="20"/>
-              </w:rPr>
-              <w:t>Shell Navigation</w:t>
-            </w:r>
-          </w:p>
-          <w:p>
-            <w:pPr>
-              <w:jc w:val="center"/>
-              <w:cnfStyle w:val="000000100000" w:firstRow="0" w:lastRow="0" w:firstColumn="0" w:lastColumn="0" w:oddVBand="0" w:evenVBand="0" w:oddHBand="1" w:evenHBand="0" w:firstRowFirstColumn="0" w:firstRowLastColumn="0" w:lastRowFirstColumn="0" w:lastRowLastColumn="0"/>
-              <w:rPr>
-                <w:sz w:val="20"/>
-                <w:szCs w:val="20"/>
-              </w:rPr>
-            </w:pPr>
-          </w:p>
-        </w:tc>
-        <w:tc>
-          <w:tcPr>
-            <w:tcW w:w="0" w:type="auto"/>
-          </w:tcPr>
-          <w:p>
-            <w:pPr>
-              <w:cnfStyle w:val="000000100000" w:firstRow="0" w:lastRow="0" w:firstColumn="0" w:lastColumn="0" w:oddVBand="0" w:evenVBand="0" w:oddHBand="1" w:evenHBand="0" w:firstRowFirstColumn="0" w:firstRowLastColumn="0" w:lastRowFirstColumn="0" w:lastRowLastColumn="0"/>
-              <w:rPr>
-                <w:sz w:val="20"/>
-                <w:szCs w:val="20"/>
-              </w:rPr>
-            </w:pPr>
-            <w:r>
-              <w:rPr>
-                <w:sz w:val="20"/>
-                <w:szCs w:val="20"/>
-              </w:rPr>
-              <w:t>Tab Selection</w:t>
-            </w:r>
-          </w:p>
-        </w:tc>
-        <w:tc>
-          <w:tcPr>
-            <w:tcW w:w="0" w:type="auto"/>
-          </w:tcPr>
-          <w:p>
-            <w:pPr>
-              <w:cnfStyle w:val="000000100000" w:firstRow="0" w:lastRow="0" w:firstColumn="0" w:lastColumn="0" w:oddVBand="0" w:evenVBand="0" w:oddHBand="1" w:evenHBand="0" w:firstRowFirstColumn="0" w:firstRowLastColumn="0" w:lastRowFirstColumn="0" w:lastRowLastColumn="0"/>
-              <w:rPr>
-                <w:sz w:val="20"/>
-                <w:szCs w:val="20"/>
-              </w:rPr>
-            </w:pPr>
-            <w:r>
-              <w:rPr>
-                <w:sz w:val="20"/>
-                <w:szCs w:val="20"/>
-              </w:rPr>
-              <w:t>Tap 'Opportunities', 'My Registrations', and 'Privacy' tabs</w:t>
-            </w:r>
-          </w:p>
-        </w:tc>
-        <w:tc>
-          <w:tcPr>
-            <w:tcW w:w="0" w:type="auto"/>
-          </w:tcPr>
-          <w:p>
-            <w:pPr>
-              <w:cnfStyle w:val="000000100000" w:firstRow="0" w:lastRow="0" w:firstColumn="0" w:lastColumn="0" w:oddVBand="0" w:evenVBand="0" w:oddHBand="1" w:evenHBand="0" w:firstRowFirstColumn="0" w:firstRowLastColumn="0" w:lastRowFirstColumn="0" w:lastRowLastColumn="0"/>
-              <w:rPr>
-                <w:sz w:val="20"/>
-                <w:szCs w:val="20"/>
-              </w:rPr>
-            </w:pPr>
-            <w:r>
-              <w:rPr>
-                <w:sz w:val="20"/>
-                <w:szCs w:val="20"/>
-              </w:rPr>
-              <w:t>Smooth navigation across all 4 primary Shell tabs</w:t>
-            </w:r>
-          </w:p>
-        </w:tc>
-        <w:tc>
-          <w:tcPr>
-            <w:tcW w:w="0" w:type="auto"/>
-          </w:tcPr>
-          <w:p>
-            <w:pPr>
-              <w:cnfStyle w:val="000000100000" w:firstRow="0" w:lastRow="0" w:firstColumn="0" w:lastColumn="0" w:oddVBand="0" w:evenVBand="0" w:oddHBand="1" w:evenHBand="0" w:firstRowFirstColumn="0" w:firstRowLastColumn="0" w:lastRowFirstColumn="0" w:lastRowLastColumn="0"/>
-              <w:rPr>
-                <w:sz w:val="20"/>
-                <w:szCs w:val="20"/>
-              </w:rPr>
-            </w:pPr>
-            <w:r>
-              <w:rPr>
-                <w:sz w:val="20"/>
-                <w:szCs w:val="20"/>
-              </w:rPr>
-              <w:t>App navigated smoothly between all bottom bar tabs</w:t>
-            </w:r>
-          </w:p>
-        </w:tc>
-        <w:tc>
-          <w:tcPr>
-            <w:tcW w:w="0" w:type="auto"/>
-          </w:tcPr>
-          <w:p>
-            <w:pPr>
-              <w:cnfStyle w:val="000000100000" w:firstRow="0" w:lastRow="0" w:firstColumn="0" w:lastColumn="0" w:oddVBand="0" w:evenVBand="0" w:oddHBand="1" w:evenHBand="0" w:firstRowFirstColumn="0" w:firstRowLastColumn="0" w:lastRowFirstColumn="0" w:lastRowLastColumn="0"/>
-              <w:rPr>
-                <w:sz w:val="20"/>
-                <w:szCs w:val="20"/>
-              </w:rPr>
-            </w:pPr>
-            <w:r>
-              <w:rPr>
-                <w:sz w:val="20"/>
-                <w:szCs w:val="20"/>
-              </w:rPr>
-              <w:t>PASS</w:t>
-            </w:r>
-          </w:p>
-        </w:tc>
-      </w:tr>
-      <w:tr>
-        <w:tc>
-          <w:tcPr>
-            <w:cnfStyle w:val="001000000000" w:firstRow="0" w:lastRow="0" w:firstColumn="1" w:lastColumn="0" w:oddVBand="0" w:evenVBand="0" w:oddHBand="0" w:evenHBand="0" w:firstRowFirstColumn="0" w:firstRowLastColumn="0" w:lastRowFirstColumn="0" w:lastRowLastColumn="0"/>
-            <w:tcW w:w="0" w:type="auto"/>
-          </w:tcPr>
-          <w:p>
-            <w:pPr>
+            </w:pPr>
+            <w:r>
               <w:rPr>
                 <w:b w:val="0"/>
                 <w:bCs w:val="0"/>
                 <w:sz w:val="20"/>
                 <w:szCs w:val="20"/>
               </w:rPr>
-            </w:pPr>
-            <w:r>
-              <w:rPr>
-                <w:b w:val="0"/>
-                <w:bCs w:val="0"/>
-                <w:sz w:val="20"/>
-                <w:szCs w:val="20"/>
-              </w:rPr>
               <w:t>TC-MAN-04</w:t>
             </w:r>
           </w:p>
@@ -1870,33 +3866,8 @@
                 <w:sz w:val="20"/>
                 <w:szCs w:val="20"/>
               </w:rPr>
-              <w:t xml:space="preserve">Type "Garden" into </w:t>
-            </w:r>
-            <w:proofErr w:type="spellStart"/>
-            <w:r>
-              <w:rPr>
-                <w:sz w:val="20"/>
-                <w:szCs w:val="20"/>
-              </w:rPr>
-              <w:t>SearchBar</w:t>
-            </w:r>
-            <w:proofErr w:type="spellEnd"/>
-            <w:r>
-              <w:rPr>
-                <w:sz w:val="20"/>
-                <w:szCs w:val="20"/>
-              </w:rPr>
-              <w:t xml:space="preserve"> on </w:t>
-            </w:r>
-            <w:proofErr w:type="spellStart"/>
-            <w:r>
-              <w:rPr>
-                <w:sz w:val="20"/>
-                <w:szCs w:val="20"/>
-              </w:rPr>
-              <w:t>OpportunitiesPage</w:t>
-            </w:r>
-            <w:proofErr w:type="spellEnd"/>
+              <w:t>Type "Garden" into SearchBar on OpportunitiesPage</w:t>
+            </w:r>
           </w:p>
         </w:tc>
         <w:tc>
@@ -2234,21 +4205,12 @@
                 <w:szCs w:val="20"/>
               </w:rPr>
             </w:pPr>
-            <w:proofErr w:type="spellStart"/>
-            <w:r>
-              <w:rPr>
-                <w:sz w:val="20"/>
-                <w:szCs w:val="20"/>
-              </w:rPr>
-              <w:t>CollectionView</w:t>
-            </w:r>
-            <w:proofErr w:type="spellEnd"/>
-            <w:r>
-              <w:rPr>
-                <w:sz w:val="20"/>
-                <w:szCs w:val="20"/>
-              </w:rPr>
-              <w:t xml:space="preserve"> Selection</w:t>
+            <w:r>
+              <w:rPr>
+                <w:sz w:val="20"/>
+                <w:szCs w:val="20"/>
+              </w:rPr>
+              <w:t>CollectionView Selection</w:t>
             </w:r>
           </w:p>
         </w:tc>
@@ -2290,23 +4252,7 @@
                 <w:sz w:val="20"/>
                 <w:szCs w:val="20"/>
               </w:rPr>
-              <w:t xml:space="preserve">Page transitions to </w:t>
-            </w:r>
-            <w:proofErr w:type="spellStart"/>
-            <w:r>
-              <w:rPr>
-                <w:sz w:val="20"/>
-                <w:szCs w:val="20"/>
-              </w:rPr>
-              <w:t>OpportunityDetailsPage</w:t>
-            </w:r>
-            <w:proofErr w:type="spellEnd"/>
-            <w:r>
-              <w:rPr>
-                <w:sz w:val="20"/>
-                <w:szCs w:val="20"/>
-              </w:rPr>
-              <w:t xml:space="preserve"> passing id=1 parameter</w:t>
+              <w:t>Page transitions to OpportunityDetailsPage passing id=1 parameter</w:t>
             </w:r>
           </w:p>
         </w:tc>
@@ -2450,21 +4396,12 @@
                 <w:szCs w:val="20"/>
               </w:rPr>
             </w:pPr>
-            <w:proofErr w:type="spellStart"/>
-            <w:r>
-              <w:rPr>
-                <w:sz w:val="20"/>
-                <w:szCs w:val="20"/>
-              </w:rPr>
-              <w:t>CheckBox</w:t>
-            </w:r>
-            <w:proofErr w:type="spellEnd"/>
-            <w:r>
-              <w:rPr>
-                <w:sz w:val="20"/>
-                <w:szCs w:val="20"/>
-              </w:rPr>
-              <w:t>: Unchecked</w:t>
+            <w:r>
+              <w:rPr>
+                <w:sz w:val="20"/>
+                <w:szCs w:val="20"/>
+              </w:rPr>
+              <w:t>CheckBox: Unchecked</w:t>
             </w:r>
           </w:p>
         </w:tc>
@@ -2515,68 +4452,48 @@
                 <w:sz w:val="20"/>
                 <w:szCs w:val="20"/>
               </w:rPr>
-              <w:t xml:space="preserve">"You must agree to the </w:t>
-            </w:r>
-            <w:r>
-              <w:rPr>
-                <w:i/>
-                <w:iCs/>
-                <w:sz w:val="20"/>
-                <w:szCs w:val="20"/>
-              </w:rPr>
-              <w:lastRenderedPageBreak/>
-              <w:t>privacy consent to register."</w:t>
-            </w:r>
-          </w:p>
-        </w:tc>
-        <w:tc>
-          <w:tcPr>
-            <w:tcW w:w="0" w:type="auto"/>
-          </w:tcPr>
-          <w:p>
-            <w:pPr>
-              <w:cnfStyle w:val="000000100000" w:firstRow="0" w:lastRow="0" w:firstColumn="0" w:lastColumn="0" w:oddVBand="0" w:evenVBand="0" w:oddHBand="1" w:evenHBand="0" w:firstRowFirstColumn="0" w:firstRowLastColumn="0" w:lastRowFirstColumn="0" w:lastRowLastColumn="0"/>
-              <w:rPr>
-                <w:sz w:val="20"/>
-                <w:szCs w:val="20"/>
-              </w:rPr>
-            </w:pPr>
-            <w:r>
-              <w:rPr>
-                <w:sz w:val="20"/>
-                <w:szCs w:val="20"/>
-              </w:rPr>
-              <w:lastRenderedPageBreak/>
-              <w:t xml:space="preserve">Submission blocked, error message </w:t>
-            </w:r>
-            <w:r>
-              <w:rPr>
-                <w:sz w:val="20"/>
-                <w:szCs w:val="20"/>
-              </w:rPr>
-              <w:lastRenderedPageBreak/>
-              <w:t>displayed in red</w:t>
-            </w:r>
-          </w:p>
-        </w:tc>
-        <w:tc>
-          <w:tcPr>
-            <w:tcW w:w="0" w:type="auto"/>
-          </w:tcPr>
-          <w:p>
-            <w:pPr>
-              <w:cnfStyle w:val="000000100000" w:firstRow="0" w:lastRow="0" w:firstColumn="0" w:lastColumn="0" w:oddVBand="0" w:evenVBand="0" w:oddHBand="1" w:evenHBand="0" w:firstRowFirstColumn="0" w:firstRowLastColumn="0" w:lastRowFirstColumn="0" w:lastRowLastColumn="0"/>
-              <w:rPr>
-                <w:sz w:val="20"/>
-                <w:szCs w:val="20"/>
-              </w:rPr>
-            </w:pPr>
-            <w:r>
-              <w:rPr>
-                <w:sz w:val="20"/>
-                <w:szCs w:val="20"/>
-              </w:rPr>
-              <w:lastRenderedPageBreak/>
+              <w:t>"You must agree to the privacy consent to register."</w:t>
+            </w:r>
+          </w:p>
+        </w:tc>
+        <w:tc>
+          <w:tcPr>
+            <w:tcW w:w="0" w:type="auto"/>
+          </w:tcPr>
+          <w:p>
+            <w:pPr>
+              <w:cnfStyle w:val="000000100000" w:firstRow="0" w:lastRow="0" w:firstColumn="0" w:lastColumn="0" w:oddVBand="0" w:evenVBand="0" w:oddHBand="1" w:evenHBand="0" w:firstRowFirstColumn="0" w:firstRowLastColumn="0" w:lastRowFirstColumn="0" w:lastRowLastColumn="0"/>
+              <w:rPr>
+                <w:sz w:val="20"/>
+                <w:szCs w:val="20"/>
+              </w:rPr>
+            </w:pPr>
+            <w:r>
+              <w:rPr>
+                <w:sz w:val="20"/>
+                <w:szCs w:val="20"/>
+              </w:rPr>
+              <w:t>Submission blocked, error message displayed in red</w:t>
+            </w:r>
+          </w:p>
+        </w:tc>
+        <w:tc>
+          <w:tcPr>
+            <w:tcW w:w="0" w:type="auto"/>
+          </w:tcPr>
+          <w:p>
+            <w:pPr>
+              <w:cnfStyle w:val="000000100000" w:firstRow="0" w:lastRow="0" w:firstColumn="0" w:lastColumn="0" w:oddVBand="0" w:evenVBand="0" w:oddHBand="1" w:evenHBand="0" w:firstRowFirstColumn="0" w:firstRowLastColumn="0" w:lastRowFirstColumn="0" w:lastRowLastColumn="0"/>
+              <w:rPr>
+                <w:sz w:val="20"/>
+                <w:szCs w:val="20"/>
+              </w:rPr>
+            </w:pPr>
+            <w:r>
+              <w:rPr>
+                <w:sz w:val="20"/>
+                <w:szCs w:val="20"/>
+              </w:rPr>
               <w:t>PASS</w:t>
             </w:r>
           </w:p>
@@ -2626,21 +4543,7 @@
                 <w:sz w:val="20"/>
                 <w:szCs w:val="20"/>
               </w:rPr>
-              <w:t>0</w:t>
-            </w:r>
-            <w:r>
-              <w:rPr>
-                <w:sz w:val="20"/>
-                <w:szCs w:val="20"/>
-              </w:rPr>
-              <w:t>5</w:t>
-            </w:r>
-            <w:r>
-              <w:rPr>
-                <w:sz w:val="20"/>
-                <w:szCs w:val="20"/>
-              </w:rPr>
-              <w:t>/08/2026</w:t>
+              <w:t>05/08/2026</w:t>
             </w:r>
           </w:p>
         </w:tc>
@@ -2935,47 +4838,29 @@
                 <w:sz w:val="20"/>
                 <w:szCs w:val="20"/>
               </w:rPr>
-              <w:t xml:space="preserve">Record inserted into SQLite; app redirects to </w:t>
-            </w:r>
-            <w:proofErr w:type="spellStart"/>
-            <w:r>
-              <w:rPr>
-                <w:sz w:val="20"/>
-                <w:szCs w:val="20"/>
-              </w:rPr>
-              <w:t>MyRegistrationsPage</w:t>
-            </w:r>
-            <w:proofErr w:type="spellEnd"/>
-          </w:p>
-        </w:tc>
-        <w:tc>
-          <w:tcPr>
-            <w:tcW w:w="0" w:type="auto"/>
-          </w:tcPr>
-          <w:p>
-            <w:pPr>
-              <w:cnfStyle w:val="000000100000" w:firstRow="0" w:lastRow="0" w:firstColumn="0" w:lastColumn="0" w:oddVBand="0" w:evenVBand="0" w:oddHBand="1" w:evenHBand="0" w:firstRowFirstColumn="0" w:firstRowLastColumn="0" w:lastRowFirstColumn="0" w:lastRowLastColumn="0"/>
-              <w:rPr>
-                <w:sz w:val="20"/>
-                <w:szCs w:val="20"/>
-              </w:rPr>
-            </w:pPr>
-            <w:r>
-              <w:rPr>
-                <w:sz w:val="20"/>
-                <w:szCs w:val="20"/>
-              </w:rPr>
-              <w:t xml:space="preserve">Record saved successfully and visible in </w:t>
-            </w:r>
-            <w:proofErr w:type="spellStart"/>
-            <w:r>
-              <w:rPr>
-                <w:sz w:val="20"/>
-                <w:szCs w:val="20"/>
-              </w:rPr>
-              <w:t>CollectionView</w:t>
-            </w:r>
-            <w:proofErr w:type="spellEnd"/>
+              <w:t>Record inserted into SQLite; app redirects to MyRegistrationsPage</w:t>
+            </w:r>
+          </w:p>
+        </w:tc>
+        <w:tc>
+          <w:tcPr>
+            <w:tcW w:w="0" w:type="auto"/>
+          </w:tcPr>
+          <w:p>
+            <w:pPr>
+              <w:cnfStyle w:val="000000100000" w:firstRow="0" w:lastRow="0" w:firstColumn="0" w:lastColumn="0" w:oddVBand="0" w:evenVBand="0" w:oddHBand="1" w:evenHBand="0" w:firstRowFirstColumn="0" w:firstRowLastColumn="0" w:lastRowFirstColumn="0" w:lastRowLastColumn="0"/>
+              <w:rPr>
+                <w:sz w:val="20"/>
+                <w:szCs w:val="20"/>
+              </w:rPr>
+            </w:pPr>
+            <w:r>
+              <w:rPr>
+                <w:sz w:val="20"/>
+                <w:szCs w:val="20"/>
+              </w:rPr>
+              <w:t>Record saved successfully and visible in CollectionView</w:t>
+            </w:r>
           </w:p>
         </w:tc>
         <w:tc>
@@ -3082,56 +4967,36 @@
                 <w:szCs w:val="20"/>
               </w:rPr>
             </w:pPr>
-            <w:proofErr w:type="spellStart"/>
             <w:r>
               <w:rPr>
                 <w:rFonts w:ascii="Arial" w:hAnsi="Arial" w:cs="Arial"/>
                 <w:sz w:val="20"/>
                 <w:szCs w:val="20"/>
               </w:rPr>
-              <w:t>CollectionView</w:t>
-            </w:r>
-            <w:proofErr w:type="spellEnd"/>
+              <w:t>CollectionView Display</w:t>
+            </w:r>
+          </w:p>
+        </w:tc>
+        <w:tc>
+          <w:tcPr>
+            <w:tcW w:w="0" w:type="auto"/>
+          </w:tcPr>
+          <w:p>
+            <w:pPr>
+              <w:cnfStyle w:val="000000000000" w:firstRow="0" w:lastRow="0" w:firstColumn="0" w:lastColumn="0" w:oddVBand="0" w:evenVBand="0" w:oddHBand="0" w:evenHBand="0" w:firstRowFirstColumn="0" w:firstRowLastColumn="0" w:lastRowFirstColumn="0" w:lastRowLastColumn="0"/>
+              <w:rPr>
+                <w:sz w:val="20"/>
+                <w:szCs w:val="20"/>
+              </w:rPr>
+            </w:pPr>
             <w:r>
               <w:rPr>
                 <w:rFonts w:ascii="Arial" w:hAnsi="Arial" w:cs="Arial"/>
                 <w:sz w:val="20"/>
                 <w:szCs w:val="20"/>
               </w:rPr>
-              <w:t xml:space="preserve"> Display</w:t>
-            </w:r>
-          </w:p>
-        </w:tc>
-        <w:tc>
-          <w:tcPr>
-            <w:tcW w:w="0" w:type="auto"/>
-          </w:tcPr>
-          <w:p>
-            <w:pPr>
-              <w:cnfStyle w:val="000000000000" w:firstRow="0" w:lastRow="0" w:firstColumn="0" w:lastColumn="0" w:oddVBand="0" w:evenVBand="0" w:oddHBand="0" w:evenHBand="0" w:firstRowFirstColumn="0" w:firstRowLastColumn="0" w:lastRowFirstColumn="0" w:lastRowLastColumn="0"/>
-              <w:rPr>
-                <w:sz w:val="20"/>
-                <w:szCs w:val="20"/>
-              </w:rPr>
-            </w:pPr>
-            <w:r>
-              <w:rPr>
-                <w:rFonts w:ascii="Arial" w:hAnsi="Arial" w:cs="Arial"/>
-                <w:sz w:val="20"/>
-                <w:szCs w:val="20"/>
-              </w:rPr>
-              <w:t xml:space="preserve">Navigate to </w:t>
-            </w:r>
-            <w:proofErr w:type="spellStart"/>
-            <w:r>
-              <w:rPr>
-                <w:rFonts w:ascii="Arial" w:hAnsi="Arial" w:cs="Arial"/>
-                <w:sz w:val="20"/>
-                <w:szCs w:val="20"/>
-              </w:rPr>
-              <w:t>MyRegistrationsPage</w:t>
-            </w:r>
-            <w:proofErr w:type="spellEnd"/>
+              <w:t>Navigate to MyRegistrationsPage</w:t>
+            </w:r>
           </w:p>
         </w:tc>
         <w:tc>
@@ -3576,17 +5441,8 @@
                 <w:sz w:val="20"/>
                 <w:szCs w:val="20"/>
               </w:rPr>
-              <w:t xml:space="preserve">Tap 'Cancel Registration' button on </w:t>
-            </w:r>
-            <w:proofErr w:type="spellStart"/>
-            <w:r>
-              <w:rPr>
-                <w:sz w:val="20"/>
-                <w:szCs w:val="20"/>
-              </w:rPr>
-              <w:t>EditRegistrationPage</w:t>
-            </w:r>
-            <w:proofErr w:type="spellEnd"/>
+              <w:t>Tap 'Cancel Registration' button on EditRegistrationPage</w:t>
+            </w:r>
           </w:p>
         </w:tc>
         <w:tc>
@@ -3813,27 +5669,36 @@
                 <w:sz w:val="20"/>
                 <w:szCs w:val="20"/>
               </w:rPr>
-              <w:t>Record removed from list and count decremented</w:t>
-            </w:r>
-          </w:p>
-        </w:tc>
-        <w:tc>
-          <w:tcPr>
-            <w:tcW w:w="0" w:type="auto"/>
-          </w:tcPr>
-          <w:p>
-            <w:pPr>
-              <w:cnfStyle w:val="000000100000" w:firstRow="0" w:lastRow="0" w:firstColumn="0" w:lastColumn="0" w:oddVBand="0" w:evenVBand="0" w:oddHBand="1" w:evenHBand="0" w:firstRowFirstColumn="0" w:firstRowLastColumn="0" w:lastRowFirstColumn="0" w:lastRowLastColumn="0"/>
-              <w:rPr>
-                <w:sz w:val="20"/>
-                <w:szCs w:val="20"/>
-              </w:rPr>
-            </w:pPr>
-            <w:r>
-              <w:rPr>
-                <w:sz w:val="20"/>
-                <w:szCs w:val="20"/>
-              </w:rPr>
+              <w:t xml:space="preserve">Record removed from list and </w:t>
+            </w:r>
+            <w:r>
+              <w:rPr>
+                <w:sz w:val="20"/>
+                <w:szCs w:val="20"/>
+              </w:rPr>
+              <w:lastRenderedPageBreak/>
+              <w:t>count decremented</w:t>
+            </w:r>
+          </w:p>
+        </w:tc>
+        <w:tc>
+          <w:tcPr>
+            <w:tcW w:w="0" w:type="auto"/>
+          </w:tcPr>
+          <w:p>
+            <w:pPr>
+              <w:cnfStyle w:val="000000100000" w:firstRow="0" w:lastRow="0" w:firstColumn="0" w:lastColumn="0" w:oddVBand="0" w:evenVBand="0" w:oddHBand="1" w:evenHBand="0" w:firstRowFirstColumn="0" w:firstRowLastColumn="0" w:lastRowFirstColumn="0" w:lastRowLastColumn="0"/>
+              <w:rPr>
+                <w:sz w:val="20"/>
+                <w:szCs w:val="20"/>
+              </w:rPr>
+            </w:pPr>
+            <w:r>
+              <w:rPr>
+                <w:sz w:val="20"/>
+                <w:szCs w:val="20"/>
+              </w:rPr>
+              <w:lastRenderedPageBreak/>
               <w:t>PASS</w:t>
             </w:r>
           </w:p>

</xml_diff>